<commit_message>
vault backup: 2026-10-18 07:10:20
</commit_message>
<xml_diff>
--- a/Visa/801 - Permanent Residency/Prepared Documents/Visa 801 Document Checklist.docx
+++ b/Visa/801 - Permanent Residency/Prepared Documents/Visa 801 Document Checklist.docx
@@ -7,16 +7,33 @@
         <w:pStyle w:val="Title"/>
       </w:pPr>
       <w:r>
+        <w:rPr>
+          <w:rFonts w:ascii="Aptos" w:hAnsi="Aptos"/>
+          <w:b/>
+          <w:color w:val="000000"/>
+          <w:sz w:val="46"/>
+        </w:rPr>
         <w:t>Visa 801 - Document Checklist</w:t>
       </w:r>
     </w:p>
     <w:p>
+      <w:pPr>
+        <w:spacing w:after="160"/>
+      </w:pPr>
       <w:r>
-        <w:t>Updated 11 October 2026. Existing completion marks are retained; an unchecked item may already be in Drive but still need review. This is the central checklist for outstanding answers and actions.</w:t>
+        <w:rPr>
+          <w:rFonts w:ascii="Aptos" w:hAnsi="Aptos"/>
+          <w:sz w:val="20"/>
+        </w:rPr>
+        <w:t>Updated 18 October 2026. This is the central status checklist. A checked item means the document or evidence has been gathered locally or the requirement was previously completed. Items that still need selection, upload, final review, signatures or agency confirmation remain listed separately.</w:t>
       </w:r>
     </w:p>
     <w:p>
       <w:r>
+        <w:rPr>
+          <w:rFonts w:ascii="Aptos" w:hAnsi="Aptos"/>
+          <w:sz w:val="20"/>
+        </w:rPr>
         <w:t>[P1] indicates priority - these have been flagged by Affinity as a priority to focus on (migration agency)</w:t>
       </w:r>
     </w:p>
@@ -25,57 +42,308 @@
         <w:pStyle w:val="Heading1"/>
       </w:pPr>
       <w:r>
-        <w:t xml:space="preserve"> Visa applicant's identity</w:t>
+        <w:rPr>
+          <w:rFonts w:ascii="Aptos" w:hAnsi="Aptos"/>
+          <w:sz w:val="30"/>
+        </w:rPr>
+        <w:t>Remaining priority actions</w:t>
       </w:r>
     </w:p>
     <w:p>
       <w:r>
-        <w:t>☐ Copy of the biographical pages of current passports of all people included in the application (photo, personal details, issue/expiry dates)</w:t>
+        <w:rPr>
+          <w:rFonts w:ascii="Aptos" w:hAnsi="Aptos"/>
+          <w:sz w:val="20"/>
+        </w:rPr>
+        <w:t>These are the highest-impact items still requiring work.</w:t>
       </w:r>
     </w:p>
     <w:p>
+      <w:pPr>
+        <w:keepLines/>
+        <w:spacing w:after="70"/>
+        <w:ind w:left="317" w:hanging="259"/>
+      </w:pPr>
       <w:r>
-        <w:t>☐ Copy of national card</w:t>
+        <w:rPr>
+          <w:rFonts w:ascii="Aptos" w:hAnsi="Aptos"/>
+          <w:b/>
+          <w:color w:val="9C4800"/>
+          <w:sz w:val="19"/>
+          <w:highlight w:val="yellow"/>
+        </w:rPr>
+        <w:t xml:space="preserve">TO DO  </w:t>
+      </w:r>
+      <w:r>
+        <w:rPr>
+          <w:rFonts w:ascii="Aptos" w:hAnsi="Aptos"/>
+          <w:b/>
+          <w:sz w:val="20"/>
+        </w:rPr>
+        <w:t>[P1] Updated Form 80 for Kristina</w:t>
+      </w:r>
+      <w:r>
+        <w:rPr>
+          <w:rFonts w:ascii="Aptos" w:hAnsi="Aptos"/>
+          <w:sz w:val="20"/>
+        </w:rPr>
+        <w:t xml:space="preserve"> — complete and review the form and attachment using the previous version as the base.</w:t>
       </w:r>
     </w:p>
     <w:p>
+      <w:pPr>
+        <w:keepLines/>
+        <w:spacing w:after="70"/>
+        <w:ind w:left="317" w:hanging="259"/>
+      </w:pPr>
       <w:r>
-        <w:t>☐ Kristina Bulgarian national ID</w:t>
+        <w:rPr>
+          <w:rFonts w:ascii="Aptos" w:hAnsi="Aptos"/>
+          <w:b/>
+          <w:color w:val="9C4800"/>
+          <w:sz w:val="19"/>
+          <w:highlight w:val="yellow"/>
+        </w:rPr>
+        <w:t xml:space="preserve">TO DO  </w:t>
+      </w:r>
+      <w:r>
+        <w:rPr>
+          <w:rFonts w:ascii="Aptos" w:hAnsi="Aptos"/>
+          <w:b/>
+          <w:sz w:val="20"/>
+        </w:rPr>
+        <w:t>[P1] Two updated Form 888 witness statements</w:t>
+      </w:r>
+      <w:r>
+        <w:rPr>
+          <w:rFonts w:ascii="Aptos" w:hAnsi="Aptos"/>
+          <w:sz w:val="20"/>
+        </w:rPr>
+        <w:t xml:space="preserve"> — obtain updated statements from the intended witnesses; Jaya and Mum are currently tagged.</w:t>
       </w:r>
     </w:p>
     <w:p>
+      <w:pPr>
+        <w:keepLines/>
+        <w:spacing w:after="70"/>
+        <w:ind w:left="317" w:hanging="259"/>
+      </w:pPr>
       <w:r>
-        <w:t>☐ Copy of driver's card</w:t>
+        <w:rPr>
+          <w:rFonts w:ascii="Aptos" w:hAnsi="Aptos"/>
+          <w:b/>
+          <w:color w:val="9C4800"/>
+          <w:sz w:val="19"/>
+          <w:highlight w:val="yellow"/>
+        </w:rPr>
+        <w:t xml:space="preserve">TO DO  </w:t>
+      </w:r>
+      <w:r>
+        <w:rPr>
+          <w:rFonts w:ascii="Aptos" w:hAnsi="Aptos"/>
+          <w:b/>
+          <w:sz w:val="20"/>
+        </w:rPr>
+        <w:t>[P1] Finalise Scott's relationship statement</w:t>
+      </w:r>
+      <w:r>
+        <w:rPr>
+          <w:rFonts w:ascii="Aptos" w:hAnsi="Aptos"/>
+          <w:sz w:val="20"/>
+        </w:rPr>
+        <w:t xml:space="preserve"> — review the prepared draft, resolve the remaining factual questions, update the cutoff date, obtain Affinity's review and arrange signing.</w:t>
       </w:r>
     </w:p>
     <w:p>
+      <w:pPr>
+        <w:keepLines/>
+        <w:spacing w:after="70"/>
+        <w:ind w:left="317" w:hanging="259"/>
+      </w:pPr>
       <w:r>
-        <w:t>☐ Kristina's NSW driver's license</w:t>
+        <w:rPr>
+          <w:rFonts w:ascii="Aptos" w:hAnsi="Aptos"/>
+          <w:b/>
+          <w:color w:val="9C4800"/>
+          <w:sz w:val="19"/>
+          <w:highlight w:val="yellow"/>
+        </w:rPr>
+        <w:t xml:space="preserve">TO DO  </w:t>
+      </w:r>
+      <w:r>
+        <w:rPr>
+          <w:rFonts w:ascii="Aptos" w:hAnsi="Aptos"/>
+          <w:b/>
+          <w:sz w:val="20"/>
+        </w:rPr>
+        <w:t>[P1] Relationship photo timeline</w:t>
+      </w:r>
+      <w:r>
+        <w:rPr>
+          <w:rFonts w:ascii="Aptos" w:hAnsi="Aptos"/>
+          <w:sz w:val="20"/>
+        </w:rPr>
+        <w:t xml:space="preserve"> — the Google Doc exists but is empty. Add approximately two to three photos every two months, in date order, with names and short captions.</w:t>
       </w:r>
     </w:p>
     <w:p>
+      <w:pPr>
+        <w:keepLines/>
+        <w:spacing w:after="70"/>
+        <w:ind w:left="317" w:hanging="259"/>
+      </w:pPr>
       <w:r>
-        <w:t>☐ Kristina's Bulgarian driver's license(?)</w:t>
+        <w:rPr>
+          <w:rFonts w:ascii="Aptos" w:hAnsi="Aptos"/>
+          <w:b/>
+          <w:color w:val="9C4800"/>
+          <w:sz w:val="19"/>
+          <w:highlight w:val="yellow"/>
+        </w:rPr>
+        <w:t xml:space="preserve">TO DO  </w:t>
+      </w:r>
+      <w:r>
+        <w:rPr>
+          <w:rFonts w:ascii="Aptos" w:hAnsi="Aptos"/>
+          <w:b/>
+          <w:sz w:val="20"/>
+        </w:rPr>
+        <w:t>[P1] Contact during periods apart</w:t>
+      </w:r>
+      <w:r>
+        <w:rPr>
+          <w:rFonts w:ascii="Aptos" w:hAnsi="Aptos"/>
+          <w:sz w:val="20"/>
+        </w:rPr>
+        <w:t xml:space="preserve"> — add dated messages or call records for Bali and any other relevant separations after 24 September 2025.</w:t>
       </w:r>
     </w:p>
     <w:p>
+      <w:pPr>
+        <w:keepLines/>
+        <w:spacing w:after="70"/>
+        <w:ind w:left="317" w:hanging="259"/>
+      </w:pPr>
       <w:r>
-        <w:t>☑ If your name has changed or the name of anyone in your application has changed.</w:t>
+        <w:rPr>
+          <w:rFonts w:ascii="Aptos" w:hAnsi="Aptos"/>
+          <w:b/>
+          <w:color w:val="9C4800"/>
+          <w:sz w:val="19"/>
+          <w:highlight w:val="yellow"/>
+        </w:rPr>
+        <w:t xml:space="preserve">TO DO  </w:t>
+      </w:r>
+      <w:r>
+        <w:rPr>
+          <w:rFonts w:ascii="Aptos" w:hAnsi="Aptos"/>
+          <w:b/>
+          <w:sz w:val="20"/>
+        </w:rPr>
+        <w:t>[P1] Correspondence to both partners at the shared address</w:t>
+      </w:r>
+      <w:r>
+        <w:rPr>
+          <w:rFonts w:ascii="Aptos" w:hAnsi="Aptos"/>
+          <w:sz w:val="20"/>
+        </w:rPr>
+        <w:t xml:space="preserve"> — locate letters or mail addressed jointly, or separate correspondence showing both names at the same address.</w:t>
       </w:r>
     </w:p>
     <w:p>
+      <w:pPr>
+        <w:keepLines/>
+        <w:spacing w:after="70"/>
+        <w:ind w:left="317" w:hanging="259"/>
+      </w:pPr>
       <w:r>
-        <w:t>☑ Kristina and Scott's marriage certificate</w:t>
+        <w:rPr>
+          <w:rFonts w:ascii="Aptos" w:hAnsi="Aptos"/>
+          <w:b/>
+          <w:color w:val="9C4800"/>
+          <w:sz w:val="19"/>
+          <w:highlight w:val="yellow"/>
+        </w:rPr>
+        <w:t xml:space="preserve">TO DO  </w:t>
+      </w:r>
+      <w:r>
+        <w:rPr>
+          <w:rFonts w:ascii="Aptos" w:hAnsi="Aptos"/>
+          <w:b/>
+          <w:sz w:val="20"/>
+        </w:rPr>
+        <w:t>[P1] Legal commitments</w:t>
+      </w:r>
+      <w:r>
+        <w:rPr>
+          <w:rFonts w:ascii="Aptos" w:hAnsi="Aptos"/>
+          <w:sz w:val="20"/>
+        </w:rPr>
+        <w:t xml:space="preserve"> — retrieve both superannuation beneficiary nominations and decide whether any other evidence is relevant.</w:t>
       </w:r>
     </w:p>
     <w:p>
+      <w:pPr>
+        <w:keepLines/>
+        <w:spacing w:after="70"/>
+        <w:ind w:left="317" w:hanging="259"/>
+      </w:pPr>
       <w:r>
-        <w:t>☐ Subclass 820 Grant Letter</w:t>
+        <w:rPr>
+          <w:rFonts w:ascii="Aptos" w:hAnsi="Aptos"/>
+          <w:b/>
+          <w:color w:val="9C4800"/>
+          <w:sz w:val="19"/>
+          <w:highlight w:val="yellow"/>
+        </w:rPr>
+        <w:t xml:space="preserve">TO DO  </w:t>
+      </w:r>
+      <w:r>
+        <w:rPr>
+          <w:rFonts w:ascii="Aptos" w:hAnsi="Aptos"/>
+          <w:b/>
+          <w:sz w:val="20"/>
+        </w:rPr>
+        <w:t>[P1] Assets and liabilities</w:t>
+      </w:r>
+      <w:r>
+        <w:rPr>
+          <w:rFonts w:ascii="Aptos" w:hAnsi="Aptos"/>
+          <w:sz w:val="20"/>
+        </w:rPr>
+        <w:t xml:space="preserve"> — confirm the car purchase month and year and registration or ownership names. Decide whether to include the car insurance, car loan and dog-surgery loan evidence, describing sole-name liabilities accurately.</w:t>
       </w:r>
     </w:p>
     <w:p>
+      <w:pPr>
+        <w:keepLines/>
+        <w:spacing w:after="70"/>
+        <w:ind w:left="317" w:hanging="259"/>
+      </w:pPr>
       <w:r>
-        <w:t>☐ [P1] Updated Form 80 - Personal particulars for character assessment (Kristina) #kristina</w:t>
+        <w:rPr>
+          <w:rFonts w:ascii="Aptos" w:hAnsi="Aptos"/>
+          <w:b/>
+          <w:color w:val="9C4800"/>
+          <w:sz w:val="19"/>
+          <w:highlight w:val="yellow"/>
+        </w:rPr>
+        <w:t xml:space="preserve">TO DO  </w:t>
+      </w:r>
+      <w:r>
+        <w:rPr>
+          <w:rFonts w:ascii="Aptos" w:hAnsi="Aptos"/>
+          <w:b/>
+          <w:sz w:val="20"/>
+        </w:rPr>
+        <w:t>[P1] Upload and curate the newly gathered evidence</w:t>
+      </w:r>
+      <w:r>
+        <w:rPr>
+          <w:rFonts w:ascii="Aptos" w:hAnsi="Aptos"/>
+          <w:sz w:val="20"/>
+        </w:rPr>
+        <w:t xml:space="preserve"> — upload the renamed bank statements, bills, car insurance and licence files to the 801 Google Drive folder, then choose a representative submission set with useful date coverage.</w:t>
       </w:r>
     </w:p>
     <w:p>
@@ -83,122 +351,255 @@
         <w:pStyle w:val="Heading1"/>
       </w:pPr>
       <w:r>
-        <w:t>Evidence to demonstrate that your relationship is genuine and continuing since the grant of your temporary visa</w:t>
+        <w:rPr>
+          <w:rFonts w:ascii="Aptos" w:hAnsi="Aptos"/>
+          <w:sz w:val="30"/>
+        </w:rPr>
+        <w:t>Completed or gathered since the previous update</w:t>
       </w:r>
     </w:p>
     <w:p>
+      <w:pPr>
+        <w:keepLines/>
+        <w:spacing w:after="70"/>
+        <w:ind w:left="317" w:hanging="259"/>
+      </w:pPr>
       <w:r>
-        <w:t>☐ [P1] -  #scott Updated Statutory Declaration (Relationship Statement) from your Sponsor (Scott) regarding your relationship ("Please update Scott's previous statement with information from 24 Sep 2025 (stage 1 subclass 820 visa grant) to current") #scott</w:t>
+        <w:rPr>
+          <w:rFonts w:ascii="Aptos" w:hAnsi="Aptos"/>
+          <w:b/>
+          <w:color w:val="1A703D"/>
+          <w:sz w:val="19"/>
+        </w:rPr>
+        <w:t xml:space="preserve">DONE  </w:t>
+      </w:r>
+      <w:r>
+        <w:rPr>
+          <w:rFonts w:ascii="Aptos" w:hAnsi="Aptos"/>
+          <w:sz w:val="20"/>
+        </w:rPr>
+        <w:t xml:space="preserve">Approved filenames applied to 92 submission documents, with the client reference </w:t>
+      </w:r>
+      <w:r>
+        <w:rPr>
+          <w:rFonts w:ascii="Aptos Mono" w:hAnsi="Aptos Mono"/>
+          <w:sz w:val="19"/>
+        </w:rPr>
+        <w:t>WaKr-2631-801-3</w:t>
+      </w:r>
+      <w:r>
+        <w:rPr>
+          <w:rFonts w:ascii="Aptos" w:hAnsi="Aptos"/>
+          <w:sz w:val="20"/>
+        </w:rPr>
+        <w:t xml:space="preserve"> added.</w:t>
       </w:r>
     </w:p>
     <w:p>
+      <w:pPr>
+        <w:keepLines/>
+        <w:spacing w:after="70"/>
+        <w:ind w:left="317" w:hanging="259"/>
+      </w:pPr>
       <w:r>
-        <w:t>☐ [P1] #jaya #mum - Form 888 – Statutory declaration by two Australian citizens or permanent residents who have personal knowledge of your partner relationship. ("You may use the same witnesses who completed the Form 888s for the Stage 1 partner visa application. Immigration only requires updated statements confirming their continued knowledge of your relationship.")</w:t>
+        <w:rPr>
+          <w:rFonts w:ascii="Aptos" w:hAnsi="Aptos"/>
+          <w:b/>
+          <w:color w:val="1A703D"/>
+          <w:sz w:val="19"/>
+        </w:rPr>
+        <w:t xml:space="preserve">DONE  </w:t>
+      </w:r>
+      <w:r>
+        <w:rPr>
+          <w:rFonts w:ascii="Aptos" w:hAnsi="Aptos"/>
+          <w:sz w:val="20"/>
+        </w:rPr>
+        <w:t>All 90 PDFs checked and made accessible without passwords or encryption.</w:t>
       </w:r>
     </w:p>
     <w:p>
+      <w:pPr>
+        <w:keepLines/>
+        <w:spacing w:after="70"/>
+        <w:ind w:left="317" w:hanging="259"/>
+      </w:pPr>
       <w:r>
-        <w:t>☐ [P1] #kristina  #scott provide updated relationship documents since the grant of your Subclass 820 visa (original agency wording says “729”; confirm this correction with Affinity) - From 24th Sep 2025 to current - Examples of documents</w:t>
+        <w:rPr>
+          <w:rFonts w:ascii="Aptos" w:hAnsi="Aptos"/>
+          <w:b/>
+          <w:color w:val="1A703D"/>
+          <w:sz w:val="19"/>
+        </w:rPr>
+        <w:t xml:space="preserve">DONE  </w:t>
+      </w:r>
+      <w:r>
+        <w:rPr>
+          <w:rFonts w:ascii="Aptos" w:hAnsi="Aptos"/>
+          <w:sz w:val="20"/>
+        </w:rPr>
+        <w:t>CBA and 2Up joint bank statements gathered for the relevant period.</w:t>
       </w:r>
     </w:p>
     <w:p>
+      <w:pPr>
+        <w:keepLines/>
+        <w:spacing w:after="70"/>
+        <w:ind w:left="317" w:hanging="259"/>
+      </w:pPr>
       <w:r>
-        <w:t>☐ [P1] Evidence of joint ownership or real estate or other major assets (e.g. cars, appliances) and any joint liabilities (loans, mortgages, insurance) - that have been acquired or taken out since Sep 2025 if applicable</w:t>
+        <w:rPr>
+          <w:rFonts w:ascii="Aptos" w:hAnsi="Aptos"/>
+          <w:b/>
+          <w:color w:val="1A703D"/>
+          <w:sz w:val="19"/>
+        </w:rPr>
+        <w:t xml:space="preserve">DONE  </w:t>
+      </w:r>
+      <w:r>
+        <w:rPr>
+          <w:rFonts w:ascii="Aptos" w:hAnsi="Aptos"/>
+          <w:sz w:val="20"/>
+        </w:rPr>
+        <w:t>ING household-expense account statements gathered for October 2025 to 17 October 2026.</w:t>
       </w:r>
     </w:p>
     <w:p>
+      <w:pPr>
+        <w:keepLines/>
+        <w:spacing w:after="70"/>
+        <w:ind w:left="317" w:hanging="259"/>
+      </w:pPr>
       <w:r>
-        <w:t>☐ Confirm any jointly owned assets acquired since September 2025, if applicable. Car loan, dog-surgery loan and credit card are confirmed solely in Scott’s name. Confirm the car purchase month/year and registration/ownership names if using it as asset evidence.</w:t>
+        <w:rPr>
+          <w:rFonts w:ascii="Aptos" w:hAnsi="Aptos"/>
+          <w:b/>
+          <w:color w:val="1A703D"/>
+          <w:sz w:val="19"/>
+        </w:rPr>
+        <w:t xml:space="preserve">DONE  </w:t>
+      </w:r>
+      <w:r>
+        <w:rPr>
+          <w:rFonts w:ascii="Aptos" w:hAnsi="Aptos"/>
+          <w:sz w:val="20"/>
+        </w:rPr>
+        <w:t>Electricity, internet, telephone and water bills gathered from August or September 2025 onward. The electricity, internet and telephone accounts reviewed are in Scott's name; the water account is addressed to the property owner or agent. Use these as shared-address or household-expense evidence rather than describing them as joint accounts.</w:t>
       </w:r>
     </w:p>
     <w:p>
+      <w:pPr>
+        <w:keepLines/>
+        <w:spacing w:after="70"/>
+        <w:ind w:left="317" w:hanging="259"/>
+      </w:pPr>
       <w:r>
-        <w:t>☐ [P1] Sharing of finances - joint bank statements</w:t>
+        <w:rPr>
+          <w:rFonts w:ascii="Aptos" w:hAnsi="Aptos"/>
+          <w:b/>
+          <w:color w:val="1A703D"/>
+          <w:sz w:val="19"/>
+        </w:rPr>
+        <w:t xml:space="preserve">DONE  </w:t>
+      </w:r>
+      <w:r>
+        <w:rPr>
+          <w:rFonts w:ascii="Aptos" w:hAnsi="Aptos"/>
+          <w:sz w:val="20"/>
+        </w:rPr>
+        <w:t>Urunga lease, Coffs Harbour lease and Coffs Harbour extension gathered; both partners are named as tenants.</w:t>
       </w:r>
     </w:p>
     <w:p>
+      <w:pPr>
+        <w:keepLines/>
+        <w:spacing w:after="70"/>
+        <w:ind w:left="317" w:hanging="259"/>
+      </w:pPr>
       <w:r>
-        <w:t>☐ CBA</w:t>
+        <w:rPr>
+          <w:rFonts w:ascii="Aptos" w:hAnsi="Aptos"/>
+          <w:b/>
+          <w:color w:val="1A703D"/>
+          <w:sz w:val="19"/>
+        </w:rPr>
+        <w:t xml:space="preserve">DONE  </w:t>
+      </w:r>
+      <w:r>
+        <w:rPr>
+          <w:rFonts w:ascii="Aptos" w:hAnsi="Aptos"/>
+          <w:sz w:val="20"/>
+        </w:rPr>
+        <w:t>Scott's NSW driver licence copy gathered, with front and back included across two pages.</w:t>
       </w:r>
     </w:p>
     <w:p>
+      <w:pPr>
+        <w:keepLines/>
+        <w:spacing w:after="70"/>
+        <w:ind w:left="317" w:hanging="259"/>
+      </w:pPr>
       <w:r>
-        <w:t>☐ 2Up</w:t>
+        <w:rPr>
+          <w:rFonts w:ascii="Aptos" w:hAnsi="Aptos"/>
+          <w:b/>
+          <w:color w:val="1A703D"/>
+          <w:sz w:val="19"/>
+        </w:rPr>
+        <w:t xml:space="preserve">DONE  </w:t>
+      </w:r>
+      <w:r>
+        <w:rPr>
+          <w:rFonts w:ascii="Aptos" w:hAnsi="Aptos"/>
+          <w:sz w:val="20"/>
+        </w:rPr>
+        <w:t>Joint Bulgaria flight evidence gathered for December 2025 to January 2026 and June 2026.</w:t>
       </w:r>
     </w:p>
     <w:p>
+      <w:pPr>
+        <w:keepLines/>
+        <w:spacing w:after="70"/>
+        <w:ind w:left="317" w:hanging="259"/>
+      </w:pPr>
       <w:r>
-        <w:t>☐ [P1] Legal commitments that you and your partner have undertaken as a couple</w:t>
+        <w:rPr>
+          <w:rFonts w:ascii="Aptos" w:hAnsi="Aptos"/>
+          <w:b/>
+          <w:color w:val="1A703D"/>
+          <w:sz w:val="19"/>
+        </w:rPr>
+        <w:t xml:space="preserve">DONE  </w:t>
+      </w:r>
+      <w:r>
+        <w:rPr>
+          <w:rFonts w:ascii="Aptos" w:hAnsi="Aptos"/>
+          <w:sz w:val="20"/>
+        </w:rPr>
+        <w:t>Current car insurance schedule gathered; Kristina is listed as a regular driver.</w:t>
       </w:r>
     </w:p>
     <w:p>
+      <w:pPr>
+        <w:keepLines/>
+        <w:spacing w:after="70"/>
+        <w:ind w:left="317" w:hanging="259"/>
+      </w:pPr>
       <w:r>
-        <w:t>☐ [P1] Sharing of household bills and expenses (e.g. utility bills, rent payments, groceries, household purchases, or other shared living expenses). Since Sep 2025 if applicable</w:t>
+        <w:rPr>
+          <w:rFonts w:ascii="Aptos" w:hAnsi="Aptos"/>
+          <w:b/>
+          <w:color w:val="1A703D"/>
+          <w:sz w:val="19"/>
+        </w:rPr>
+        <w:t xml:space="preserve">DONE  </w:t>
       </w:r>
-    </w:p>
-    <w:p>
       <w:r>
-        <w:t>☐ [P1] Joint ownership or joint rental of the house in which you live</w:t>
-      </w:r>
-    </w:p>
-    <w:p>
-      <w:r>
-        <w:t>☐ Lease agreement — Urunga and Coffs documents are provided in Drive; review for agency submission.</w:t>
-      </w:r>
-    </w:p>
-    <w:p>
-      <w:r>
-        <w:t>☐ Tenancy agreement — Coffs renewal is provided, 27 July 2026–25 January 2027.</w:t>
-      </w:r>
-    </w:p>
-    <w:p>
-      <w:r>
-        <w:t>☐ [P1] Joint utilities accounts since Sep 2025</w:t>
-      </w:r>
-    </w:p>
-    <w:p>
-      <w:r>
-        <w:t>☐ electricity</w:t>
-      </w:r>
-    </w:p>
-    <w:p>
-      <w:r>
-        <w:t>☐ gas</w:t>
-      </w:r>
-    </w:p>
-    <w:p>
-      <w:r>
-        <w:t>☐ telephone</w:t>
-      </w:r>
-    </w:p>
-    <w:p>
-      <w:r>
-        <w:t>☐ [P1] Correspondence addressed to both you and your partner at the same address (letters, mail, etc)</w:t>
-      </w:r>
-    </w:p>
-    <w:p>
-      <w:r>
-        <w:t>☐ Terms of your wills</w:t>
-      </w:r>
-    </w:p>
-    <w:p>
-      <w:r>
-        <w:t>☐ [P1] Records of joint travel (e.g. flight bookings, hotel/accommodation bookings, travel itineraries, and photos from trips taken together) - Since Sep 2025, if applicable</w:t>
-      </w:r>
-    </w:p>
-    <w:p>
-      <w:r>
-        <w:t>☐ [P1] Correspondence and itemised phone accounts to show that contact maintained during any period of separation - since Sep 2025 if applicable</w:t>
-      </w:r>
-    </w:p>
-    <w:p>
-      <w:r>
-        <w:t>☐ [P1] Relationship Timeline Photos - Since Sep 2025</w:t>
-      </w:r>
-    </w:p>
-    <w:p>
-      <w:r>
-        <w:t>☐ Compile these in a word document in chronological order with the date and a brief description under each photo. Around 2 to 3 photos every two months will be sufficient</w:t>
+        <w:rPr>
+          <w:rFonts w:ascii="Aptos" w:hAnsi="Aptos"/>
+          <w:sz w:val="20"/>
+        </w:rPr>
+        <w:t>Initial draft of Scott's updated relationship statement prepared.</w:t>
       </w:r>
     </w:p>
     <w:p>
@@ -206,22 +607,242 @@
         <w:pStyle w:val="Heading1"/>
       </w:pPr>
       <w:r>
-        <w:t>Health and character documents</w:t>
+        <w:rPr>
+          <w:rFonts w:ascii="Aptos" w:hAnsi="Aptos"/>
+          <w:sz w:val="30"/>
+        </w:rPr>
+        <w:t>Visa applicant's identity</w:t>
       </w:r>
     </w:p>
     <w:p>
+      <w:pPr>
+        <w:keepLines/>
+        <w:spacing w:after="70"/>
+        <w:ind w:left="317" w:hanging="259"/>
+      </w:pPr>
       <w:r>
-        <w:t>☑ Health examinations (if required - you will be notified)</w:t>
+        <w:rPr>
+          <w:rFonts w:ascii="Aptos" w:hAnsi="Aptos"/>
+          <w:b/>
+          <w:color w:val="9C4800"/>
+          <w:sz w:val="19"/>
+        </w:rPr>
+        <w:t xml:space="preserve">TO DO  </w:t>
+      </w:r>
+      <w:r>
+        <w:rPr>
+          <w:rFonts w:ascii="Aptos" w:hAnsi="Aptos"/>
+          <w:sz w:val="20"/>
+        </w:rPr>
+        <w:t>Copy of the biographical pages of current passports of all people included in the application (photo, personal details, issue/expiry dates)</w:t>
       </w:r>
     </w:p>
     <w:p>
+      <w:pPr>
+        <w:keepLines/>
+        <w:spacing w:after="70"/>
+        <w:ind w:left="317" w:hanging="259"/>
+      </w:pPr>
       <w:r>
-        <w:t>☑ Australian federal police check (only required if not provided in stage 1 - we provided 1 in stage 1)</w:t>
+        <w:rPr>
+          <w:rFonts w:ascii="Aptos" w:hAnsi="Aptos"/>
+          <w:b/>
+          <w:color w:val="9C4800"/>
+          <w:sz w:val="19"/>
+        </w:rPr>
+        <w:t xml:space="preserve">TO DO  </w:t>
+      </w:r>
+      <w:r>
+        <w:rPr>
+          <w:rFonts w:ascii="Aptos" w:hAnsi="Aptos"/>
+          <w:sz w:val="20"/>
+        </w:rPr>
+        <w:t>Copy of national card</w:t>
       </w:r>
     </w:p>
     <w:p>
+      <w:pPr>
+        <w:keepLines/>
+        <w:spacing w:after="70"/>
+        <w:ind w:left="706" w:hanging="259"/>
+      </w:pPr>
       <w:r>
-        <w:t>☑ Police certificates from each country in which anyone in your application has spent a total of 12 months or more since the grant of the temporary partner visa (If required you will be notified). We both haven't spent more than 12 months out of Australia since then, so no worries</w:t>
+        <w:rPr>
+          <w:rFonts w:ascii="Aptos" w:hAnsi="Aptos"/>
+          <w:b/>
+          <w:color w:val="9C4800"/>
+          <w:sz w:val="19"/>
+        </w:rPr>
+        <w:t xml:space="preserve">TO DO  </w:t>
+      </w:r>
+      <w:r>
+        <w:rPr>
+          <w:rFonts w:ascii="Aptos" w:hAnsi="Aptos"/>
+          <w:sz w:val="20"/>
+        </w:rPr>
+        <w:t>Kristina Bulgarian national ID</w:t>
+      </w:r>
+    </w:p>
+    <w:p>
+      <w:pPr>
+        <w:keepLines/>
+        <w:spacing w:after="70"/>
+        <w:ind w:left="317" w:hanging="259"/>
+      </w:pPr>
+      <w:r>
+        <w:rPr>
+          <w:rFonts w:ascii="Aptos" w:hAnsi="Aptos"/>
+          <w:b/>
+          <w:color w:val="9C4800"/>
+          <w:sz w:val="19"/>
+        </w:rPr>
+        <w:t xml:space="preserve">TO DO  </w:t>
+      </w:r>
+      <w:r>
+        <w:rPr>
+          <w:rFonts w:ascii="Aptos" w:hAnsi="Aptos"/>
+          <w:sz w:val="20"/>
+        </w:rPr>
+        <w:t>Copy of driver's card</w:t>
+      </w:r>
+    </w:p>
+    <w:p>
+      <w:pPr>
+        <w:keepLines/>
+        <w:spacing w:after="70"/>
+        <w:ind w:left="706" w:hanging="259"/>
+      </w:pPr>
+      <w:r>
+        <w:rPr>
+          <w:rFonts w:ascii="Aptos" w:hAnsi="Aptos"/>
+          <w:b/>
+          <w:color w:val="9C4800"/>
+          <w:sz w:val="19"/>
+        </w:rPr>
+        <w:t xml:space="preserve">TO DO  </w:t>
+      </w:r>
+      <w:r>
+        <w:rPr>
+          <w:rFonts w:ascii="Aptos" w:hAnsi="Aptos"/>
+          <w:sz w:val="20"/>
+        </w:rPr>
+        <w:t>Kristina's NSW driver's license</w:t>
+      </w:r>
+    </w:p>
+    <w:p>
+      <w:pPr>
+        <w:keepLines/>
+        <w:spacing w:after="70"/>
+        <w:ind w:left="706" w:hanging="259"/>
+      </w:pPr>
+      <w:r>
+        <w:rPr>
+          <w:rFonts w:ascii="Aptos" w:hAnsi="Aptos"/>
+          <w:b/>
+          <w:color w:val="9C4800"/>
+          <w:sz w:val="19"/>
+        </w:rPr>
+        <w:t xml:space="preserve">TO DO  </w:t>
+      </w:r>
+      <w:r>
+        <w:rPr>
+          <w:rFonts w:ascii="Aptos" w:hAnsi="Aptos"/>
+          <w:sz w:val="20"/>
+        </w:rPr>
+        <w:t>Kristina's Bulgarian driver's license(?)</w:t>
+      </w:r>
+    </w:p>
+    <w:p>
+      <w:pPr>
+        <w:keepLines/>
+        <w:spacing w:after="70"/>
+        <w:ind w:left="317" w:hanging="259"/>
+      </w:pPr>
+      <w:r>
+        <w:rPr>
+          <w:rFonts w:ascii="Aptos" w:hAnsi="Aptos"/>
+          <w:b/>
+          <w:color w:val="1A703D"/>
+          <w:sz w:val="19"/>
+        </w:rPr>
+        <w:t xml:space="preserve">DONE  </w:t>
+      </w:r>
+      <w:r>
+        <w:rPr>
+          <w:rFonts w:ascii="Aptos" w:hAnsi="Aptos"/>
+          <w:sz w:val="20"/>
+        </w:rPr>
+        <w:t xml:space="preserve">If your name has changed or the name of anyone in your application has changed. </w:t>
+      </w:r>
+    </w:p>
+    <w:p>
+      <w:pPr>
+        <w:keepLines/>
+        <w:spacing w:after="70"/>
+        <w:ind w:left="706" w:hanging="259"/>
+      </w:pPr>
+      <w:r>
+        <w:rPr>
+          <w:rFonts w:ascii="Aptos" w:hAnsi="Aptos"/>
+          <w:b/>
+          <w:color w:val="1A703D"/>
+          <w:sz w:val="19"/>
+        </w:rPr>
+        <w:t xml:space="preserve">DONE  </w:t>
+      </w:r>
+      <w:r>
+        <w:rPr>
+          <w:rFonts w:ascii="Aptos" w:hAnsi="Aptos"/>
+          <w:sz w:val="20"/>
+        </w:rPr>
+        <w:t>Kristina and Scott's marriage certificate</w:t>
+      </w:r>
+    </w:p>
+    <w:p>
+      <w:pPr>
+        <w:keepLines/>
+        <w:spacing w:after="70"/>
+        <w:ind w:left="317" w:hanging="259"/>
+      </w:pPr>
+      <w:r>
+        <w:rPr>
+          <w:rFonts w:ascii="Aptos" w:hAnsi="Aptos"/>
+          <w:b/>
+          <w:color w:val="9C4800"/>
+          <w:sz w:val="19"/>
+        </w:rPr>
+        <w:t xml:space="preserve">TO DO  </w:t>
+      </w:r>
+      <w:r>
+        <w:rPr>
+          <w:rFonts w:ascii="Aptos" w:hAnsi="Aptos"/>
+          <w:sz w:val="20"/>
+        </w:rPr>
+        <w:t>Subclass 820 Grant Letter</w:t>
+      </w:r>
+    </w:p>
+    <w:p>
+      <w:pPr>
+        <w:keepLines/>
+        <w:spacing w:after="70"/>
+        <w:ind w:left="317" w:hanging="259"/>
+      </w:pPr>
+      <w:r>
+        <w:rPr>
+          <w:rFonts w:ascii="Aptos" w:hAnsi="Aptos"/>
+          <w:b/>
+          <w:color w:val="9C4800"/>
+          <w:sz w:val="19"/>
+          <w:highlight w:val="yellow"/>
+        </w:rPr>
+        <w:t xml:space="preserve">TO DO  </w:t>
+      </w:r>
+      <w:r>
+        <w:rPr>
+          <w:rFonts w:ascii="Aptos" w:hAnsi="Aptos"/>
+          <w:sz w:val="20"/>
+        </w:rPr>
+        <w:t xml:space="preserve">[P1] Updated Form 80 - Personal particulars for character assessment (Kristina) #kristina </w:t>
       </w:r>
     </w:p>
     <w:p>
@@ -229,37 +850,682 @@
         <w:pStyle w:val="Heading1"/>
       </w:pPr>
       <w:r>
-        <w:t>Sponsor (Scott)</w:t>
+        <w:rPr>
+          <w:rFonts w:ascii="Aptos" w:hAnsi="Aptos"/>
+          <w:sz w:val="30"/>
+        </w:rPr>
+        <w:t>Evidence to demonstrate that your relationship is genuine and continuing since the grant of your temporary visa</w:t>
       </w:r>
     </w:p>
     <w:p>
+      <w:pPr>
+        <w:keepLines/>
+        <w:spacing w:after="70"/>
+        <w:ind w:left="317" w:hanging="259"/>
+      </w:pPr>
       <w:r>
-        <w:t>☐ Copy of the biographical pages of current passport - photo, personal details, and the issue/expiry dates</w:t>
+        <w:rPr>
+          <w:rFonts w:ascii="Aptos" w:hAnsi="Aptos"/>
+          <w:b/>
+          <w:color w:val="9C4800"/>
+          <w:sz w:val="19"/>
+          <w:highlight w:val="yellow"/>
+        </w:rPr>
+        <w:t xml:space="preserve">TO DO  </w:t>
+      </w:r>
+      <w:r>
+        <w:rPr>
+          <w:rFonts w:ascii="Aptos" w:hAnsi="Aptos"/>
+          <w:sz w:val="20"/>
+        </w:rPr>
+        <w:t xml:space="preserve">[P1] -  #scott Updated Statutory Declaration (Relationship Statement) from your Sponsor (Scott) regarding your relationship ("Please update Scott's previous statement with information from 24 Sep 2025 (stage 1 subclass 820 visa grant) to current") #scott — </w:t>
+      </w:r>
+      <w:r>
+        <w:rPr>
+          <w:rFonts w:ascii="Aptos" w:hAnsi="Aptos"/>
+          <w:b/>
+          <w:sz w:val="20"/>
+        </w:rPr>
+        <w:t>IN PROGRESS: initial draft prepared; final review, updates and signing remain.</w:t>
       </w:r>
     </w:p>
     <w:p>
+      <w:pPr>
+        <w:keepLines/>
+        <w:spacing w:after="70"/>
+        <w:ind w:left="317" w:hanging="259"/>
+      </w:pPr>
       <w:r>
-        <w:t>☐ Scott's passport</w:t>
+        <w:rPr>
+          <w:rFonts w:ascii="Aptos" w:hAnsi="Aptos"/>
+          <w:b/>
+          <w:color w:val="9C4800"/>
+          <w:sz w:val="19"/>
+          <w:highlight w:val="yellow"/>
+        </w:rPr>
+        <w:t xml:space="preserve">TO DO  </w:t>
+      </w:r>
+      <w:r>
+        <w:rPr>
+          <w:rFonts w:ascii="Aptos" w:hAnsi="Aptos"/>
+          <w:sz w:val="20"/>
+        </w:rPr>
+        <w:t>[P1] #jaya #mum - Form 888 – Statutory declaration by two Australian citizens or permanent residents who have personal knowledge of your partner relationship. ("You may use the same witnesses who completed the Form 888s for the Stage 1 partner visa application. Immigration only requires updated statements confirming their continued knowledge of your relationship.")</w:t>
       </w:r>
     </w:p>
     <w:p>
+      <w:pPr>
+        <w:keepLines/>
+        <w:spacing w:after="70"/>
+        <w:ind w:left="317" w:hanging="259"/>
+      </w:pPr>
       <w:r>
-        <w:t>☐ [P1] Copy of Australian Drivers' license (if applicable)</w:t>
+        <w:rPr>
+          <w:rFonts w:ascii="Aptos" w:hAnsi="Aptos"/>
+          <w:b/>
+          <w:color w:val="9C4800"/>
+          <w:sz w:val="19"/>
+          <w:highlight w:val="yellow"/>
+        </w:rPr>
+        <w:t xml:space="preserve">TO DO  </w:t>
+      </w:r>
+      <w:r>
+        <w:rPr>
+          <w:rFonts w:ascii="Aptos" w:hAnsi="Aptos"/>
+          <w:sz w:val="20"/>
+        </w:rPr>
+        <w:t xml:space="preserve">[P1] #kristina  #scott provide updated relationship documents since the grant of your Subclass 820 visa (original agency wording says “729”; confirm this correction with Affinity) - From 24th Sep 2025 to current - Examples of documents — </w:t>
+      </w:r>
+      <w:r>
+        <w:rPr>
+          <w:rFonts w:ascii="Aptos" w:hAnsi="Aptos"/>
+          <w:b/>
+          <w:sz w:val="20"/>
+        </w:rPr>
+        <w:t>IN PROGRESS: bank, lease, bill, insurance and travel evidence gathered; photos, correspondence, separation contact records and final upload remain.</w:t>
       </w:r>
     </w:p>
     <w:p>
+      <w:pPr>
+        <w:keepLines/>
+        <w:spacing w:after="70"/>
+        <w:ind w:left="317" w:hanging="259"/>
+      </w:pPr>
       <w:r>
-        <w:t>☐ Scott's NSW license</w:t>
+        <w:rPr>
+          <w:rFonts w:ascii="Aptos" w:hAnsi="Aptos"/>
+          <w:b/>
+          <w:color w:val="9C4800"/>
+          <w:sz w:val="19"/>
+          <w:highlight w:val="yellow"/>
+        </w:rPr>
+        <w:t xml:space="preserve">TO DO  </w:t>
+      </w:r>
+      <w:r>
+        <w:rPr>
+          <w:rFonts w:ascii="Aptos" w:hAnsi="Aptos"/>
+          <w:sz w:val="20"/>
+        </w:rPr>
+        <w:t xml:space="preserve">[P1] Evidence of joint ownership or real estate or other major assets (e.g. cars, appliances) and any joint liabilities (loans, mortgages, insurance) - that have been acquired or taken out since Sep 2025 if applicable — </w:t>
+      </w:r>
+      <w:r>
+        <w:rPr>
+          <w:rFonts w:ascii="Aptos" w:hAnsi="Aptos"/>
+          <w:b/>
+          <w:sz w:val="20"/>
+        </w:rPr>
+        <w:t>PARTIAL: car insurance gathered; ownership and loan evidence still needs confirmation and selection.</w:t>
       </w:r>
     </w:p>
     <w:p>
+      <w:pPr>
+        <w:keepLines/>
+        <w:spacing w:after="70"/>
+        <w:ind w:left="706" w:hanging="259"/>
+      </w:pPr>
       <w:r>
-        <w:t>☑ Australian Federal police check (only required if not provided in stage 1)</w:t>
+        <w:rPr>
+          <w:rFonts w:ascii="Aptos" w:hAnsi="Aptos"/>
+          <w:b/>
+          <w:color w:val="9C4800"/>
+          <w:sz w:val="19"/>
+        </w:rPr>
+        <w:t xml:space="preserve">TO DO  </w:t>
+      </w:r>
+      <w:r>
+        <w:rPr>
+          <w:rFonts w:ascii="Aptos" w:hAnsi="Aptos"/>
+          <w:sz w:val="20"/>
+        </w:rPr>
+        <w:t>Confirm any jointly owned assets acquired since September 2025, if applicable. Car loan, dog-surgery loan and credit card are confirmed solely in Scott’s name. Confirm the car purchase month/year and registration/ownership names if using it as asset evidence.</w:t>
       </w:r>
     </w:p>
     <w:p>
+      <w:pPr>
+        <w:keepLines/>
+        <w:spacing w:after="70"/>
+        <w:ind w:left="317" w:hanging="259"/>
+      </w:pPr>
       <w:r>
-        <w:t>☑ Police certificates from Bulgaria (only required if not provided previously - if required you will be notified)</w:t>
+        <w:rPr>
+          <w:rFonts w:ascii="Aptos" w:hAnsi="Aptos"/>
+          <w:b/>
+          <w:color w:val="1A703D"/>
+          <w:sz w:val="19"/>
+        </w:rPr>
+        <w:t xml:space="preserve">DONE  </w:t>
+      </w:r>
+      <w:r>
+        <w:rPr>
+          <w:rFonts w:ascii="Aptos" w:hAnsi="Aptos"/>
+          <w:sz w:val="20"/>
+        </w:rPr>
+        <w:t xml:space="preserve">[P1] Sharing of finances - joint bank statements — </w:t>
+      </w:r>
+      <w:r>
+        <w:rPr>
+          <w:rFonts w:ascii="Aptos" w:hAnsi="Aptos"/>
+          <w:b/>
+          <w:sz w:val="20"/>
+        </w:rPr>
+        <w:t>GATHERED LOCALLY; upload and final selection remain.</w:t>
+      </w:r>
+    </w:p>
+    <w:p>
+      <w:pPr>
+        <w:keepLines/>
+        <w:spacing w:after="70"/>
+        <w:ind w:left="706" w:hanging="259"/>
+      </w:pPr>
+      <w:r>
+        <w:rPr>
+          <w:rFonts w:ascii="Aptos" w:hAnsi="Aptos"/>
+          <w:b/>
+          <w:color w:val="1A703D"/>
+          <w:sz w:val="19"/>
+        </w:rPr>
+        <w:t xml:space="preserve">DONE  </w:t>
+      </w:r>
+      <w:r>
+        <w:rPr>
+          <w:rFonts w:ascii="Aptos" w:hAnsi="Aptos"/>
+          <w:sz w:val="20"/>
+        </w:rPr>
+        <w:t>CBA</w:t>
+      </w:r>
+    </w:p>
+    <w:p>
+      <w:pPr>
+        <w:keepLines/>
+        <w:spacing w:after="70"/>
+        <w:ind w:left="706" w:hanging="259"/>
+      </w:pPr>
+      <w:r>
+        <w:rPr>
+          <w:rFonts w:ascii="Aptos" w:hAnsi="Aptos"/>
+          <w:b/>
+          <w:color w:val="1A703D"/>
+          <w:sz w:val="19"/>
+        </w:rPr>
+        <w:t xml:space="preserve">DONE  </w:t>
+      </w:r>
+      <w:r>
+        <w:rPr>
+          <w:rFonts w:ascii="Aptos" w:hAnsi="Aptos"/>
+          <w:sz w:val="20"/>
+        </w:rPr>
+        <w:t>2Up</w:t>
+      </w:r>
+    </w:p>
+    <w:p>
+      <w:pPr>
+        <w:keepLines/>
+        <w:spacing w:after="70"/>
+        <w:ind w:left="706" w:hanging="259"/>
+      </w:pPr>
+      <w:r>
+        <w:rPr>
+          <w:rFonts w:ascii="Aptos" w:hAnsi="Aptos"/>
+          <w:b/>
+          <w:color w:val="1A703D"/>
+          <w:sz w:val="19"/>
+        </w:rPr>
+        <w:t xml:space="preserve">DONE  </w:t>
+      </w:r>
+      <w:r>
+        <w:rPr>
+          <w:rFonts w:ascii="Aptos" w:hAnsi="Aptos"/>
+          <w:sz w:val="20"/>
+        </w:rPr>
+        <w:t>ING household-expense account statements, accurately identified as Scott's sole-name account</w:t>
+      </w:r>
+    </w:p>
+    <w:p>
+      <w:pPr>
+        <w:keepLines/>
+        <w:spacing w:after="70"/>
+        <w:ind w:left="317" w:hanging="259"/>
+      </w:pPr>
+      <w:r>
+        <w:rPr>
+          <w:rFonts w:ascii="Aptos" w:hAnsi="Aptos"/>
+          <w:b/>
+          <w:color w:val="9C4800"/>
+          <w:sz w:val="19"/>
+          <w:highlight w:val="yellow"/>
+        </w:rPr>
+        <w:t xml:space="preserve">TO DO  </w:t>
+      </w:r>
+      <w:r>
+        <w:rPr>
+          <w:rFonts w:ascii="Aptos" w:hAnsi="Aptos"/>
+          <w:sz w:val="20"/>
+        </w:rPr>
+        <w:t xml:space="preserve">[P1] Legal commitments that you and your partner have undertaken as a couple — </w:t>
+      </w:r>
+      <w:r>
+        <w:rPr>
+          <w:rFonts w:ascii="Aptos" w:hAnsi="Aptos"/>
+          <w:b/>
+          <w:sz w:val="20"/>
+        </w:rPr>
+        <w:t>PARTIAL: joint leases gathered; superannuation beneficiary nominations remain.</w:t>
+      </w:r>
+    </w:p>
+    <w:p>
+      <w:pPr>
+        <w:keepLines/>
+        <w:spacing w:after="70"/>
+        <w:ind w:left="317" w:hanging="259"/>
+      </w:pPr>
+      <w:r>
+        <w:rPr>
+          <w:rFonts w:ascii="Aptos" w:hAnsi="Aptos"/>
+          <w:b/>
+          <w:color w:val="1A703D"/>
+          <w:sz w:val="19"/>
+        </w:rPr>
+        <w:t xml:space="preserve">DONE  </w:t>
+      </w:r>
+      <w:r>
+        <w:rPr>
+          <w:rFonts w:ascii="Aptos" w:hAnsi="Aptos"/>
+          <w:sz w:val="20"/>
+        </w:rPr>
+        <w:t xml:space="preserve">[P1] Sharing of household bills and expenses (e.g. utility bills, rent payments, groceries, household purchases, or other shared living expenses). Since Sep 2025 if applicable — </w:t>
+      </w:r>
+      <w:r>
+        <w:rPr>
+          <w:rFonts w:ascii="Aptos" w:hAnsi="Aptos"/>
+          <w:b/>
+          <w:sz w:val="20"/>
+        </w:rPr>
+        <w:t>BANK, RENT, INSURANCE AND UTILITY EVIDENCE GATHERED LOCALLY; upload and submission selection remain.</w:t>
+      </w:r>
+    </w:p>
+    <w:p>
+      <w:pPr>
+        <w:keepLines/>
+        <w:spacing w:after="70"/>
+        <w:ind w:left="317" w:hanging="259"/>
+      </w:pPr>
+      <w:r>
+        <w:rPr>
+          <w:rFonts w:ascii="Aptos" w:hAnsi="Aptos"/>
+          <w:b/>
+          <w:color w:val="1A703D"/>
+          <w:sz w:val="19"/>
+        </w:rPr>
+        <w:t xml:space="preserve">DONE  </w:t>
+      </w:r>
+      <w:r>
+        <w:rPr>
+          <w:rFonts w:ascii="Aptos" w:hAnsi="Aptos"/>
+          <w:sz w:val="20"/>
+        </w:rPr>
+        <w:t>[P1] Joint ownership or joint rental of the house in which you live</w:t>
+      </w:r>
+    </w:p>
+    <w:p>
+      <w:pPr>
+        <w:keepLines/>
+        <w:spacing w:after="70"/>
+        <w:ind w:left="706" w:hanging="259"/>
+      </w:pPr>
+      <w:r>
+        <w:rPr>
+          <w:rFonts w:ascii="Aptos" w:hAnsi="Aptos"/>
+          <w:b/>
+          <w:color w:val="1A703D"/>
+          <w:sz w:val="19"/>
+        </w:rPr>
+        <w:t xml:space="preserve">DONE  </w:t>
+      </w:r>
+      <w:r>
+        <w:rPr>
+          <w:rFonts w:ascii="Aptos" w:hAnsi="Aptos"/>
+          <w:sz w:val="20"/>
+        </w:rPr>
+        <w:t>Lease agreement — Urunga and initial Coffs Harbour agreements gathered.</w:t>
+      </w:r>
+    </w:p>
+    <w:p>
+      <w:pPr>
+        <w:keepLines/>
+        <w:spacing w:after="70"/>
+        <w:ind w:left="706" w:hanging="259"/>
+      </w:pPr>
+      <w:r>
+        <w:rPr>
+          <w:rFonts w:ascii="Aptos" w:hAnsi="Aptos"/>
+          <w:b/>
+          <w:color w:val="1A703D"/>
+          <w:sz w:val="19"/>
+        </w:rPr>
+        <w:t xml:space="preserve">DONE  </w:t>
+      </w:r>
+      <w:r>
+        <w:rPr>
+          <w:rFonts w:ascii="Aptos" w:hAnsi="Aptos"/>
+          <w:sz w:val="20"/>
+        </w:rPr>
+        <w:t>Tenancy agreement — Coffs Harbour extension gathered, 27 July 2026–25 January 2027.</w:t>
+      </w:r>
+    </w:p>
+    <w:p>
+      <w:pPr>
+        <w:keepLines/>
+        <w:spacing w:after="70"/>
+        <w:ind w:left="317" w:hanging="259"/>
+      </w:pPr>
+      <w:r>
+        <w:rPr>
+          <w:rFonts w:ascii="Aptos" w:hAnsi="Aptos"/>
+          <w:b/>
+          <w:color w:val="9C4800"/>
+          <w:sz w:val="19"/>
+          <w:highlight w:val="yellow"/>
+        </w:rPr>
+        <w:t xml:space="preserve">TO DO  </w:t>
+      </w:r>
+      <w:r>
+        <w:rPr>
+          <w:rFonts w:ascii="Aptos" w:hAnsi="Aptos"/>
+          <w:sz w:val="20"/>
+        </w:rPr>
+        <w:t xml:space="preserve">[P1] Joint utilities accounts since Sep 2025 — </w:t>
+      </w:r>
+      <w:r>
+        <w:rPr>
+          <w:rFonts w:ascii="Aptos" w:hAnsi="Aptos"/>
+          <w:b/>
+          <w:sz w:val="20"/>
+        </w:rPr>
+        <w:t>NO JOINTLY NAMED UTILITY ACCOUNT IDENTIFIED. Use the gathered bills as shared-address or household-expense evidence and describe the account holders accurately.</w:t>
+      </w:r>
+    </w:p>
+    <w:p>
+      <w:pPr>
+        <w:keepLines/>
+        <w:spacing w:after="70"/>
+        <w:ind w:left="706" w:hanging="259"/>
+      </w:pPr>
+      <w:r>
+        <w:rPr>
+          <w:rFonts w:ascii="Aptos" w:hAnsi="Aptos"/>
+          <w:b/>
+          <w:color w:val="1A703D"/>
+          <w:sz w:val="19"/>
+        </w:rPr>
+        <w:t xml:space="preserve">DONE  </w:t>
+      </w:r>
+      <w:r>
+        <w:rPr>
+          <w:rFonts w:ascii="Aptos" w:hAnsi="Aptos"/>
+          <w:sz w:val="20"/>
+        </w:rPr>
+        <w:t>Electricity bills gathered — account is in Scott's name.</w:t>
+      </w:r>
+    </w:p>
+    <w:p>
+      <w:pPr>
+        <w:keepLines/>
+        <w:spacing w:after="70"/>
+        <w:ind w:left="706" w:hanging="259"/>
+      </w:pPr>
+      <w:r>
+        <w:rPr>
+          <w:rFonts w:ascii="Aptos" w:hAnsi="Aptos"/>
+          <w:b/>
+          <w:color w:val="9C4800"/>
+          <w:sz w:val="19"/>
+        </w:rPr>
+        <w:t xml:space="preserve">TO DO  </w:t>
+      </w:r>
+      <w:r>
+        <w:rPr>
+          <w:rFonts w:ascii="Aptos" w:hAnsi="Aptos"/>
+          <w:sz w:val="20"/>
+        </w:rPr>
+        <w:t>Gas — confirm whether not applicable.</w:t>
+      </w:r>
+    </w:p>
+    <w:p>
+      <w:pPr>
+        <w:keepLines/>
+        <w:spacing w:after="70"/>
+        <w:ind w:left="706" w:hanging="259"/>
+      </w:pPr>
+      <w:r>
+        <w:rPr>
+          <w:rFonts w:ascii="Aptos" w:hAnsi="Aptos"/>
+          <w:b/>
+          <w:color w:val="1A703D"/>
+          <w:sz w:val="19"/>
+        </w:rPr>
+        <w:t xml:space="preserve">DONE  </w:t>
+      </w:r>
+      <w:r>
+        <w:rPr>
+          <w:rFonts w:ascii="Aptos" w:hAnsi="Aptos"/>
+          <w:sz w:val="20"/>
+        </w:rPr>
+        <w:t>Telephone bills gathered — accounts reviewed are in Scott's name.</w:t>
+      </w:r>
+    </w:p>
+    <w:p>
+      <w:pPr>
+        <w:keepLines/>
+        <w:spacing w:after="70"/>
+        <w:ind w:left="706" w:hanging="259"/>
+      </w:pPr>
+      <w:r>
+        <w:rPr>
+          <w:rFonts w:ascii="Aptos" w:hAnsi="Aptos"/>
+          <w:b/>
+          <w:color w:val="1A703D"/>
+          <w:sz w:val="19"/>
+        </w:rPr>
+        <w:t xml:space="preserve">DONE  </w:t>
+      </w:r>
+      <w:r>
+        <w:rPr>
+          <w:rFonts w:ascii="Aptos" w:hAnsi="Aptos"/>
+          <w:sz w:val="20"/>
+        </w:rPr>
+        <w:t>Internet bills gathered — account is in Scott's name.</w:t>
+      </w:r>
+    </w:p>
+    <w:p>
+      <w:pPr>
+        <w:keepLines/>
+        <w:spacing w:after="70"/>
+        <w:ind w:left="706" w:hanging="259"/>
+      </w:pPr>
+      <w:r>
+        <w:rPr>
+          <w:rFonts w:ascii="Aptos" w:hAnsi="Aptos"/>
+          <w:b/>
+          <w:color w:val="1A703D"/>
+          <w:sz w:val="19"/>
+        </w:rPr>
+        <w:t xml:space="preserve">DONE  </w:t>
+      </w:r>
+      <w:r>
+        <w:rPr>
+          <w:rFonts w:ascii="Aptos" w:hAnsi="Aptos"/>
+          <w:sz w:val="20"/>
+        </w:rPr>
+        <w:t>Water bills gathered — addressed to the property owner or agent for the shared rental address.</w:t>
+      </w:r>
+    </w:p>
+    <w:p>
+      <w:pPr>
+        <w:keepLines/>
+        <w:spacing w:after="70"/>
+        <w:ind w:left="317" w:hanging="259"/>
+      </w:pPr>
+      <w:r>
+        <w:rPr>
+          <w:rFonts w:ascii="Aptos" w:hAnsi="Aptos"/>
+          <w:b/>
+          <w:color w:val="9C4800"/>
+          <w:sz w:val="19"/>
+          <w:highlight w:val="yellow"/>
+        </w:rPr>
+        <w:t xml:space="preserve">TO DO  </w:t>
+      </w:r>
+      <w:r>
+        <w:rPr>
+          <w:rFonts w:ascii="Aptos" w:hAnsi="Aptos"/>
+          <w:sz w:val="20"/>
+        </w:rPr>
+        <w:t>[P1] Correspondence addressed to both you and your partner at the same address (letters, mail, etc)</w:t>
+      </w:r>
+    </w:p>
+    <w:p>
+      <w:pPr>
+        <w:keepLines/>
+        <w:spacing w:after="70"/>
+        <w:ind w:left="317" w:hanging="259"/>
+      </w:pPr>
+      <w:r>
+        <w:rPr>
+          <w:rFonts w:ascii="Aptos" w:hAnsi="Aptos"/>
+          <w:b/>
+          <w:color w:val="9C4800"/>
+          <w:sz w:val="19"/>
+        </w:rPr>
+        <w:t xml:space="preserve">TO DO  </w:t>
+      </w:r>
+      <w:r>
+        <w:rPr>
+          <w:rFonts w:ascii="Aptos" w:hAnsi="Aptos"/>
+          <w:sz w:val="20"/>
+        </w:rPr>
+        <w:t>Terms of your wills</w:t>
+      </w:r>
+    </w:p>
+    <w:p>
+      <w:pPr>
+        <w:keepLines/>
+        <w:spacing w:after="70"/>
+        <w:ind w:left="317" w:hanging="259"/>
+      </w:pPr>
+      <w:r>
+        <w:rPr>
+          <w:rFonts w:ascii="Aptos" w:hAnsi="Aptos"/>
+          <w:b/>
+          <w:color w:val="1A703D"/>
+          <w:sz w:val="19"/>
+        </w:rPr>
+        <w:t xml:space="preserve">DONE  </w:t>
+      </w:r>
+      <w:r>
+        <w:rPr>
+          <w:rFonts w:ascii="Aptos" w:hAnsi="Aptos"/>
+          <w:sz w:val="20"/>
+        </w:rPr>
+        <w:t xml:space="preserve">[P1] Records of joint travel (e.g. flight bookings, hotel/accommodation bookings, travel itineraries, and photos from trips taken together) - Since Sep 2025, if applicable — </w:t>
+      </w:r>
+      <w:r>
+        <w:rPr>
+          <w:rFonts w:ascii="Aptos" w:hAnsi="Aptos"/>
+          <w:b/>
+          <w:sz w:val="20"/>
+        </w:rPr>
+        <w:t>FLIGHT EVIDENCE GATHERED FOR BOTH BULGARIA TRIPS. Add accommodation or photos if useful.</w:t>
+      </w:r>
+    </w:p>
+    <w:p>
+      <w:pPr>
+        <w:keepLines/>
+        <w:spacing w:after="70"/>
+        <w:ind w:left="317" w:hanging="259"/>
+      </w:pPr>
+      <w:r>
+        <w:rPr>
+          <w:rFonts w:ascii="Aptos" w:hAnsi="Aptos"/>
+          <w:b/>
+          <w:color w:val="9C4800"/>
+          <w:sz w:val="19"/>
+          <w:highlight w:val="yellow"/>
+        </w:rPr>
+        <w:t xml:space="preserve">TO DO  </w:t>
+      </w:r>
+      <w:r>
+        <w:rPr>
+          <w:rFonts w:ascii="Aptos" w:hAnsi="Aptos"/>
+          <w:sz w:val="20"/>
+        </w:rPr>
+        <w:t>[P1] Correspondence and itemised phone accounts to show that contact maintained during any period of separation - since Sep 2025 if applicable</w:t>
+      </w:r>
+    </w:p>
+    <w:p>
+      <w:pPr>
+        <w:keepLines/>
+        <w:spacing w:after="70"/>
+        <w:ind w:left="317" w:hanging="259"/>
+      </w:pPr>
+      <w:r>
+        <w:rPr>
+          <w:rFonts w:ascii="Aptos" w:hAnsi="Aptos"/>
+          <w:b/>
+          <w:color w:val="9C4800"/>
+          <w:sz w:val="19"/>
+          <w:highlight w:val="yellow"/>
+        </w:rPr>
+        <w:t xml:space="preserve">TO DO  </w:t>
+      </w:r>
+      <w:r>
+        <w:rPr>
+          <w:rFonts w:ascii="Aptos" w:hAnsi="Aptos"/>
+          <w:sz w:val="20"/>
+        </w:rPr>
+        <w:t>[P1] Relationship Timeline Photos - Since Sep 2025</w:t>
+      </w:r>
+    </w:p>
+    <w:p>
+      <w:pPr>
+        <w:keepLines/>
+        <w:spacing w:after="70"/>
+        <w:ind w:left="706" w:hanging="259"/>
+      </w:pPr>
+      <w:r>
+        <w:rPr>
+          <w:rFonts w:ascii="Aptos" w:hAnsi="Aptos"/>
+          <w:b/>
+          <w:color w:val="9C4800"/>
+          <w:sz w:val="19"/>
+        </w:rPr>
+        <w:t xml:space="preserve">TO DO  </w:t>
+      </w:r>
+      <w:r>
+        <w:rPr>
+          <w:rFonts w:ascii="Aptos" w:hAnsi="Aptos"/>
+          <w:sz w:val="20"/>
+        </w:rPr>
+        <w:t>Compile these in a word document in chronological order with the date and a brief description under each photo. Around 2 to 3 photos every two months will be sufficient</w:t>
       </w:r>
     </w:p>
     <w:p>
@@ -267,46 +1533,397 @@
         <w:pStyle w:val="Heading1"/>
       </w:pPr>
       <w:r>
+        <w:rPr>
+          <w:rFonts w:ascii="Aptos" w:hAnsi="Aptos"/>
+          <w:sz w:val="30"/>
+        </w:rPr>
+        <w:t>Health and character documents</w:t>
+      </w:r>
+    </w:p>
+    <w:p>
+      <w:pPr>
+        <w:keepLines/>
+        <w:spacing w:after="70"/>
+        <w:ind w:left="706" w:hanging="259"/>
+      </w:pPr>
+      <w:r>
+        <w:rPr>
+          <w:rFonts w:ascii="Aptos" w:hAnsi="Aptos"/>
+          <w:b/>
+          <w:color w:val="1A703D"/>
+          <w:sz w:val="19"/>
+        </w:rPr>
+        <w:t xml:space="preserve">DONE  </w:t>
+      </w:r>
+      <w:r>
+        <w:rPr>
+          <w:rFonts w:ascii="Aptos" w:hAnsi="Aptos"/>
+          <w:sz w:val="20"/>
+        </w:rPr>
+        <w:t>Health examinations (if required - you will be notified)</w:t>
+      </w:r>
+    </w:p>
+    <w:p>
+      <w:pPr>
+        <w:keepLines/>
+        <w:spacing w:after="70"/>
+        <w:ind w:left="317" w:hanging="259"/>
+      </w:pPr>
+      <w:r>
+        <w:rPr>
+          <w:rFonts w:ascii="Aptos" w:hAnsi="Aptos"/>
+          <w:b/>
+          <w:color w:val="1A703D"/>
+          <w:sz w:val="19"/>
+        </w:rPr>
+        <w:t xml:space="preserve">DONE  </w:t>
+      </w:r>
+      <w:r>
+        <w:rPr>
+          <w:rFonts w:ascii="Aptos" w:hAnsi="Aptos"/>
+          <w:sz w:val="20"/>
+        </w:rPr>
+        <w:t>Australian federal police check (only required if not provided in stage 1 - we provided 1 in stage 1)</w:t>
+      </w:r>
+    </w:p>
+    <w:p>
+      <w:pPr>
+        <w:keepLines/>
+        <w:spacing w:after="70"/>
+        <w:ind w:left="317" w:hanging="259"/>
+      </w:pPr>
+      <w:r>
+        <w:rPr>
+          <w:rFonts w:ascii="Aptos" w:hAnsi="Aptos"/>
+          <w:b/>
+          <w:color w:val="1A703D"/>
+          <w:sz w:val="19"/>
+        </w:rPr>
+        <w:t xml:space="preserve">DONE  </w:t>
+      </w:r>
+      <w:r>
+        <w:rPr>
+          <w:rFonts w:ascii="Aptos" w:hAnsi="Aptos"/>
+          <w:sz w:val="20"/>
+        </w:rPr>
+        <w:t>Police certificates from each country in which anyone in your application has spent a total of 12 months or more since the grant of the temporary partner visa (If required you will be notified). We both haven't spent more than 12 months out of Australia since then, so no worries</w:t>
+      </w:r>
+    </w:p>
+    <w:p>
+      <w:pPr>
+        <w:pStyle w:val="Heading1"/>
+      </w:pPr>
+      <w:r>
+        <w:rPr>
+          <w:rFonts w:ascii="Aptos" w:hAnsi="Aptos"/>
+          <w:sz w:val="30"/>
+        </w:rPr>
+        <w:t>Sponsor (Scott)</w:t>
+      </w:r>
+    </w:p>
+    <w:p>
+      <w:pPr>
+        <w:keepLines/>
+        <w:spacing w:after="70"/>
+        <w:ind w:left="317" w:hanging="259"/>
+      </w:pPr>
+      <w:r>
+        <w:rPr>
+          <w:rFonts w:ascii="Aptos" w:hAnsi="Aptos"/>
+          <w:b/>
+          <w:color w:val="9C4800"/>
+          <w:sz w:val="19"/>
+        </w:rPr>
+        <w:t xml:space="preserve">TO DO  </w:t>
+      </w:r>
+      <w:r>
+        <w:rPr>
+          <w:rFonts w:ascii="Aptos" w:hAnsi="Aptos"/>
+          <w:sz w:val="20"/>
+        </w:rPr>
+        <w:t>Copy of the biographical pages of current passport - photo, personal details, and the issue/expiry dates</w:t>
+      </w:r>
+    </w:p>
+    <w:p>
+      <w:pPr>
+        <w:keepLines/>
+        <w:spacing w:after="70"/>
+        <w:ind w:left="706" w:hanging="259"/>
+      </w:pPr>
+      <w:r>
+        <w:rPr>
+          <w:rFonts w:ascii="Aptos" w:hAnsi="Aptos"/>
+          <w:b/>
+          <w:color w:val="9C4800"/>
+          <w:sz w:val="19"/>
+        </w:rPr>
+        <w:t xml:space="preserve">TO DO  </w:t>
+      </w:r>
+      <w:r>
+        <w:rPr>
+          <w:rFonts w:ascii="Aptos" w:hAnsi="Aptos"/>
+          <w:sz w:val="20"/>
+        </w:rPr>
+        <w:t>Scott's passport</w:t>
+      </w:r>
+    </w:p>
+    <w:p>
+      <w:pPr>
+        <w:keepLines/>
+        <w:spacing w:after="70"/>
+        <w:ind w:left="317" w:hanging="259"/>
+      </w:pPr>
+      <w:r>
+        <w:rPr>
+          <w:rFonts w:ascii="Aptos" w:hAnsi="Aptos"/>
+          <w:b/>
+          <w:color w:val="1A703D"/>
+          <w:sz w:val="19"/>
+        </w:rPr>
+        <w:t xml:space="preserve">DONE  </w:t>
+      </w:r>
+      <w:r>
+        <w:rPr>
+          <w:rFonts w:ascii="Aptos" w:hAnsi="Aptos"/>
+          <w:sz w:val="20"/>
+        </w:rPr>
+        <w:t>[P1] Copy of Australian Drivers' license (if applicable)</w:t>
+      </w:r>
+    </w:p>
+    <w:p>
+      <w:pPr>
+        <w:keepLines/>
+        <w:spacing w:after="70"/>
+        <w:ind w:left="706" w:hanging="259"/>
+      </w:pPr>
+      <w:r>
+        <w:rPr>
+          <w:rFonts w:ascii="Aptos" w:hAnsi="Aptos"/>
+          <w:b/>
+          <w:color w:val="1A703D"/>
+          <w:sz w:val="19"/>
+        </w:rPr>
+        <w:t xml:space="preserve">DONE  </w:t>
+      </w:r>
+      <w:r>
+        <w:rPr>
+          <w:rFonts w:ascii="Aptos" w:hAnsi="Aptos"/>
+          <w:sz w:val="20"/>
+        </w:rPr>
+        <w:t>Scott's NSW licence — front and back included across two pages.</w:t>
+      </w:r>
+    </w:p>
+    <w:p>
+      <w:pPr>
+        <w:keepLines/>
+        <w:spacing w:after="70"/>
+        <w:ind w:left="317" w:hanging="259"/>
+      </w:pPr>
+      <w:r>
+        <w:rPr>
+          <w:rFonts w:ascii="Aptos" w:hAnsi="Aptos"/>
+          <w:b/>
+          <w:color w:val="1A703D"/>
+          <w:sz w:val="19"/>
+        </w:rPr>
+        <w:t xml:space="preserve">DONE  </w:t>
+      </w:r>
+      <w:r>
+        <w:rPr>
+          <w:rFonts w:ascii="Aptos" w:hAnsi="Aptos"/>
+          <w:sz w:val="20"/>
+        </w:rPr>
+        <w:t>Australian Federal police check (only required if not provided in stage 1)</w:t>
+      </w:r>
+    </w:p>
+    <w:p>
+      <w:pPr>
+        <w:keepLines/>
+        <w:spacing w:after="70"/>
+        <w:ind w:left="317" w:hanging="259"/>
+      </w:pPr>
+      <w:r>
+        <w:rPr>
+          <w:rFonts w:ascii="Aptos" w:hAnsi="Aptos"/>
+          <w:b/>
+          <w:color w:val="1A703D"/>
+          <w:sz w:val="19"/>
+        </w:rPr>
+        <w:t xml:space="preserve">DONE  </w:t>
+      </w:r>
+      <w:r>
+        <w:rPr>
+          <w:rFonts w:ascii="Aptos" w:hAnsi="Aptos"/>
+          <w:sz w:val="20"/>
+        </w:rPr>
+        <w:t>Police certificates from Bulgaria (only required if not provided previously - if required you will be notified)</w:t>
+      </w:r>
+    </w:p>
+    <w:p>
+      <w:pPr>
+        <w:pStyle w:val="Heading1"/>
+      </w:pPr>
+      <w:r>
+        <w:rPr>
+          <w:rFonts w:ascii="Aptos" w:hAnsi="Aptos"/>
+          <w:sz w:val="30"/>
+        </w:rPr>
         <w:t>Statement confirmations and remaining actions</w:t>
       </w:r>
     </w:p>
     <w:p>
       <w:r>
+        <w:rPr>
+          <w:rFonts w:ascii="Aptos" w:hAnsi="Aptos"/>
+          <w:sz w:val="20"/>
+        </w:rPr>
         <w:t>The initial draft is prepared for review. Add replies beneath these items; approximate dates are fine where exact dates are being checked.</w:t>
       </w:r>
     </w:p>
     <w:p>
+      <w:pPr>
+        <w:keepLines/>
+        <w:spacing w:after="70"/>
+        <w:ind w:left="317" w:hanging="259"/>
+      </w:pPr>
       <w:r>
-        <w:t>☐ Short periods apart — for the brother’s house move, birthdays, each TAFE excursion and Sydney Bats trip, supply approximate dates, number of nights, who travelled, who remained home and how you kept in contact. Identify which were after 24 September 2025 and which trips you took together. The draft currently describes them generally without invented dates.</w:t>
+        <w:rPr>
+          <w:rFonts w:ascii="Aptos" w:hAnsi="Aptos"/>
+          <w:b/>
+          <w:color w:val="9C4800"/>
+          <w:sz w:val="19"/>
+        </w:rPr>
+        <w:t xml:space="preserve">TO DO  </w:t>
+      </w:r>
+      <w:r>
+        <w:rPr>
+          <w:rFonts w:ascii="Aptos" w:hAnsi="Aptos"/>
+          <w:sz w:val="20"/>
+        </w:rPr>
+        <w:t>Short periods apart — for the brother’s house move, birthdays, each TAFE excursion and Sydney Bats trip, supply approximate dates, number of nights, who travelled, who remained home and how you kept in contact. Identify which were after 24 September 2025 and which trips you took together. The draft currently describes them generally without invented dates.</w:t>
+      </w:r>
+    </w:p>
+    <w:p>
+      <w:pPr>
+        <w:keepLines/>
+        <w:spacing w:after="70"/>
+        <w:ind w:left="317" w:hanging="259"/>
+      </w:pPr>
+      <w:r>
+        <w:rPr>
+          <w:rFonts w:ascii="Aptos" w:hAnsi="Aptos"/>
+          <w:b/>
+          <w:color w:val="9C4800"/>
+          <w:sz w:val="19"/>
+        </w:rPr>
+        <w:t xml:space="preserve">TO DO  </w:t>
+      </w:r>
+      <w:r>
+        <w:rPr>
+          <w:rFonts w:ascii="Aptos" w:hAnsi="Aptos"/>
+          <w:sz w:val="20"/>
+        </w:rPr>
+        <w:t>School friend’s wedding — provide the couple’s names and approximate date. This event has been left out until its timing is known.</w:t>
+      </w:r>
+    </w:p>
+    <w:p>
+      <w:pPr>
+        <w:keepLines/>
+        <w:spacing w:after="70"/>
+        <w:ind w:left="317" w:hanging="259"/>
+      </w:pPr>
+      <w:r>
+        <w:rPr>
+          <w:rFonts w:ascii="Aptos" w:hAnsi="Aptos"/>
+          <w:b/>
+          <w:color w:val="9C4800"/>
+          <w:sz w:val="19"/>
+        </w:rPr>
+        <w:t xml:space="preserve">TO DO  </w:t>
+      </w:r>
+      <w:r>
+        <w:rPr>
+          <w:rFonts w:ascii="Aptos" w:hAnsi="Aptos"/>
+          <w:sz w:val="20"/>
+        </w:rPr>
+        <w:t>Car purchase — provide approximate purchase date and confirm registration/ownership names if relying on the car as asset evidence. The ING loan being solely in Scott’s name is already confirmed; no need to reconfirm it.</w:t>
+      </w:r>
+    </w:p>
+    <w:p>
+      <w:pPr>
+        <w:keepLines/>
+        <w:spacing w:after="70"/>
+        <w:ind w:left="317" w:hanging="259"/>
+      </w:pPr>
+      <w:r>
+        <w:rPr>
+          <w:rFonts w:ascii="Aptos" w:hAnsi="Aptos"/>
+          <w:b/>
+          <w:color w:val="9C4800"/>
+          <w:sz w:val="19"/>
+        </w:rPr>
+        <w:t xml:space="preserve">TO DO  </w:t>
+      </w:r>
+      <w:r>
+        <w:rPr>
+          <w:rFonts w:ascii="Aptos" w:hAnsi="Aptos"/>
+          <w:sz w:val="20"/>
+        </w:rPr>
+        <w:t>Sanctuary work — confirm the first shift date if you want it stated exactly (currently “around the beginning of October 2026”), and the role title if useful. Update the reference to two completed shifts when finalising the statement.</w:t>
+      </w:r>
+    </w:p>
+    <w:p>
+      <w:pPr>
+        <w:keepLines/>
+        <w:spacing w:after="70"/>
+        <w:ind w:left="317" w:hanging="259"/>
+      </w:pPr>
+      <w:r>
+        <w:rPr>
+          <w:rFonts w:ascii="Aptos" w:hAnsi="Aptos"/>
+          <w:b/>
+          <w:color w:val="9C4800"/>
+          <w:sz w:val="19"/>
+        </w:rPr>
+        <w:t xml:space="preserve">TO DO  </w:t>
+      </w:r>
+      <w:r>
+        <w:rPr>
+          <w:rFonts w:ascii="Aptos" w:hAnsi="Aptos"/>
+          <w:sz w:val="20"/>
+        </w:rPr>
+        <w:t>Bali arrangements — clarify the drive to/from the Gold Coast, where Scott stayed and who cared for the dog, if these details are to be included. The draft currently mentions the car left with Mum and a sitter only for the joint Bulgaria trips.</w:t>
+      </w:r>
+    </w:p>
+    <w:p>
+      <w:pPr>
+        <w:keepLines/>
+        <w:spacing w:after="70"/>
+        <w:ind w:left="317" w:hanging="259"/>
+      </w:pPr>
+      <w:r>
+        <w:rPr>
+          <w:rFonts w:ascii="Aptos" w:hAnsi="Aptos"/>
+          <w:b/>
+          <w:color w:val="9C4800"/>
+          <w:sz w:val="19"/>
+        </w:rPr>
+        <w:t xml:space="preserve">TO DO  </w:t>
+      </w:r>
+      <w:r>
+        <w:rPr>
+          <w:rFonts w:ascii="Aptos" w:hAnsi="Aptos"/>
+          <w:sz w:val="20"/>
+        </w:rPr>
+        <w:t>Final read — check the statement sounds like Scott and is accurate, including the bereavement paragraph, finances and future plans. Confirm “Web Developer” remains an appropriate occupation in the agency template. Review with Affinity, update the cutoff date and arrange signing only after the content is final.</w:t>
       </w:r>
     </w:p>
     <w:p>
       <w:r>
-        <w:t>☐ School friend’s wedding — provide the couple’s names and approximate date. This event has been left out until its timing is known.</w:t>
-      </w:r>
-    </w:p>
-    <w:p>
-      <w:r>
-        <w:t>☐ Car purchase — provide approximate purchase date and confirm registration/ownership names if relying on the car as asset evidence. The ING loan being solely in Scott’s name is already confirmed; no need to reconfirm it.</w:t>
-      </w:r>
-    </w:p>
-    <w:p>
-      <w:r>
-        <w:t>☐ Sanctuary work — confirm the first shift date if you want it stated exactly (currently “around the beginning of October 2026”), and the role title if useful. Update the reference to two completed shifts when finalising the statement.</w:t>
-      </w:r>
-    </w:p>
-    <w:p>
-      <w:r>
-        <w:t>☐ Bali arrangements — clarify the drive to/from the Gold Coast, where Scott stayed and who cared for the dog, if these details are to be included. The draft currently mentions the car left with Mum and a sitter only for the joint Bulgaria trips.</w:t>
-      </w:r>
-    </w:p>
-    <w:p>
-      <w:r>
-        <w:t>☐ Final read — check the statement sounds like Scott and is accurate, including the bereavement paragraph, finances and future plans. Confirm “Web Developer” remains an appropriate occupation in the agency template. Review with Affinity, update the cutoff date and arrange signing only after the content is final.</w:t>
-      </w:r>
-    </w:p>
-    <w:p>
-      <w:r>
+        <w:rPr>
+          <w:rFonts w:ascii="Aptos" w:hAnsi="Aptos"/>
+          <w:sz w:val="20"/>
+        </w:rPr>
         <w:t>Response space: add answers below the relevant item, using approximate dates where exact dates are still being checked.</w:t>
       </w:r>
     </w:p>
@@ -315,57 +1932,241 @@
         <w:pStyle w:val="Heading1"/>
       </w:pPr>
       <w:r>
+        <w:rPr>
+          <w:rFonts w:ascii="Aptos" w:hAnsi="Aptos"/>
+          <w:sz w:val="30"/>
+        </w:rPr>
         <w:t>Additional evidence follow-up and agency clarifications</w:t>
       </w:r>
     </w:p>
     <w:p>
+      <w:pPr>
+        <w:keepLines/>
+        <w:spacing w:after="70"/>
+        <w:ind w:left="317" w:hanging="259"/>
+      </w:pPr>
       <w:r>
-        <w:t>☐ Bali return ticket — already requested from Kristina; add to Evidence when received. Return date supplied is 10 October 2025.</w:t>
+        <w:rPr>
+          <w:rFonts w:ascii="Aptos" w:hAnsi="Aptos"/>
+          <w:b/>
+          <w:color w:val="9C4800"/>
+          <w:sz w:val="19"/>
+        </w:rPr>
+        <w:t xml:space="preserve">TO DO  </w:t>
+      </w:r>
+      <w:r>
+        <w:rPr>
+          <w:rFonts w:ascii="Aptos" w:hAnsi="Aptos"/>
+          <w:sz w:val="20"/>
+        </w:rPr>
+        <w:t>Bali return ticket — already requested from Kristina; add to Evidence when received. Return date supplied is 10 October 2025.</w:t>
       </w:r>
     </w:p>
     <w:p>
+      <w:pPr>
+        <w:keepLines/>
+        <w:spacing w:after="70"/>
+        <w:ind w:left="317" w:hanging="259"/>
+      </w:pPr>
       <w:r>
-        <w:t>☐ Joint travel — December and June Bulgaria flight records have been reviewed. Add available accommodation details and photos where helpful. No extra December passenger record is requested: Scott confirmed both travelled and the booking is for two travellers.</w:t>
+        <w:rPr>
+          <w:rFonts w:ascii="Aptos" w:hAnsi="Aptos"/>
+          <w:b/>
+          <w:color w:val="9C4800"/>
+          <w:sz w:val="19"/>
+        </w:rPr>
+        <w:t xml:space="preserve">TO DO  </w:t>
+      </w:r>
+      <w:r>
+        <w:rPr>
+          <w:rFonts w:ascii="Aptos" w:hAnsi="Aptos"/>
+          <w:sz w:val="20"/>
+        </w:rPr>
+        <w:t>Joint travel — December and June Bulgaria flight records have been reviewed. Add available accommodation details and photos where helpful. No extra December passenger record is requested: Scott confirmed both travelled and the booking is for two travellers.</w:t>
       </w:r>
     </w:p>
     <w:p>
+      <w:pPr>
+        <w:keepLines/>
+        <w:spacing w:after="70"/>
+        <w:ind w:left="317" w:hanging="259"/>
+      </w:pPr>
       <w:r>
-        <w:t>☐ Contact during separation — select dated messages/call records from Bali and relevant other periods apart for the P1 item above.</w:t>
+        <w:rPr>
+          <w:rFonts w:ascii="Aptos" w:hAnsi="Aptos"/>
+          <w:b/>
+          <w:color w:val="9C4800"/>
+          <w:sz w:val="19"/>
+        </w:rPr>
+        <w:t xml:space="preserve">TO DO  </w:t>
+      </w:r>
+      <w:r>
+        <w:rPr>
+          <w:rFonts w:ascii="Aptos" w:hAnsi="Aptos"/>
+          <w:sz w:val="20"/>
+        </w:rPr>
+        <w:t>Contact during separation — select dated messages/call records from Bali and relevant other periods apart for the P1 item above.</w:t>
       </w:r>
     </w:p>
     <w:p>
+      <w:pPr>
+        <w:keepLines/>
+        <w:spacing w:after="70"/>
+        <w:ind w:left="317" w:hanging="259"/>
+      </w:pPr>
       <w:r>
-        <w:t>☐ Shared finances — retrieve statements and expense records for the P1 items above, showing names and date coverage from 24 September 2025 onward. Describe ING and the loans accurately as solely held, while explaining their household purpose.</w:t>
+        <w:rPr>
+          <w:rFonts w:ascii="Aptos" w:hAnsi="Aptos"/>
+          <w:b/>
+          <w:color w:val="1A703D"/>
+          <w:sz w:val="19"/>
+        </w:rPr>
+        <w:t xml:space="preserve">DONE  </w:t>
+      </w:r>
+      <w:r>
+        <w:rPr>
+          <w:rFonts w:ascii="Aptos" w:hAnsi="Aptos"/>
+          <w:sz w:val="20"/>
+        </w:rPr>
+        <w:t>Shared finances — CBA, 2Up and ING statements have been retrieved with relevant date coverage. ING and the loans remain accurately described as solely held. Upload and final submission selection are tracked above.</w:t>
       </w:r>
     </w:p>
     <w:p>
+      <w:pPr>
+        <w:keepLines/>
+        <w:spacing w:after="70"/>
+        <w:ind w:left="317" w:hanging="259"/>
+      </w:pPr>
       <w:r>
-        <w:t>☐ Legal commitments — locate both superannuation beneficiary nominations as support for the statement. Identify any other relevant commitments, if applicable.</w:t>
+        <w:rPr>
+          <w:rFonts w:ascii="Aptos" w:hAnsi="Aptos"/>
+          <w:b/>
+          <w:color w:val="9C4800"/>
+          <w:sz w:val="19"/>
+        </w:rPr>
+        <w:t xml:space="preserve">TO DO  </w:t>
+      </w:r>
+      <w:r>
+        <w:rPr>
+          <w:rFonts w:ascii="Aptos" w:hAnsi="Aptos"/>
+          <w:sz w:val="20"/>
+        </w:rPr>
+        <w:t>Legal commitments — locate both superannuation beneficiary nominations as support for the statement. Identify any other relevant commitments, if applicable.</w:t>
       </w:r>
     </w:p>
     <w:p>
+      <w:pPr>
+        <w:keepLines/>
+        <w:spacing w:after="70"/>
+        <w:ind w:left="317" w:hanging="259"/>
+      </w:pPr>
       <w:r>
-        <w:t>☐ Utilities — confirm which accounts exist and whose names appear; mark inapplicable categories for Affinity rather than assuming every utility is joint.</w:t>
+        <w:rPr>
+          <w:rFonts w:ascii="Aptos" w:hAnsi="Aptos"/>
+          <w:b/>
+          <w:color w:val="1A703D"/>
+          <w:sz w:val="19"/>
+        </w:rPr>
+        <w:t xml:space="preserve">DONE  </w:t>
+      </w:r>
+      <w:r>
+        <w:rPr>
+          <w:rFonts w:ascii="Aptos" w:hAnsi="Aptos"/>
+          <w:sz w:val="20"/>
+        </w:rPr>
+        <w:t>Utilities — electricity, internet and telephone bills reviewed are in Scott's name; water bills are addressed to the property owner or agent. Gas remains to be confirmed as applicable or not applicable. Do not describe these as jointly held accounts.</w:t>
       </w:r>
     </w:p>
     <w:p>
+      <w:pPr>
+        <w:keepLines/>
+        <w:spacing w:after="70"/>
+        <w:ind w:left="317" w:hanging="259"/>
+      </w:pPr>
       <w:r>
-        <w:t>☐ Urunga lease — if precise historic tenancy coverage is needed, clarify the scan’s ticked six-month term versus its written end date of 10 February 2025, and any continuation. The commencement date is confirmed as 11 November 2024.</w:t>
+        <w:rPr>
+          <w:rFonts w:ascii="Aptos" w:hAnsi="Aptos"/>
+          <w:b/>
+          <w:color w:val="9C4800"/>
+          <w:sz w:val="19"/>
+        </w:rPr>
+        <w:t xml:space="preserve">TO DO  </w:t>
+      </w:r>
+      <w:r>
+        <w:rPr>
+          <w:rFonts w:ascii="Aptos" w:hAnsi="Aptos"/>
+          <w:sz w:val="20"/>
+        </w:rPr>
+        <w:t>Urunga lease — if precise historic tenancy coverage is needed, clarify the scan’s ticked six-month term versus its written end date of 10 February 2025, and any continuation. The commencement date is confirmed as 11 November 2024.</w:t>
       </w:r>
     </w:p>
     <w:p>
+      <w:pPr>
+        <w:keepLines/>
+        <w:spacing w:after="70"/>
+        <w:ind w:left="317" w:hanging="259"/>
+      </w:pPr>
       <w:r>
-        <w:t>☐ Agency wording — confirm the “Subclass 729” reference means 820 and whether Kristina’s Bulgarian licence is wanted.</w:t>
+        <w:rPr>
+          <w:rFonts w:ascii="Aptos" w:hAnsi="Aptos"/>
+          <w:b/>
+          <w:color w:val="9C4800"/>
+          <w:sz w:val="19"/>
+        </w:rPr>
+        <w:t xml:space="preserve">TO DO  </w:t>
+      </w:r>
+      <w:r>
+        <w:rPr>
+          <w:rFonts w:ascii="Aptos" w:hAnsi="Aptos"/>
+          <w:sz w:val="20"/>
+        </w:rPr>
+        <w:t>Agency wording — confirm the “Subclass 729” reference means 820 and whether Kristina’s Bulgarian licence is wanted.</w:t>
       </w:r>
     </w:p>
     <w:p>
+      <w:pPr>
+        <w:keepLines/>
+        <w:spacing w:after="70"/>
+        <w:ind w:left="317" w:hanging="259"/>
+      </w:pPr>
       <w:r>
-        <w:t>☐ Wills — establish whether relevant existing wills are available; this is not a task to create new wills.</w:t>
+        <w:rPr>
+          <w:rFonts w:ascii="Aptos" w:hAnsi="Aptos"/>
+          <w:b/>
+          <w:color w:val="9C4800"/>
+          <w:sz w:val="19"/>
+        </w:rPr>
+        <w:t xml:space="preserve">TO DO  </w:t>
+      </w:r>
+      <w:r>
+        <w:rPr>
+          <w:rFonts w:ascii="Aptos" w:hAnsi="Aptos"/>
+          <w:sz w:val="20"/>
+        </w:rPr>
+        <w:t>Wills — establish whether relevant existing wills are available; this is not a task to create new wills.</w:t>
       </w:r>
     </w:p>
     <w:p>
+      <w:pPr>
+        <w:keepLines/>
+        <w:spacing w:after="70"/>
+        <w:ind w:left="317" w:hanging="259"/>
+      </w:pPr>
       <w:r>
-        <w:t>☐ Optional supporting records — locate course completion certificates, sanctuary contract/payslip, volunteering records and veterinary invoices/loan records where useful. These are supporting suggestions, not additional agency requirements.</w:t>
+        <w:rPr>
+          <w:rFonts w:ascii="Aptos" w:hAnsi="Aptos"/>
+          <w:b/>
+          <w:color w:val="9C4800"/>
+          <w:sz w:val="19"/>
+        </w:rPr>
+        <w:t xml:space="preserve">TO DO  </w:t>
+      </w:r>
+      <w:r>
+        <w:rPr>
+          <w:rFonts w:ascii="Aptos" w:hAnsi="Aptos"/>
+          <w:sz w:val="20"/>
+        </w:rPr>
+        <w:t>Optional supporting records — locate course completion certificates, sanctuary contract/payslip, volunteering records and veterinary invoices/loan records where useful. These are supporting suggestions, not additional agency requirements.</w:t>
       </w:r>
     </w:p>
     <w:p>
@@ -373,52 +2174,173 @@
         <w:pStyle w:val="Heading1"/>
       </w:pPr>
       <w:r>
+        <w:rPr>
+          <w:rFonts w:ascii="Aptos" w:hAnsi="Aptos"/>
+          <w:sz w:val="30"/>
+        </w:rPr>
         <w:t>Confirmed facts and evidence review notes</w:t>
       </w:r>
     </w:p>
     <w:p>
       <w:r>
-        <w:t>Resolved — Kristina’s full name is Kristina Aleksandrova Warren. Scott confirmed the missing “s” was an error in the earlier statement.</w:t>
+        <w:rPr>
+          <w:rFonts w:ascii="Aptos" w:hAnsi="Aptos"/>
+          <w:b/>
+          <w:color w:val="1A703D"/>
+          <w:sz w:val="20"/>
+        </w:rPr>
+        <w:t xml:space="preserve">Resolved  — </w:t>
+      </w:r>
+      <w:r>
+        <w:rPr>
+          <w:rFonts w:ascii="Aptos" w:hAnsi="Aptos"/>
+          <w:sz w:val="20"/>
+        </w:rPr>
+        <w:t>Kristina’s full name is Kristina Aleksandrova Warren. Scott confirmed the missing “s” was an error in the earlier statement.</w:t>
       </w:r>
     </w:p>
     <w:p>
       <w:r>
-        <w:t>Resolved — course titles are Certificate II and Certificate III in Exhibited Animal Care; completion months supplied are June 2025 and June 2026 respectively.</w:t>
+        <w:rPr>
+          <w:rFonts w:ascii="Aptos" w:hAnsi="Aptos"/>
+          <w:b/>
+          <w:color w:val="1A703D"/>
+          <w:sz w:val="20"/>
+        </w:rPr>
+        <w:t xml:space="preserve">Resolved  — </w:t>
+      </w:r>
+      <w:r>
+        <w:rPr>
+          <w:rFonts w:ascii="Aptos" w:hAnsi="Aptos"/>
+          <w:sz w:val="20"/>
+        </w:rPr>
+        <w:t>course titles are Certificate II and Certificate III in Exhibited Animal Care; completion months supplied are June 2025 and June 2026 respectively.</w:t>
       </w:r>
     </w:p>
     <w:p>
       <w:r>
-        <w:t>Resolved — CBA and 2Up accounts are joint. ING bills account, credit card, car loan and dog-surgery loan are in Scott’s name. Earnings, bill payments and the manual ING verification explanation are incorporated. Debt reduction from Kristina’s income remains tentative.</w:t>
+        <w:rPr>
+          <w:rFonts w:ascii="Aptos" w:hAnsi="Aptos"/>
+          <w:b/>
+          <w:color w:val="1A703D"/>
+          <w:sz w:val="20"/>
+        </w:rPr>
+        <w:t xml:space="preserve">Resolved  — </w:t>
+      </w:r>
+      <w:r>
+        <w:rPr>
+          <w:rFonts w:ascii="Aptos" w:hAnsi="Aptos"/>
+          <w:sz w:val="20"/>
+        </w:rPr>
+        <w:t>CBA and 2Up accounts are joint. ING bills account, credit card, car loan and dog-surgery loan are in Scott’s name. Earnings, bill payments and the manual ING verification explanation are incorporated. Debt reduction from Kristina’s income remains tentative.</w:t>
       </w:r>
     </w:p>
     <w:p>
       <w:r>
-        <w:t>Resolved — Urunga scan visually checked, pages 1–2: agreement made 8 November 2024; commencement 11 November 2024; Kristina and Scott named; address 28 Fitzroy Street, Urunga. The form ticks “6 months” but writes an end date of 10 February 2025. If Affinity needs precise historic tenancy coverage, clarify this inconsistency and any continuation; it does not alter the verified commencement date. The scan alone does not establish the actual move-out date.</w:t>
+        <w:rPr>
+          <w:rFonts w:ascii="Aptos" w:hAnsi="Aptos"/>
+          <w:b/>
+          <w:color w:val="1A703D"/>
+          <w:sz w:val="20"/>
+        </w:rPr>
+        <w:t xml:space="preserve">Resolved  — </w:t>
+      </w:r>
+      <w:r>
+        <w:rPr>
+          <w:rFonts w:ascii="Aptos" w:hAnsi="Aptos"/>
+          <w:sz w:val="20"/>
+        </w:rPr>
+        <w:t>Urunga scan visually checked, pages 1–2: agreement made 8 November 2024; commencement 11 November 2024; Kristina and Scott named; address 28 Fitzroy Street, Urunga. The form ticks “6 months” but writes an end date of 10 February 2025. If Affinity needs precise historic tenancy coverage, clarify this inconsistency and any continuation; it does not alter the verified commencement date. The scan alone does not establish the actual move-out date.</w:t>
       </w:r>
     </w:p>
     <w:p>
       <w:r>
-        <w:t>Resolved — Coffs lease text names both parties, commencing 28 July 2025 and ending 26 July 2026. Renewal runs 27 July 2026–25 January 2027. Scott accepted these dates. Signature images have not been independently authenticated.</w:t>
+        <w:rPr>
+          <w:rFonts w:ascii="Aptos" w:hAnsi="Aptos"/>
+          <w:b/>
+          <w:color w:val="1A703D"/>
+          <w:sz w:val="20"/>
+        </w:rPr>
+        <w:t xml:space="preserve">Resolved  — </w:t>
+      </w:r>
+      <w:r>
+        <w:rPr>
+          <w:rFonts w:ascii="Aptos" w:hAnsi="Aptos"/>
+          <w:sz w:val="20"/>
+        </w:rPr>
+        <w:t>Coffs lease text names both parties, commencing 28 July 2025 and ending 26 July 2026. Renewal runs 27 July 2026–25 January 2027. Scott accepted these dates. Signature images have not been independently authenticated.</w:t>
       </w:r>
     </w:p>
     <w:p>
       <w:r>
-        <w:t>Resolved — Bulgaria Christmas trip: depart 11 December 2025; return departure 6 January 2026; arrival Australia 8 January. Booking for two travellers reviewed; Scott confirms both travelled.</w:t>
+        <w:rPr>
+          <w:rFonts w:ascii="Aptos" w:hAnsi="Aptos"/>
+          <w:b/>
+          <w:color w:val="1A703D"/>
+          <w:sz w:val="20"/>
+        </w:rPr>
+        <w:t xml:space="preserve">Resolved  — </w:t>
+      </w:r>
+      <w:r>
+        <w:rPr>
+          <w:rFonts w:ascii="Aptos" w:hAnsi="Aptos"/>
+          <w:sz w:val="20"/>
+        </w:rPr>
+        <w:t>Bulgaria Christmas trip: depart 11 December 2025; return departure 6 January 2026; arrival Australia 8 January. Booking for two travellers reviewed; Scott confirms both travelled.</w:t>
       </w:r>
     </w:p>
     <w:p>
       <w:r>
-        <w:t>Resolved — Bulgaria June trip: depart 3 June 2026; return departure 16 June; arrival Australia 18 June. Separate tickets for Scott and Kristina show matching itineraries.</w:t>
+        <w:rPr>
+          <w:rFonts w:ascii="Aptos" w:hAnsi="Aptos"/>
+          <w:b/>
+          <w:color w:val="1A703D"/>
+          <w:sz w:val="20"/>
+        </w:rPr>
+        <w:t xml:space="preserve">Resolved  — </w:t>
+      </w:r>
+      <w:r>
+        <w:rPr>
+          <w:rFonts w:ascii="Aptos" w:hAnsi="Aptos"/>
+          <w:sz w:val="20"/>
+        </w:rPr>
+        <w:t>Bulgaria June trip: depart 3 June 2026; return departure 16 June; arrival Australia 18 June. Separate tickets for Scott and Kristina show matching itineraries.</w:t>
       </w:r>
     </w:p>
     <w:p>
       <w:r>
-        <w:t>Resolved — Bali outbound ticket names Kristina and departs 30 September 2025. Return evidence is the pending item above.</w:t>
+        <w:rPr>
+          <w:rFonts w:ascii="Aptos" w:hAnsi="Aptos"/>
+          <w:b/>
+          <w:color w:val="1A703D"/>
+          <w:sz w:val="20"/>
+        </w:rPr>
+        <w:t xml:space="preserve">Resolved  — </w:t>
+      </w:r>
+      <w:r>
+        <w:rPr>
+          <w:rFonts w:ascii="Aptos" w:hAnsi="Aptos"/>
+          <w:sz w:val="20"/>
+        </w:rPr>
+        <w:t>Bali outbound ticket names Kristina and departs 30 September 2025. Return evidence is the pending item above.</w:t>
       </w:r>
     </w:p>
     <w:p>
       <w:r>
-        <w:t>Resolved — England wedding did not proceed and is removed. Christmas 2024 is clearly earlier context. Current plans for Sydney, a home in 3–4 years and ongoing conversations about children are incorporated. The superannuation home-deposit wording records your intention, not an eligibility assessment.</w:t>
+        <w:rPr>
+          <w:rFonts w:ascii="Aptos" w:hAnsi="Aptos"/>
+          <w:b/>
+          <w:color w:val="1A703D"/>
+          <w:sz w:val="20"/>
+        </w:rPr>
+        <w:t xml:space="preserve">Resolved  — </w:t>
+      </w:r>
+      <w:r>
+        <w:rPr>
+          <w:rFonts w:ascii="Aptos" w:hAnsi="Aptos"/>
+          <w:sz w:val="20"/>
+        </w:rPr>
+        <w:t>England wedding did not proceed and is removed. Christmas 2024 is clearly earlier context. Current plans for Sydney, a home in 3–4 years and ongoing conversations about children are incorporated. The superannuation home-deposit wording records your intention, not an eligibility assessment.</w:t>
       </w:r>
     </w:p>
     <w:p>
@@ -426,27 +2348,84 @@
         <w:pStyle w:val="Heading1"/>
       </w:pPr>
       <w:r>
+        <w:rPr>
+          <w:rFonts w:ascii="Aptos" w:hAnsi="Aptos"/>
+          <w:sz w:val="30"/>
+        </w:rPr>
         <w:t>Google Drive locations</w:t>
       </w:r>
     </w:p>
     <w:p>
       <w:r>
+        <w:rPr>
+          <w:rFonts w:ascii="Aptos" w:hAnsi="Aptos"/>
+          <w:sz w:val="18"/>
+        </w:rPr>
         <w:t>801 folder: https://drive.google.com/drive/folders/1TqTOs7YFusDDNUx9Hi2hvIfhLk-jjIcf</w:t>
       </w:r>
     </w:p>
     <w:p>
       <w:r>
+        <w:rPr>
+          <w:rFonts w:ascii="Aptos" w:hAnsi="Aptos"/>
+          <w:sz w:val="18"/>
+        </w:rPr>
         <w:t>Evidence: https://drive.google.com/drive/folders/1d6kPQaE1jGMlzulPnLN-c39FCOExcCFY</w:t>
       </w:r>
     </w:p>
     <w:sectPr>
-      <w:pgSz w:w="11909" w:h="16834"/>
-      <w:pgMar w:top="1008" w:right="1152" w:bottom="1008" w:left="1152" w:header="720" w:footer="720" w:gutter="0"/>
+      <w:headerReference w:type="default" r:id="rId9"/>
+      <w:footerReference w:type="default" r:id="rId10"/>
+      <w:pgSz w:w="12240" w:h="15840"/>
+      <w:pgMar w:top="936" w:right="1037" w:bottom="864" w:left="1037" w:header="720" w:footer="720" w:gutter="0"/>
       <w:cols w:space="720"/>
       <w:docGrid w:linePitch="360"/>
     </w:sectPr>
   </w:body>
 </w:document>
+</file>
+
+<file path=word/footer1.xml><?xml version="1.0" encoding="utf-8"?>
+<w:ftr xmlns:m="http://schemas.openxmlformats.org/officeDocument/2006/math" xmlns:mc="http://schemas.openxmlformats.org/markup-compatibility/2006" xmlns:mo="http://schemas.microsoft.com/office/mac/office/2008/main" xmlns:mv="urn:schemas-microsoft-com:mac:vml" xmlns:o="urn:schemas-microsoft-com:office:office" xmlns:r="http://schemas.openxmlformats.org/officeDocument/2006/relationships" xmlns:v="urn:schemas-microsoft-com:vml" xmlns:w10="urn:schemas-microsoft-com:office:word" xmlns:w14="http://schemas.microsoft.com/office/word/2010/wordml" xmlns:w="http://schemas.openxmlformats.org/wordprocessingml/2006/main" xmlns:wne="http://schemas.microsoft.com/office/word/2006/wordml" xmlns:wp14="http://schemas.microsoft.com/office/word/2010/wordprocessingDrawing" xmlns:wp="http://schemas.openxmlformats.org/drawingml/2006/wordprocessingDrawing" xmlns:wpc="http://schemas.microsoft.com/office/word/2010/wordprocessingCanvas" xmlns:wpg="http://schemas.microsoft.com/office/word/2010/wordprocessingGroup" xmlns:wpi="http://schemas.microsoft.com/office/word/2010/wordprocessingInk" xmlns:wps="http://schemas.microsoft.com/office/word/2010/wordprocessingShape" mc:Ignorable="w14 wp14">
+  <w:p>
+    <w:pPr>
+      <w:pStyle w:val="Footer"/>
+      <w:jc w:val="right"/>
+    </w:pPr>
+    <w:r>
+      <w:rPr>
+        <w:rFonts w:ascii="Aptos" w:hAnsi="Aptos"/>
+        <w:color w:val="5A5A5A"/>
+        <w:sz w:val="18"/>
+      </w:rPr>
+      <w:t xml:space="preserve">Page </w:t>
+      <w:fldChar w:fldCharType="begin"/>
+      <w:instrText xml:space="preserve"> PAGE </w:instrText>
+      <w:fldChar w:fldCharType="separate"/>
+      <w:t>1</w:t>
+      <w:fldChar w:fldCharType="end"/>
+    </w:r>
+  </w:p>
+</w:ftr>
+</file>
+
+<file path=word/header1.xml><?xml version="1.0" encoding="utf-8"?>
+<w:hdr xmlns:m="http://schemas.openxmlformats.org/officeDocument/2006/math" xmlns:mc="http://schemas.openxmlformats.org/markup-compatibility/2006" xmlns:mo="http://schemas.microsoft.com/office/mac/office/2008/main" xmlns:mv="urn:schemas-microsoft-com:mac:vml" xmlns:o="urn:schemas-microsoft-com:office:office" xmlns:r="http://schemas.openxmlformats.org/officeDocument/2006/relationships" xmlns:v="urn:schemas-microsoft-com:vml" xmlns:w10="urn:schemas-microsoft-com:office:word" xmlns:w14="http://schemas.microsoft.com/office/word/2010/wordml" xmlns:w="http://schemas.openxmlformats.org/wordprocessingml/2006/main" xmlns:wne="http://schemas.microsoft.com/office/word/2006/wordml" xmlns:wp14="http://schemas.microsoft.com/office/word/2010/wordprocessingDrawing" xmlns:wp="http://schemas.openxmlformats.org/drawingml/2006/wordprocessingDrawing" xmlns:wpc="http://schemas.microsoft.com/office/word/2010/wordprocessingCanvas" xmlns:wpg="http://schemas.microsoft.com/office/word/2010/wordprocessingGroup" xmlns:wpi="http://schemas.microsoft.com/office/word/2010/wordprocessingInk" xmlns:wps="http://schemas.microsoft.com/office/word/2010/wordprocessingShape" mc:Ignorable="w14 wp14">
+  <w:p>
+    <w:pPr>
+      <w:pStyle w:val="Header"/>
+      <w:jc w:val="right"/>
+    </w:pPr>
+    <w:r>
+      <w:rPr>
+        <w:rFonts w:ascii="Aptos" w:hAnsi="Aptos"/>
+        <w:color w:val="5A5A5A"/>
+        <w:sz w:val="17"/>
+      </w:rPr>
+      <w:t>Visa 801 document status    Client reference WaKr-2631-801-3</w:t>
+    </w:r>
+  </w:p>
+</w:hdr>
 </file>
 
 <file path=word/numbering.xml><?xml version="1.0" encoding="utf-8"?>
@@ -813,11 +2792,10 @@
     <w:qFormat/>
     <w:rsid w:val="00FC693F"/>
     <w:pPr>
-      <w:spacing w:after="120"/>
+      <w:spacing w:after="100" w:line="259" w:lineRule="auto"/>
     </w:pPr>
     <w:rPr>
-      <w:rFonts w:ascii="Arial" w:hAnsi="Arial"/>
-      <w:color w:val="000000"/>
+      <w:rFonts w:ascii="Aptos" w:hAnsi="Aptos"/>
       <w:sz w:val="21"/>
     </w:rPr>
   </w:style>
@@ -876,15 +2854,15 @@
     <w:pPr>
       <w:keepNext/>
       <w:keepLines/>
-      <w:spacing w:before="480" w:after="0"/>
+      <w:spacing w:before="280" w:after="120"/>
       <w:outlineLvl w:val="0"/>
     </w:pPr>
     <w:rPr>
-      <w:rFonts w:asciiTheme="majorHAnsi" w:eastAsiaTheme="majorEastAsia" w:hAnsiTheme="majorHAnsi" w:cstheme="majorBidi" w:ascii="Arial" w:hAnsi="Arial"/>
+      <w:rFonts w:asciiTheme="majorHAnsi" w:eastAsiaTheme="majorEastAsia" w:hAnsiTheme="majorHAnsi" w:cstheme="majorBidi" w:ascii="Aptos Display" w:hAnsi="Aptos Display"/>
       <w:b/>
       <w:bCs/>
       <w:color w:val="000000"/>
-      <w:sz w:val="28"/>
+      <w:sz w:val="30"/>
       <w:szCs w:val="28"/>
     </w:rPr>
   </w:style>
@@ -900,15 +2878,15 @@
     <w:pPr>
       <w:keepNext/>
       <w:keepLines/>
-      <w:spacing w:before="200" w:after="0"/>
+      <w:spacing w:before="200" w:after="80"/>
       <w:outlineLvl w:val="1"/>
     </w:pPr>
     <w:rPr>
-      <w:rFonts w:asciiTheme="majorHAnsi" w:eastAsiaTheme="majorEastAsia" w:hAnsiTheme="majorHAnsi" w:cstheme="majorBidi"/>
+      <w:rFonts w:asciiTheme="majorHAnsi" w:eastAsiaTheme="majorEastAsia" w:hAnsiTheme="majorHAnsi" w:cstheme="majorBidi" w:ascii="Aptos Display" w:hAnsi="Aptos Display"/>
       <w:b/>
       <w:bCs/>
-      <w:color w:val="4F81BD" w:themeColor="accent1"/>
-      <w:sz w:val="26"/>
+      <w:color w:val="000000"/>
+      <w:sz w:val="24"/>
       <w:szCs w:val="26"/>
     </w:rPr>
   </w:style>
@@ -924,14 +2902,15 @@
     <w:pPr>
       <w:keepNext/>
       <w:keepLines/>
-      <w:spacing w:before="200" w:after="0"/>
+      <w:spacing w:before="160" w:after="60"/>
       <w:outlineLvl w:val="2"/>
     </w:pPr>
     <w:rPr>
-      <w:rFonts w:asciiTheme="majorHAnsi" w:eastAsiaTheme="majorEastAsia" w:hAnsiTheme="majorHAnsi" w:cstheme="majorBidi"/>
+      <w:rFonts w:asciiTheme="majorHAnsi" w:eastAsiaTheme="majorEastAsia" w:hAnsiTheme="majorHAnsi" w:cstheme="majorBidi" w:ascii="Aptos Display" w:hAnsi="Aptos Display"/>
       <w:b/>
       <w:bCs/>
-      <w:color w:val="4F81BD" w:themeColor="accent1"/>
+      <w:color w:val="000000"/>
+      <w:sz w:val="22"/>
     </w:rPr>
   </w:style>
   <w:style w:type="paragraph" w:styleId="Heading4">
@@ -1162,15 +3141,19 @@
     <w:qFormat/>
     <w:rsid w:val="00FC693F"/>
     <w:pPr>
-      <w:spacing w:after="300" w:line="240" w:lineRule="auto"/>
+      <w:pBdr>
+        <w:bottom w:val="single" w:sz="8" w:space="4" w:color="4F81BD" w:themeColor="accent1"/>
+      </w:pBdr>
+      <w:spacing w:after="240" w:line="240" w:lineRule="auto"/>
       <w:contextualSpacing/>
     </w:pPr>
     <w:rPr>
-      <w:rFonts w:asciiTheme="majorHAnsi" w:eastAsiaTheme="majorEastAsia" w:hAnsiTheme="majorHAnsi" w:cstheme="majorBidi" w:ascii="Arial" w:hAnsi="Arial"/>
+      <w:rFonts w:asciiTheme="majorHAnsi" w:eastAsiaTheme="majorEastAsia" w:hAnsiTheme="majorHAnsi" w:cstheme="majorBidi" w:ascii="Aptos Display" w:hAnsi="Aptos Display"/>
+      <w:b/>
       <w:color w:val="000000"/>
       <w:spacing w:val="5"/>
       <w:kern w:val="28"/>
-      <w:sz w:val="52"/>
+      <w:sz w:val="46"/>
       <w:szCs w:val="52"/>
     </w:rPr>
   </w:style>

</xml_diff>

<commit_message>
vault backup: 2026-10-18 07:11:28
</commit_message>
<xml_diff>
--- a/Visa/801 - Permanent Residency/Prepared Documents/Visa 801 Document Checklist.docx
+++ b/Visa/801 - Permanent Residency/Prepared Documents/Visa 801 Document Checklist.docx
@@ -60,7 +60,7 @@
     </w:p>
     <w:p>
       <w:pPr>
-        <w:keepLines/>
+        <w:keepLines w:val="0"/>
         <w:spacing w:after="70"/>
         <w:ind w:left="317" w:hanging="259"/>
       </w:pPr>
@@ -92,7 +92,7 @@
     </w:p>
     <w:p>
       <w:pPr>
-        <w:keepLines/>
+        <w:keepLines w:val="0"/>
         <w:spacing w:after="70"/>
         <w:ind w:left="317" w:hanging="259"/>
       </w:pPr>
@@ -124,7 +124,7 @@
     </w:p>
     <w:p>
       <w:pPr>
-        <w:keepLines/>
+        <w:keepLines w:val="0"/>
         <w:spacing w:after="70"/>
         <w:ind w:left="317" w:hanging="259"/>
       </w:pPr>
@@ -156,7 +156,7 @@
     </w:p>
     <w:p>
       <w:pPr>
-        <w:keepLines/>
+        <w:keepLines w:val="0"/>
         <w:spacing w:after="70"/>
         <w:ind w:left="317" w:hanging="259"/>
       </w:pPr>
@@ -188,7 +188,7 @@
     </w:p>
     <w:p>
       <w:pPr>
-        <w:keepLines/>
+        <w:keepLines w:val="0"/>
         <w:spacing w:after="70"/>
         <w:ind w:left="317" w:hanging="259"/>
       </w:pPr>
@@ -220,7 +220,7 @@
     </w:p>
     <w:p>
       <w:pPr>
-        <w:keepLines/>
+        <w:keepLines w:val="0"/>
         <w:spacing w:after="70"/>
         <w:ind w:left="317" w:hanging="259"/>
       </w:pPr>
@@ -252,7 +252,7 @@
     </w:p>
     <w:p>
       <w:pPr>
-        <w:keepLines/>
+        <w:keepLines w:val="0"/>
         <w:spacing w:after="70"/>
         <w:ind w:left="317" w:hanging="259"/>
       </w:pPr>
@@ -284,7 +284,7 @@
     </w:p>
     <w:p>
       <w:pPr>
-        <w:keepLines/>
+        <w:keepLines w:val="0"/>
         <w:spacing w:after="70"/>
         <w:ind w:left="317" w:hanging="259"/>
       </w:pPr>
@@ -316,7 +316,7 @@
     </w:p>
     <w:p>
       <w:pPr>
-        <w:keepLines/>
+        <w:keepLines w:val="0"/>
         <w:spacing w:after="70"/>
         <w:ind w:left="317" w:hanging="259"/>
       </w:pPr>
@@ -360,7 +360,7 @@
     </w:p>
     <w:p>
       <w:pPr>
-        <w:keepLines/>
+        <w:keepLines w:val="0"/>
         <w:spacing w:after="70"/>
         <w:ind w:left="317" w:hanging="259"/>
       </w:pPr>
@@ -397,7 +397,7 @@
     </w:p>
     <w:p>
       <w:pPr>
-        <w:keepLines/>
+        <w:keepLines w:val="0"/>
         <w:spacing w:after="70"/>
         <w:ind w:left="317" w:hanging="259"/>
       </w:pPr>
@@ -420,7 +420,7 @@
     </w:p>
     <w:p>
       <w:pPr>
-        <w:keepLines/>
+        <w:keepLines w:val="0"/>
         <w:spacing w:after="70"/>
         <w:ind w:left="317" w:hanging="259"/>
       </w:pPr>
@@ -443,7 +443,7 @@
     </w:p>
     <w:p>
       <w:pPr>
-        <w:keepLines/>
+        <w:keepLines w:val="0"/>
         <w:spacing w:after="70"/>
         <w:ind w:left="317" w:hanging="259"/>
       </w:pPr>
@@ -466,7 +466,7 @@
     </w:p>
     <w:p>
       <w:pPr>
-        <w:keepLines/>
+        <w:keepLines w:val="0"/>
         <w:spacing w:after="70"/>
         <w:ind w:left="317" w:hanging="259"/>
       </w:pPr>
@@ -489,7 +489,7 @@
     </w:p>
     <w:p>
       <w:pPr>
-        <w:keepLines/>
+        <w:keepLines w:val="0"/>
         <w:spacing w:after="70"/>
         <w:ind w:left="317" w:hanging="259"/>
       </w:pPr>
@@ -512,7 +512,7 @@
     </w:p>
     <w:p>
       <w:pPr>
-        <w:keepLines/>
+        <w:keepLines w:val="0"/>
         <w:spacing w:after="70"/>
         <w:ind w:left="317" w:hanging="259"/>
       </w:pPr>
@@ -535,7 +535,7 @@
     </w:p>
     <w:p>
       <w:pPr>
-        <w:keepLines/>
+        <w:keepLines w:val="0"/>
         <w:spacing w:after="70"/>
         <w:ind w:left="317" w:hanging="259"/>
       </w:pPr>
@@ -558,7 +558,7 @@
     </w:p>
     <w:p>
       <w:pPr>
-        <w:keepLines/>
+        <w:keepLines w:val="0"/>
         <w:spacing w:after="70"/>
         <w:ind w:left="317" w:hanging="259"/>
       </w:pPr>
@@ -581,7 +581,7 @@
     </w:p>
     <w:p>
       <w:pPr>
-        <w:keepLines/>
+        <w:keepLines w:val="0"/>
         <w:spacing w:after="70"/>
         <w:ind w:left="317" w:hanging="259"/>
       </w:pPr>
@@ -616,7 +616,7 @@
     </w:p>
     <w:p>
       <w:pPr>
-        <w:keepLines/>
+        <w:keepLines w:val="0"/>
         <w:spacing w:after="70"/>
         <w:ind w:left="317" w:hanging="259"/>
       </w:pPr>
@@ -639,7 +639,7 @@
     </w:p>
     <w:p>
       <w:pPr>
-        <w:keepLines/>
+        <w:keepLines w:val="0"/>
         <w:spacing w:after="70"/>
         <w:ind w:left="317" w:hanging="259"/>
       </w:pPr>
@@ -662,7 +662,7 @@
     </w:p>
     <w:p>
       <w:pPr>
-        <w:keepLines/>
+        <w:keepLines w:val="0"/>
         <w:spacing w:after="70"/>
         <w:ind w:left="706" w:hanging="259"/>
       </w:pPr>
@@ -685,7 +685,7 @@
     </w:p>
     <w:p>
       <w:pPr>
-        <w:keepLines/>
+        <w:keepLines w:val="0"/>
         <w:spacing w:after="70"/>
         <w:ind w:left="317" w:hanging="259"/>
       </w:pPr>
@@ -708,7 +708,7 @@
     </w:p>
     <w:p>
       <w:pPr>
-        <w:keepLines/>
+        <w:keepLines w:val="0"/>
         <w:spacing w:after="70"/>
         <w:ind w:left="706" w:hanging="259"/>
       </w:pPr>
@@ -731,7 +731,7 @@
     </w:p>
     <w:p>
       <w:pPr>
-        <w:keepLines/>
+        <w:keepLines w:val="0"/>
         <w:spacing w:after="70"/>
         <w:ind w:left="706" w:hanging="259"/>
       </w:pPr>
@@ -754,7 +754,7 @@
     </w:p>
     <w:p>
       <w:pPr>
-        <w:keepLines/>
+        <w:keepLines w:val="0"/>
         <w:spacing w:after="70"/>
         <w:ind w:left="317" w:hanging="259"/>
       </w:pPr>
@@ -777,7 +777,7 @@
     </w:p>
     <w:p>
       <w:pPr>
-        <w:keepLines/>
+        <w:keepLines w:val="0"/>
         <w:spacing w:after="70"/>
         <w:ind w:left="706" w:hanging="259"/>
       </w:pPr>
@@ -800,7 +800,7 @@
     </w:p>
     <w:p>
       <w:pPr>
-        <w:keepLines/>
+        <w:keepLines w:val="0"/>
         <w:spacing w:after="70"/>
         <w:ind w:left="317" w:hanging="259"/>
       </w:pPr>
@@ -823,7 +823,7 @@
     </w:p>
     <w:p>
       <w:pPr>
-        <w:keepLines/>
+        <w:keepLines w:val="0"/>
         <w:spacing w:after="70"/>
         <w:ind w:left="317" w:hanging="259"/>
       </w:pPr>
@@ -859,7 +859,7 @@
     </w:p>
     <w:p>
       <w:pPr>
-        <w:keepLines/>
+        <w:keepLines w:val="0"/>
         <w:spacing w:after="70"/>
         <w:ind w:left="317" w:hanging="259"/>
       </w:pPr>
@@ -891,7 +891,7 @@
     </w:p>
     <w:p>
       <w:pPr>
-        <w:keepLines/>
+        <w:keepLines w:val="0"/>
         <w:spacing w:after="70"/>
         <w:ind w:left="317" w:hanging="259"/>
       </w:pPr>
@@ -915,7 +915,7 @@
     </w:p>
     <w:p>
       <w:pPr>
-        <w:keepLines/>
+        <w:keepLines w:val="0"/>
         <w:spacing w:after="70"/>
         <w:ind w:left="317" w:hanging="259"/>
       </w:pPr>
@@ -947,7 +947,7 @@
     </w:p>
     <w:p>
       <w:pPr>
-        <w:keepLines/>
+        <w:keepLines w:val="0"/>
         <w:spacing w:after="70"/>
         <w:ind w:left="317" w:hanging="259"/>
       </w:pPr>
@@ -979,7 +979,7 @@
     </w:p>
     <w:p>
       <w:pPr>
-        <w:keepLines/>
+        <w:keepLines w:val="0"/>
         <w:spacing w:after="70"/>
         <w:ind w:left="706" w:hanging="259"/>
       </w:pPr>
@@ -1002,7 +1002,7 @@
     </w:p>
     <w:p>
       <w:pPr>
-        <w:keepLines/>
+        <w:keepLines w:val="0"/>
         <w:spacing w:after="70"/>
         <w:ind w:left="317" w:hanging="259"/>
       </w:pPr>
@@ -1033,7 +1033,7 @@
     </w:p>
     <w:p>
       <w:pPr>
-        <w:keepLines/>
+        <w:keepLines w:val="0"/>
         <w:spacing w:after="70"/>
         <w:ind w:left="706" w:hanging="259"/>
       </w:pPr>
@@ -1056,7 +1056,7 @@
     </w:p>
     <w:p>
       <w:pPr>
-        <w:keepLines/>
+        <w:keepLines w:val="0"/>
         <w:spacing w:after="70"/>
         <w:ind w:left="706" w:hanging="259"/>
       </w:pPr>
@@ -1079,7 +1079,7 @@
     </w:p>
     <w:p>
       <w:pPr>
-        <w:keepLines/>
+        <w:keepLines w:val="0"/>
         <w:spacing w:after="70"/>
         <w:ind w:left="706" w:hanging="259"/>
       </w:pPr>
@@ -1102,7 +1102,7 @@
     </w:p>
     <w:p>
       <w:pPr>
-        <w:keepLines/>
+        <w:keepLines w:val="0"/>
         <w:spacing w:after="70"/>
         <w:ind w:left="317" w:hanging="259"/>
       </w:pPr>
@@ -1134,7 +1134,7 @@
     </w:p>
     <w:p>
       <w:pPr>
-        <w:keepLines/>
+        <w:keepLines w:val="0"/>
         <w:spacing w:after="70"/>
         <w:ind w:left="317" w:hanging="259"/>
       </w:pPr>
@@ -1165,7 +1165,8 @@
     </w:p>
     <w:p>
       <w:pPr>
-        <w:keepLines/>
+        <w:keepNext/>
+        <w:keepLines w:val="0"/>
         <w:spacing w:after="70"/>
         <w:ind w:left="317" w:hanging="259"/>
       </w:pPr>
@@ -1188,7 +1189,8 @@
     </w:p>
     <w:p>
       <w:pPr>
-        <w:keepLines/>
+        <w:keepNext/>
+        <w:keepLines w:val="0"/>
         <w:spacing w:after="70"/>
         <w:ind w:left="706" w:hanging="259"/>
       </w:pPr>
@@ -1211,7 +1213,7 @@
     </w:p>
     <w:p>
       <w:pPr>
-        <w:keepLines/>
+        <w:keepLines w:val="0"/>
         <w:spacing w:after="70"/>
         <w:ind w:left="706" w:hanging="259"/>
       </w:pPr>
@@ -1234,7 +1236,7 @@
     </w:p>
     <w:p>
       <w:pPr>
-        <w:keepLines/>
+        <w:keepLines w:val="0"/>
         <w:spacing w:after="70"/>
         <w:ind w:left="317" w:hanging="259"/>
       </w:pPr>
@@ -1266,7 +1268,7 @@
     </w:p>
     <w:p>
       <w:pPr>
-        <w:keepLines/>
+        <w:keepLines w:val="0"/>
         <w:spacing w:after="70"/>
         <w:ind w:left="706" w:hanging="259"/>
       </w:pPr>
@@ -1289,7 +1291,7 @@
     </w:p>
     <w:p>
       <w:pPr>
-        <w:keepLines/>
+        <w:keepLines w:val="0"/>
         <w:spacing w:after="70"/>
         <w:ind w:left="706" w:hanging="259"/>
       </w:pPr>
@@ -1312,7 +1314,7 @@
     </w:p>
     <w:p>
       <w:pPr>
-        <w:keepLines/>
+        <w:keepLines w:val="0"/>
         <w:spacing w:after="70"/>
         <w:ind w:left="706" w:hanging="259"/>
       </w:pPr>
@@ -1335,7 +1337,7 @@
     </w:p>
     <w:p>
       <w:pPr>
-        <w:keepLines/>
+        <w:keepLines w:val="0"/>
         <w:spacing w:after="70"/>
         <w:ind w:left="706" w:hanging="259"/>
       </w:pPr>
@@ -1358,7 +1360,7 @@
     </w:p>
     <w:p>
       <w:pPr>
-        <w:keepLines/>
+        <w:keepLines w:val="0"/>
         <w:spacing w:after="70"/>
         <w:ind w:left="706" w:hanging="259"/>
       </w:pPr>
@@ -1381,7 +1383,7 @@
     </w:p>
     <w:p>
       <w:pPr>
-        <w:keepLines/>
+        <w:keepLines w:val="0"/>
         <w:spacing w:after="70"/>
         <w:ind w:left="317" w:hanging="259"/>
       </w:pPr>
@@ -1405,7 +1407,7 @@
     </w:p>
     <w:p>
       <w:pPr>
-        <w:keepLines/>
+        <w:keepLines w:val="0"/>
         <w:spacing w:after="70"/>
         <w:ind w:left="317" w:hanging="259"/>
       </w:pPr>
@@ -1428,7 +1430,7 @@
     </w:p>
     <w:p>
       <w:pPr>
-        <w:keepLines/>
+        <w:keepLines w:val="0"/>
         <w:spacing w:after="70"/>
         <w:ind w:left="317" w:hanging="259"/>
       </w:pPr>
@@ -1459,7 +1461,7 @@
     </w:p>
     <w:p>
       <w:pPr>
-        <w:keepLines/>
+        <w:keepLines w:val="0"/>
         <w:spacing w:after="70"/>
         <w:ind w:left="317" w:hanging="259"/>
       </w:pPr>
@@ -1483,7 +1485,7 @@
     </w:p>
     <w:p>
       <w:pPr>
-        <w:keepLines/>
+        <w:keepLines w:val="0"/>
         <w:spacing w:after="70"/>
         <w:ind w:left="317" w:hanging="259"/>
       </w:pPr>
@@ -1507,7 +1509,7 @@
     </w:p>
     <w:p>
       <w:pPr>
-        <w:keepLines/>
+        <w:keepLines w:val="0"/>
         <w:spacing w:after="70"/>
         <w:ind w:left="706" w:hanging="259"/>
       </w:pPr>
@@ -1542,7 +1544,7 @@
     </w:p>
     <w:p>
       <w:pPr>
-        <w:keepLines/>
+        <w:keepLines w:val="0"/>
         <w:spacing w:after="70"/>
         <w:ind w:left="706" w:hanging="259"/>
       </w:pPr>
@@ -1565,7 +1567,7 @@
     </w:p>
     <w:p>
       <w:pPr>
-        <w:keepLines/>
+        <w:keepLines w:val="0"/>
         <w:spacing w:after="70"/>
         <w:ind w:left="317" w:hanging="259"/>
       </w:pPr>
@@ -1588,7 +1590,7 @@
     </w:p>
     <w:p>
       <w:pPr>
-        <w:keepLines/>
+        <w:keepLines w:val="0"/>
         <w:spacing w:after="70"/>
         <w:ind w:left="317" w:hanging="259"/>
       </w:pPr>
@@ -1623,7 +1625,7 @@
     </w:p>
     <w:p>
       <w:pPr>
-        <w:keepLines/>
+        <w:keepLines w:val="0"/>
         <w:spacing w:after="70"/>
         <w:ind w:left="317" w:hanging="259"/>
       </w:pPr>
@@ -1646,7 +1648,7 @@
     </w:p>
     <w:p>
       <w:pPr>
-        <w:keepLines/>
+        <w:keepLines w:val="0"/>
         <w:spacing w:after="70"/>
         <w:ind w:left="706" w:hanging="259"/>
       </w:pPr>
@@ -1669,7 +1671,7 @@
     </w:p>
     <w:p>
       <w:pPr>
-        <w:keepLines/>
+        <w:keepLines w:val="0"/>
         <w:spacing w:after="70"/>
         <w:ind w:left="317" w:hanging="259"/>
       </w:pPr>
@@ -1692,7 +1694,7 @@
     </w:p>
     <w:p>
       <w:pPr>
-        <w:keepLines/>
+        <w:keepLines w:val="0"/>
         <w:spacing w:after="70"/>
         <w:ind w:left="706" w:hanging="259"/>
       </w:pPr>
@@ -1715,7 +1717,7 @@
     </w:p>
     <w:p>
       <w:pPr>
-        <w:keepLines/>
+        <w:keepLines w:val="0"/>
         <w:spacing w:after="70"/>
         <w:ind w:left="317" w:hanging="259"/>
       </w:pPr>
@@ -1738,7 +1740,7 @@
     </w:p>
     <w:p>
       <w:pPr>
-        <w:keepLines/>
+        <w:keepLines w:val="0"/>
         <w:spacing w:after="70"/>
         <w:ind w:left="317" w:hanging="259"/>
       </w:pPr>
@@ -1782,7 +1784,7 @@
     </w:p>
     <w:p>
       <w:pPr>
-        <w:keepLines/>
+        <w:keepLines w:val="0"/>
         <w:spacing w:after="70"/>
         <w:ind w:left="317" w:hanging="259"/>
       </w:pPr>
@@ -1805,7 +1807,7 @@
     </w:p>
     <w:p>
       <w:pPr>
-        <w:keepLines/>
+        <w:keepLines w:val="0"/>
         <w:spacing w:after="70"/>
         <w:ind w:left="317" w:hanging="259"/>
       </w:pPr>
@@ -1828,7 +1830,7 @@
     </w:p>
     <w:p>
       <w:pPr>
-        <w:keepLines/>
+        <w:keepLines w:val="0"/>
         <w:spacing w:after="70"/>
         <w:ind w:left="317" w:hanging="259"/>
       </w:pPr>
@@ -1851,7 +1853,7 @@
     </w:p>
     <w:p>
       <w:pPr>
-        <w:keepLines/>
+        <w:keepLines w:val="0"/>
         <w:spacing w:after="70"/>
         <w:ind w:left="317" w:hanging="259"/>
       </w:pPr>
@@ -1874,7 +1876,7 @@
     </w:p>
     <w:p>
       <w:pPr>
-        <w:keepLines/>
+        <w:keepLines w:val="0"/>
         <w:spacing w:after="70"/>
         <w:ind w:left="317" w:hanging="259"/>
       </w:pPr>
@@ -1897,7 +1899,7 @@
     </w:p>
     <w:p>
       <w:pPr>
-        <w:keepLines/>
+        <w:keepLines w:val="0"/>
         <w:spacing w:after="70"/>
         <w:ind w:left="317" w:hanging="259"/>
       </w:pPr>
@@ -1941,7 +1943,7 @@
     </w:p>
     <w:p>
       <w:pPr>
-        <w:keepLines/>
+        <w:keepLines w:val="0"/>
         <w:spacing w:after="70"/>
         <w:ind w:left="317" w:hanging="259"/>
       </w:pPr>
@@ -1964,7 +1966,7 @@
     </w:p>
     <w:p>
       <w:pPr>
-        <w:keepLines/>
+        <w:keepLines w:val="0"/>
         <w:spacing w:after="70"/>
         <w:ind w:left="317" w:hanging="259"/>
       </w:pPr>
@@ -1987,7 +1989,7 @@
     </w:p>
     <w:p>
       <w:pPr>
-        <w:keepLines/>
+        <w:keepLines w:val="0"/>
         <w:spacing w:after="70"/>
         <w:ind w:left="317" w:hanging="259"/>
       </w:pPr>
@@ -2010,7 +2012,7 @@
     </w:p>
     <w:p>
       <w:pPr>
-        <w:keepLines/>
+        <w:keepLines w:val="0"/>
         <w:spacing w:after="70"/>
         <w:ind w:left="317" w:hanging="259"/>
       </w:pPr>
@@ -2033,7 +2035,7 @@
     </w:p>
     <w:p>
       <w:pPr>
-        <w:keepLines/>
+        <w:keepLines w:val="0"/>
         <w:spacing w:after="70"/>
         <w:ind w:left="317" w:hanging="259"/>
       </w:pPr>
@@ -2056,7 +2058,7 @@
     </w:p>
     <w:p>
       <w:pPr>
-        <w:keepLines/>
+        <w:keepLines w:val="0"/>
         <w:spacing w:after="70"/>
         <w:ind w:left="317" w:hanging="259"/>
       </w:pPr>
@@ -2079,7 +2081,7 @@
     </w:p>
     <w:p>
       <w:pPr>
-        <w:keepLines/>
+        <w:keepLines w:val="0"/>
         <w:spacing w:after="70"/>
         <w:ind w:left="317" w:hanging="259"/>
       </w:pPr>
@@ -2102,7 +2104,7 @@
     </w:p>
     <w:p>
       <w:pPr>
-        <w:keepLines/>
+        <w:keepLines w:val="0"/>
         <w:spacing w:after="70"/>
         <w:ind w:left="317" w:hanging="259"/>
       </w:pPr>
@@ -2125,7 +2127,7 @@
     </w:p>
     <w:p>
       <w:pPr>
-        <w:keepLines/>
+        <w:keepLines w:val="0"/>
         <w:spacing w:after="70"/>
         <w:ind w:left="317" w:hanging="259"/>
       </w:pPr>
@@ -2148,7 +2150,7 @@
     </w:p>
     <w:p>
       <w:pPr>
-        <w:keepLines/>
+        <w:keepLines w:val="0"/>
         <w:spacing w:after="70"/>
         <w:ind w:left="317" w:hanging="259"/>
       </w:pPr>
@@ -2399,6 +2401,13 @@
         <w:sz w:val="18"/>
       </w:rPr>
       <w:t xml:space="preserve">Page </w:t>
+    </w:r>
+    <w:r>
+      <w:rPr>
+        <w:rFonts w:ascii="Aptos" w:hAnsi="Aptos"/>
+        <w:color w:val="5A5A5A"/>
+        <w:sz w:val="18"/>
+      </w:rPr>
       <w:fldChar w:fldCharType="begin"/>
       <w:instrText xml:space="preserve"> PAGE </w:instrText>
       <w:fldChar w:fldCharType="separate"/>
@@ -3141,9 +3150,6 @@
     <w:qFormat/>
     <w:rsid w:val="00FC693F"/>
     <w:pPr>
-      <w:pBdr>
-        <w:bottom w:val="single" w:sz="8" w:space="4" w:color="4F81BD" w:themeColor="accent1"/>
-      </w:pBdr>
       <w:spacing w:after="240" w:line="240" w:lineRule="auto"/>
       <w:contextualSpacing/>
     </w:pPr>

</xml_diff>

<commit_message>
vault backup: 2026-10-18 07:12:36
</commit_message>
<xml_diff>
--- a/Visa/801 - Permanent Residency/Prepared Documents/Visa 801 Document Checklist.docx
+++ b/Visa/801 - Permanent Residency/Prepared Documents/Visa 801 Document Checklist.docx
@@ -1189,7 +1189,6 @@
     </w:p>
     <w:p>
       <w:pPr>
-        <w:keepNext/>
         <w:keepLines w:val="0"/>
         <w:spacing w:after="70"/>
         <w:ind w:left="706" w:hanging="259"/>
@@ -1208,30 +1207,7 @@
           <w:rFonts w:ascii="Aptos" w:hAnsi="Aptos"/>
           <w:sz w:val="20"/>
         </w:rPr>
-        <w:t>Lease agreement — Urunga and initial Coffs Harbour agreements gathered.</w:t>
-      </w:r>
-    </w:p>
-    <w:p>
-      <w:pPr>
-        <w:keepLines w:val="0"/>
-        <w:spacing w:after="70"/>
-        <w:ind w:left="706" w:hanging="259"/>
-      </w:pPr>
-      <w:r>
-        <w:rPr>
-          <w:rFonts w:ascii="Aptos" w:hAnsi="Aptos"/>
-          <w:b/>
-          <w:color w:val="1A703D"/>
-          <w:sz w:val="19"/>
-        </w:rPr>
-        <w:t xml:space="preserve">DONE  </w:t>
-      </w:r>
-      <w:r>
-        <w:rPr>
-          <w:rFonts w:ascii="Aptos" w:hAnsi="Aptos"/>
-          <w:sz w:val="20"/>
-        </w:rPr>
-        <w:t>Tenancy agreement — Coffs Harbour extension gathered, 27 July 2026–25 January 2027.</w:t>
+        <w:t>Lease evidence — Urunga and initial Coffs Harbour agreements gathered, together with the Coffs Harbour extension for 27 July 2026–25 January 2027.</w:t>
       </w:r>
     </w:p>
     <w:p>
@@ -2392,28 +2368,8 @@
   <w:p>
     <w:pPr>
       <w:pStyle w:val="Footer"/>
-      <w:jc w:val="right"/>
-    </w:pPr>
-    <w:r>
-      <w:rPr>
-        <w:rFonts w:ascii="Aptos" w:hAnsi="Aptos"/>
-        <w:color w:val="5A5A5A"/>
-        <w:sz w:val="18"/>
-      </w:rPr>
-      <w:t xml:space="preserve">Page </w:t>
-    </w:r>
-    <w:r>
-      <w:rPr>
-        <w:rFonts w:ascii="Aptos" w:hAnsi="Aptos"/>
-        <w:color w:val="5A5A5A"/>
-        <w:sz w:val="18"/>
-      </w:rPr>
-      <w:fldChar w:fldCharType="begin"/>
-      <w:instrText xml:space="preserve"> PAGE </w:instrText>
-      <w:fldChar w:fldCharType="separate"/>
-      <w:t>1</w:t>
-      <w:fldChar w:fldCharType="end"/>
-    </w:r>
+    </w:pPr>
+    <w:r/>
   </w:p>
 </w:ftr>
 </file>

</xml_diff>

<commit_message>
vault backup: 2026-10-18 07:30:48
</commit_message>
<xml_diff>
--- a/Visa/801 - Permanent Residency/Prepared Documents/Visa 801 Document Checklist.docx
+++ b/Visa/801 - Permanent Residency/Prepared Documents/Visa 801 Document Checklist.docx
@@ -119,7 +119,7 @@
           <w:rFonts w:ascii="Aptos" w:hAnsi="Aptos"/>
           <w:sz w:val="20"/>
         </w:rPr>
-        <w:t xml:space="preserve"> — obtain updated statements from the intended witnesses; Jaya and Mum are currently tagged.</w:t>
+        <w:t xml:space="preserve"> — Mum's draft has been received and reviewed; correct the issues listed in the review notes, then complete signing and witnessing. Jaya's updated statement is still required.</w:t>
       </w:r>
     </w:p>
     <w:p>
@@ -151,7 +151,7 @@
           <w:rFonts w:ascii="Aptos" w:hAnsi="Aptos"/>
           <w:sz w:val="20"/>
         </w:rPr>
-        <w:t xml:space="preserve"> — review the prepared draft, resolve the remaining factual questions, update the cutoff date, obtain Affinity's review and arrange signing.</w:t>
+        <w:t xml:space="preserve"> — review the first-pass draft dated 18 October 2026, resolve the remaining factual questions, obtain Affinity's review and arrange signing.</w:t>
       </w:r>
     </w:p>
     <w:p>
@@ -176,14 +176,14 @@
           <w:b/>
           <w:sz w:val="20"/>
         </w:rPr>
-        <w:t>[P1] Relationship photo timeline</w:t>
+        <w:t>[P1] Complete the relationship photo timeline coverage</w:t>
       </w:r>
       <w:r>
         <w:rPr>
           <w:rFonts w:ascii="Aptos" w:hAnsi="Aptos"/>
           <w:sz w:val="20"/>
         </w:rPr>
-        <w:t xml:space="preserve"> — the Google Doc exists but is empty. Add approximately two to three photos every two months, in date order, with names and short captions.</w:t>
+        <w:t xml:space="preserve"> — 18 curated photos from August 2025 to July 2026 have been exported and placed into a draft timeline. Add recent photos for August to October 2026 and, if available, ordinary-life photos for the March to May 2026 gap before final submission.</w:t>
       </w:r>
     </w:p>
     <w:p>
@@ -279,7 +279,7 @@
           <w:rFonts w:ascii="Aptos" w:hAnsi="Aptos"/>
           <w:sz w:val="20"/>
         </w:rPr>
-        <w:t xml:space="preserve"> — retrieve both superannuation beneficiary nominations and decide whether any other evidence is relevant.</w:t>
+        <w:t xml:space="preserve"> — Scott's IOOF beneficiary nomination has been captured and shows Kristina as 100% beneficiary under a binding non-lapsing nomination. Retrieve Kristina's beneficiary nomination and decide whether any other evidence is relevant.</w:t>
       </w:r>
     </w:p>
     <w:p>
@@ -292,11 +292,10 @@
         <w:rPr>
           <w:rFonts w:ascii="Aptos" w:hAnsi="Aptos"/>
           <w:b/>
-          <w:color w:val="9C4800"/>
+          <w:color w:val="1A703D"/>
           <w:sz w:val="19"/>
-          <w:highlight w:val="yellow"/>
         </w:rPr>
-        <w:t xml:space="preserve">TO DO  </w:t>
+        <w:t xml:space="preserve">DONE  </w:t>
       </w:r>
       <w:r>
         <w:rPr>
@@ -304,14 +303,14 @@
           <w:b/>
           <w:sz w:val="20"/>
         </w:rPr>
-        <w:t>[P1] Assets and liabilities</w:t>
+        <w:t>[P1] Car purchase and registration evidence</w:t>
       </w:r>
       <w:r>
         <w:rPr>
           <w:rFonts w:ascii="Aptos" w:hAnsi="Aptos"/>
           <w:sz w:val="20"/>
         </w:rPr>
-        <w:t xml:space="preserve"> — confirm the car purchase month and year and registration or ownership names. Decide whether to include the car insurance, car loan and dog-surgery loan evidence, describing sole-name liabilities accurately.</w:t>
+        <w:t xml:space="preserve"> — purchase invoice dated 7 November 2024 and current registration-related evidence have been gathered. The vehicle and liabilities are in Scott's name; describe them accurately as a shared household asset and joint decision rather than joint legal ownership.</w:t>
       </w:r>
     </w:p>
     <w:p>
@@ -600,6 +599,144 @@
           <w:sz w:val="20"/>
         </w:rPr>
         <w:t>Initial draft of Scott's updated relationship statement prepared.</w:t>
+      </w:r>
+    </w:p>
+    <w:p>
+      <w:pPr>
+        <w:keepLines w:val="0"/>
+        <w:spacing w:after="70"/>
+        <w:ind w:left="317" w:hanging="259"/>
+      </w:pPr>
+      <w:r>
+        <w:rPr>
+          <w:rFonts w:ascii="Aptos" w:hAnsi="Aptos"/>
+          <w:b/>
+          <w:color w:val="1A703D"/>
+          <w:sz w:val="19"/>
+        </w:rPr>
+        <w:t xml:space="preserve">DONE  </w:t>
+      </w:r>
+      <w:r>
+        <w:rPr>
+          <w:rFonts w:ascii="Aptos" w:hAnsi="Aptos"/>
+          <w:sz w:val="20"/>
+        </w:rPr>
+        <w:t>Scott's IOOF beneficiary nomination captured; Kristina is nominated for 100% under a binding non-lapsing nomination.</w:t>
+      </w:r>
+    </w:p>
+    <w:p>
+      <w:pPr>
+        <w:keepLines w:val="0"/>
+        <w:spacing w:after="70"/>
+        <w:ind w:left="317" w:hanging="259"/>
+      </w:pPr>
+      <w:r>
+        <w:rPr>
+          <w:rFonts w:ascii="Aptos" w:hAnsi="Aptos"/>
+          <w:b/>
+          <w:color w:val="1A703D"/>
+          <w:sz w:val="19"/>
+        </w:rPr>
+        <w:t xml:space="preserve">DONE  </w:t>
+      </w:r>
+      <w:r>
+        <w:rPr>
+          <w:rFonts w:ascii="Aptos" w:hAnsi="Aptos"/>
+          <w:sz w:val="20"/>
+        </w:rPr>
+        <w:t>Car purchase invoice gathered — 2019 Mazda 3, purchased 7 November 2024 from Moreton Bay Ford.</w:t>
+      </w:r>
+    </w:p>
+    <w:p>
+      <w:pPr>
+        <w:keepLines w:val="0"/>
+        <w:spacing w:after="70"/>
+        <w:ind w:left="317" w:hanging="259"/>
+      </w:pPr>
+      <w:r>
+        <w:rPr>
+          <w:rFonts w:ascii="Aptos" w:hAnsi="Aptos"/>
+          <w:b/>
+          <w:color w:val="1A703D"/>
+          <w:sz w:val="19"/>
+        </w:rPr>
+        <w:t xml:space="preserve">DONE  </w:t>
+      </w:r>
+      <w:r>
+        <w:rPr>
+          <w:rFonts w:ascii="Aptos" w:hAnsi="Aptos"/>
+          <w:sz w:val="20"/>
+        </w:rPr>
+        <w:t>Current vehicle registration-related evidence gathered — Mazda 3, NSW registration DN93QA, Scott named as owner on the QBE CTP evidence, registration period commencing 24 April 2026.</w:t>
+      </w:r>
+    </w:p>
+    <w:p>
+      <w:pPr>
+        <w:keepLines w:val="0"/>
+        <w:spacing w:after="70"/>
+        <w:ind w:left="317" w:hanging="259"/>
+      </w:pPr>
+      <w:r>
+        <w:rPr>
+          <w:rFonts w:ascii="Aptos" w:hAnsi="Aptos"/>
+          <w:b/>
+          <w:color w:val="1A703D"/>
+          <w:sz w:val="19"/>
+        </w:rPr>
+        <w:t xml:space="preserve">DONE  </w:t>
+      </w:r>
+      <w:r>
+        <w:rPr>
+          <w:rFonts w:ascii="Aptos" w:hAnsi="Aptos"/>
+          <w:sz w:val="20"/>
+        </w:rPr>
+        <w:t>Sydney travel review completed from available email and calendar evidence: definite solo work trip 11–14 May 2026; work activity in Concord West on 10 November 2025 with surrounding travel dates and whether Kristina accompanied Scott still to be confirmed; joint Sydney trip 27 February–1 March 2026 excluded from periods apart.</w:t>
+      </w:r>
+    </w:p>
+    <w:p>
+      <w:pPr>
+        <w:keepLines w:val="0"/>
+        <w:spacing w:after="70"/>
+        <w:ind w:left="317" w:hanging="259"/>
+      </w:pPr>
+      <w:r>
+        <w:rPr>
+          <w:rFonts w:ascii="Aptos" w:hAnsi="Aptos"/>
+          <w:b/>
+          <w:color w:val="1A703D"/>
+          <w:sz w:val="19"/>
+        </w:rPr>
+        <w:t xml:space="preserve">DONE  </w:t>
+      </w:r>
+      <w:r>
+        <w:rPr>
+          <w:rFonts w:ascii="Aptos" w:hAnsi="Aptos"/>
+          <w:sz w:val="20"/>
+        </w:rPr>
+        <w:t>Mum's witness statement draft received and reviewed; corrections and signing remain.</w:t>
+      </w:r>
+    </w:p>
+    <w:p>
+      <w:pPr>
+        <w:keepLines w:val="0"/>
+        <w:spacing w:after="70"/>
+        <w:ind w:left="317" w:hanging="259"/>
+      </w:pPr>
+      <w:r>
+        <w:rPr>
+          <w:rFonts w:ascii="Aptos" w:hAnsi="Aptos"/>
+          <w:b/>
+          <w:color w:val="1A703D"/>
+          <w:sz w:val="19"/>
+        </w:rPr>
+        <w:t xml:space="preserve">DONE  </w:t>
+      </w:r>
+      <w:r>
+        <w:rPr>
+          <w:rFonts w:ascii="Aptos" w:hAnsi="Aptos"/>
+          <w:sz w:val="20"/>
+        </w:rPr>
+        <w:t>Eighteen curated relationship photos exported from Photos for the timeline, covering August 2025 to July 2026.</w:t>
       </w:r>
     </w:p>
     <w:p>
@@ -974,7 +1111,30 @@
           <w:b/>
           <w:sz w:val="20"/>
         </w:rPr>
-        <w:t>PARTIAL: car insurance gathered; ownership and loan evidence still needs confirmation and selection.</w:t>
+        <w:t>PARTIAL: car purchase, insurance and registration-related evidence gathered. The car was purchased before September 2025 and is legally in Scott's name, so confirm with Affinity whether it should be included as contextual household evidence.</w:t>
+      </w:r>
+    </w:p>
+    <w:p>
+      <w:pPr>
+        <w:keepLines w:val="0"/>
+        <w:spacing w:after="70"/>
+        <w:ind w:left="706" w:hanging="259"/>
+      </w:pPr>
+      <w:r>
+        <w:rPr>
+          <w:rFonts w:ascii="Aptos" w:hAnsi="Aptos"/>
+          <w:b/>
+          <w:color w:val="1A703D"/>
+          <w:sz w:val="19"/>
+        </w:rPr>
+        <w:t xml:space="preserve">DONE  </w:t>
+      </w:r>
+      <w:r>
+        <w:rPr>
+          <w:rFonts w:ascii="Aptos" w:hAnsi="Aptos"/>
+          <w:sz w:val="20"/>
+        </w:rPr>
+        <w:t>Car purchase and registration facts confirmed: invoice dated 7 November 2024; 2019 Mazda 3; current NSW registration DN93QA; Scott named as owner. Car loan, dog-surgery loan and credit card are solely in Scott's name.</w:t>
       </w:r>
     </w:p>
     <w:p>
@@ -997,7 +1157,7 @@
           <w:rFonts w:ascii="Aptos" w:hAnsi="Aptos"/>
           <w:sz w:val="20"/>
         </w:rPr>
-        <w:t>Confirm any jointly owned assets acquired since September 2025, if applicable. Car loan, dog-surgery loan and credit card are confirmed solely in Scott’s name. Confirm the car purchase month/year and registration/ownership names if using it as asset evidence.</w:t>
+        <w:t>Confirm whether any genuinely joint asset or liability was acquired from 24 September 2025 onward. If none, record that the category is not applicable rather than overstating sole-name evidence.</w:t>
       </w:r>
     </w:p>
     <w:p>
@@ -1129,7 +1289,7 @@
           <w:b/>
           <w:sz w:val="20"/>
         </w:rPr>
-        <w:t>PARTIAL: joint leases gathered; superannuation beneficiary nominations remain.</w:t>
+        <w:t>PARTIAL: joint leases and Scott's IOOF beneficiary nomination gathered; Kristina's beneficiary nomination remains.</w:t>
       </w:r>
     </w:p>
     <w:p>
@@ -1480,7 +1640,38 @@
           <w:rFonts w:ascii="Aptos" w:hAnsi="Aptos"/>
           <w:sz w:val="20"/>
         </w:rPr>
-        <w:t>[P1] Relationship Timeline Photos - Since Sep 2025</w:t>
+        <w:t xml:space="preserve">[P1] Relationship Timeline Photos - Since Sep 2025 — </w:t>
+      </w:r>
+      <w:r>
+        <w:rPr>
+          <w:rFonts w:ascii="Aptos" w:hAnsi="Aptos"/>
+          <w:b/>
+          <w:sz w:val="20"/>
+        </w:rPr>
+        <w:t>IN PROGRESS: 18 photos exported and placed into a draft timeline.</w:t>
+      </w:r>
+    </w:p>
+    <w:p>
+      <w:pPr>
+        <w:keepLines w:val="0"/>
+        <w:spacing w:after="70"/>
+        <w:ind w:left="706" w:hanging="259"/>
+      </w:pPr>
+      <w:r>
+        <w:rPr>
+          <w:rFonts w:ascii="Aptos" w:hAnsi="Aptos"/>
+          <w:b/>
+          <w:color w:val="1A703D"/>
+          <w:sz w:val="19"/>
+        </w:rPr>
+        <w:t xml:space="preserve">DONE  </w:t>
+      </w:r>
+      <w:r>
+        <w:rPr>
+          <w:rFonts w:ascii="Aptos" w:hAnsi="Aptos"/>
+          <w:sz w:val="20"/>
+        </w:rPr>
+        <w:t>Compile the current album in chronological order with date, people and a brief caption.</w:t>
       </w:r>
     </w:p>
     <w:p>
@@ -1503,7 +1694,7 @@
           <w:rFonts w:ascii="Aptos" w:hAnsi="Aptos"/>
           <w:sz w:val="20"/>
         </w:rPr>
-        <w:t>Compile these in a word document in chronological order with the date and a brief description under each photo. Around 2 to 3 photos every two months will be sufficient</w:t>
+        <w:t>Add recent photos for August to October 2026 and, if available, fill the March to May 2026 gap so the final set better matches the agency's suggestion of two to three photos every two months.</w:t>
       </w:r>
     </w:p>
     <w:p>
@@ -1778,7 +1969,7 @@
           <w:rFonts w:ascii="Aptos" w:hAnsi="Aptos"/>
           <w:sz w:val="20"/>
         </w:rPr>
-        <w:t>Short periods apart — for the brother’s house move, birthdays, each TAFE excursion and Sydney Bats trip, supply approximate dates, number of nights, who travelled, who remained home and how you kept in contact. Identify which were after 24 September 2025 and which trips you took together. The draft currently describes them generally without invented dates.</w:t>
+        <w:t>Short periods apart — definite solo work travel is now confirmed for Sydney from 11 to 14 May 2026. Confirm how you kept in contact during that trip. Also supply approximate dates, number of nights, who travelled, who remained home and how you kept in contact for the brother's house move, birthdays, each TAFE excursion and Sydney Bats trip. A work activity places Scott in Concord West on 10 November 2025, but the surrounding travel dates and whether Kristina accompanied him still need confirmation.</w:t>
       </w:r>
     </w:p>
     <w:p>
@@ -1814,17 +2005,17 @@
         <w:rPr>
           <w:rFonts w:ascii="Aptos" w:hAnsi="Aptos"/>
           <w:b/>
-          <w:color w:val="9C4800"/>
+          <w:color w:val="1A703D"/>
           <w:sz w:val="19"/>
         </w:rPr>
-        <w:t xml:space="preserve">TO DO  </w:t>
+        <w:t xml:space="preserve">DONE  </w:t>
       </w:r>
       <w:r>
         <w:rPr>
           <w:rFonts w:ascii="Aptos" w:hAnsi="Aptos"/>
           <w:sz w:val="20"/>
         </w:rPr>
-        <w:t>Car purchase — provide approximate purchase date and confirm registration/ownership names if relying on the car as asset evidence. The ING loan being solely in Scott’s name is already confirmed; no need to reconfirm it.</w:t>
+        <w:t>Car purchase — confirmed from the tax invoice: 7 November 2024, 2019 Mazda 3. Current registration-related evidence shows NSW registration DN93QA and Scott as owner. The ING loan is solely in Scott's name.</w:t>
       </w:r>
     </w:p>
     <w:p>
@@ -2029,7 +2220,7 @@
           <w:rFonts w:ascii="Aptos" w:hAnsi="Aptos"/>
           <w:sz w:val="20"/>
         </w:rPr>
-        <w:t>Legal commitments — locate both superannuation beneficiary nominations as support for the statement. Identify any other relevant commitments, if applicable.</w:t>
+        <w:t>Legal commitments — Scott's IOOF nomination is gathered and shows Kristina at 100% under a binding non-lapsing nomination. Locate Kristina's nomination naming Scott and identify any other relevant commitments, if applicable.</w:t>
       </w:r>
     </w:p>
     <w:p>
@@ -3106,6 +3297,9 @@
     <w:qFormat/>
     <w:rsid w:val="00FC693F"/>
     <w:pPr>
+      <w:pBdr>
+        <w:bottom w:val="single" w:sz="8" w:space="4" w:color="4F81BD" w:themeColor="accent1"/>
+      </w:pBdr>
       <w:spacing w:after="240" w:line="240" w:lineRule="auto"/>
       <w:contextualSpacing/>
     </w:pPr>

</xml_diff>

<commit_message>
vault backup: 2026-10-18 07:39:25
</commit_message>
<xml_diff>
--- a/Visa/801 - Permanent Residency/Prepared Documents/Visa 801 Document Checklist.docx
+++ b/Visa/801 - Permanent Residency/Prepared Documents/Visa 801 Document Checklist.docx
@@ -1982,17 +1982,17 @@
         <w:rPr>
           <w:rFonts w:ascii="Aptos" w:hAnsi="Aptos"/>
           <w:b/>
-          <w:color w:val="9C4800"/>
+          <w:color w:val="1A703D"/>
           <w:sz w:val="19"/>
         </w:rPr>
-        <w:t xml:space="preserve">TO DO  </w:t>
+        <w:t xml:space="preserve">DONE  </w:t>
       </w:r>
       <w:r>
         <w:rPr>
           <w:rFonts w:ascii="Aptos" w:hAnsi="Aptos"/>
           <w:sz w:val="20"/>
         </w:rPr>
-        <w:t>School friend’s wedding — provide the couple’s names and approximate date. This event has been left out until its timing is known.</w:t>
+        <w:t>School friend's wedding — Photos metadata confirms 15 August 2025 in Buccan. This was before the 820 grant date, so it remains outside the updated statement. The couple's names are only needed if you choose to add it as earlier social context.</w:t>
       </w:r>
     </w:p>
     <w:p>

</xml_diff>

<commit_message>
vault backup: 2026-10-18 08:31:31
</commit_message>
<xml_diff>
--- a/Visa/801 - Permanent Residency/Prepared Documents/Visa 801 Document Checklist.docx
+++ b/Visa/801 - Permanent Residency/Prepared Documents/Visa 801 Document Checklist.docx
@@ -151,7 +151,7 @@
           <w:rFonts w:ascii="Aptos" w:hAnsi="Aptos"/>
           <w:sz w:val="20"/>
         </w:rPr>
-        <w:t xml:space="preserve"> — review the first-pass draft dated 18 October 2026, resolve the remaining factual questions, obtain Affinity's review and arrange signing.</w:t>
+        <w:t xml:space="preserve"> — review the first-pass draft dated 18 October 2026, answer the firm factual confirmations in “Scott's review required now”, obtain Affinity's review and arrange signing.</w:t>
       </w:r>
     </w:p>
     <w:p>
@@ -183,7 +183,7 @@
           <w:rFonts w:ascii="Aptos" w:hAnsi="Aptos"/>
           <w:sz w:val="20"/>
         </w:rPr>
-        <w:t xml:space="preserve"> — 18 curated photos from August 2025 to July 2026 have been exported and placed into a draft timeline. Add recent photos for August to October 2026 and, if available, ordinary-life photos for the March to May 2026 gap before final submission.</w:t>
+        <w:t xml:space="preserve"> — 18 curated photos from August 2025 to July 2026 have been placed into a draft timeline. Ask Kristina for additional candidates covering August–October 2026, March–May 2026 and ordinary life or Australian social occasions; then select approximately 6–8 additions.</w:t>
       </w:r>
     </w:p>
     <w:p>
@@ -215,7 +215,7 @@
           <w:rFonts w:ascii="Aptos" w:hAnsi="Aptos"/>
           <w:sz w:val="20"/>
         </w:rPr>
-        <w:t xml:space="preserve"> — add dated messages or call records for Bali and any other relevant separations after 24 September 2025.</w:t>
+        <w:t xml:space="preserve"> — three ordinary Bali Messages screenshots from 6–8 October 2025 have been gathered locally. Their upload to Google Drive is pending Scott's explicit approval because they contain private messages. Add evidence for other relevant separations if available.</w:t>
       </w:r>
     </w:p>
     <w:p>
@@ -737,6 +737,29 @@
           <w:sz w:val="20"/>
         </w:rPr>
         <w:t>Eighteen curated relationship photos exported from Photos for the timeline, covering August 2025 to July 2026.</w:t>
+      </w:r>
+    </w:p>
+    <w:p>
+      <w:pPr>
+        <w:keepLines w:val="0"/>
+        <w:spacing w:after="70"/>
+        <w:ind w:left="317" w:hanging="259"/>
+      </w:pPr>
+      <w:r>
+        <w:rPr>
+          <w:rFonts w:ascii="Aptos" w:hAnsi="Aptos"/>
+          <w:b/>
+          <w:color w:val="1A703D"/>
+          <w:sz w:val="19"/>
+        </w:rPr>
+        <w:t xml:space="preserve">DONE  </w:t>
+      </w:r>
+      <w:r>
+        <w:rPr>
+          <w:rFonts w:ascii="Aptos" w:hAnsi="Aptos"/>
+          <w:sz w:val="20"/>
+        </w:rPr>
+        <w:t>Three ordinary Messages screenshots gathered locally for the Bali separation, covering 6–8 October 2025. They have not yet been uploaded to Google Drive.</w:t>
       </w:r>
     </w:p>
     <w:p>
@@ -1951,25 +1974,23 @@
     </w:p>
     <w:p>
       <w:pPr>
-        <w:keepLines w:val="0"/>
-        <w:spacing w:after="70"/>
-        <w:ind w:left="317" w:hanging="259"/>
+        <w:pStyle w:val="Heading2"/>
       </w:pPr>
       <w:r>
         <w:rPr>
           <w:rFonts w:ascii="Aptos" w:hAnsi="Aptos"/>
-          <w:b/>
-          <w:color w:val="9C4800"/>
-          <w:sz w:val="19"/>
-        </w:rPr>
-        <w:t xml:space="preserve">TO DO  </w:t>
-      </w:r>
+          <w:sz w:val="24"/>
+        </w:rPr>
+        <w:t>Scott's review required now</w:t>
+      </w:r>
+    </w:p>
+    <w:p>
       <w:r>
         <w:rPr>
           <w:rFonts w:ascii="Aptos" w:hAnsi="Aptos"/>
           <w:sz w:val="20"/>
         </w:rPr>
-        <w:t>Short periods apart — definite solo work travel is now confirmed for Sydney from 11 to 14 May 2026. Confirm how you kept in contact during that trip. Also supply approximate dates, number of nights, who travelled, who remained home and how you kept in contact for the brother's house move, birthdays, each TAFE excursion and Sydney Bats trip. A work activity places Scott in Concord West on 10 November 2025, but the surrounding travel dates and whether Kristina accompanied him still need confirmation.</w:t>
+        <w:t>These questions are intended to replace vague wording with facts Scott can personally confirm. Do not state a fact as certain until it is confirmed here or supported by evidence.</w:t>
       </w:r>
     </w:p>
     <w:p>
@@ -1982,17 +2003,25 @@
         <w:rPr>
           <w:rFonts w:ascii="Aptos" w:hAnsi="Aptos"/>
           <w:b/>
-          <w:color w:val="1A703D"/>
+          <w:color w:val="9C4800"/>
           <w:sz w:val="19"/>
         </w:rPr>
-        <w:t xml:space="preserve">DONE  </w:t>
-      </w:r>
-      <w:r>
-        <w:rPr>
-          <w:rFonts w:ascii="Aptos" w:hAnsi="Aptos"/>
+        <w:t xml:space="preserve">TO DO  </w:t>
+      </w:r>
+      <w:r>
+        <w:rPr>
+          <w:rFonts w:ascii="Aptos" w:hAnsi="Aptos"/>
+          <w:b/>
           <w:sz w:val="20"/>
         </w:rPr>
-        <w:t>School friend's wedding — Photos metadata confirms 15 August 2025 in Buccan. This was before the 820 grant date, so it remains outside the updated statement. The couple's names are only needed if you choose to add it as earlier social context.</w:t>
+        <w:t>Kristina's superannuation beneficiary nomination</w:t>
+      </w:r>
+      <w:r>
+        <w:rPr>
+          <w:rFonts w:ascii="Aptos" w:hAnsi="Aptos"/>
+          <w:sz w:val="20"/>
+        </w:rPr>
+        <w:t xml:space="preserve"> — confirm whether Scott has personally seen the nomination. If yes, record the fund, nomination type and percentage if shown. If not, remove the claim from the statement until evidence is obtained.</w:t>
       </w:r>
     </w:p>
     <w:p>
@@ -2005,17 +2034,25 @@
         <w:rPr>
           <w:rFonts w:ascii="Aptos" w:hAnsi="Aptos"/>
           <w:b/>
-          <w:color w:val="1A703D"/>
+          <w:color w:val="9C4800"/>
           <w:sz w:val="19"/>
         </w:rPr>
-        <w:t xml:space="preserve">DONE  </w:t>
-      </w:r>
-      <w:r>
-        <w:rPr>
-          <w:rFonts w:ascii="Aptos" w:hAnsi="Aptos"/>
+        <w:t xml:space="preserve">TO DO  </w:t>
+      </w:r>
+      <w:r>
+        <w:rPr>
+          <w:rFonts w:ascii="Aptos" w:hAnsi="Aptos"/>
+          <w:b/>
           <w:sz w:val="20"/>
         </w:rPr>
-        <w:t>Car purchase — confirmed from the tax invoice: 7 November 2024, 2019 Mazda 3. Current registration-related evidence shows NSW registration DN93QA and Scott as owner. The ING loan is solely in Scott's name.</w:t>
+        <w:t>Bali contact</w:t>
+      </w:r>
+      <w:r>
+        <w:rPr>
+          <w:rFonts w:ascii="Aptos" w:hAnsi="Aptos"/>
+          <w:sz w:val="20"/>
+        </w:rPr>
+        <w:t xml:space="preserve"> — confirm whether messages were exchanged every day and approximately how many FaceTime or phone calls occurred. Replace “as I recall” and “a few times” with the confirmed wording. Three message screenshots from 6–8 October 2025 are available locally.</w:t>
       </w:r>
     </w:p>
     <w:p>
@@ -2036,9 +2073,17 @@
       <w:r>
         <w:rPr>
           <w:rFonts w:ascii="Aptos" w:hAnsi="Aptos"/>
+          <w:b/>
           <w:sz w:val="20"/>
         </w:rPr>
-        <w:t>Sanctuary work — confirm the first shift date if you want it stated exactly (currently “around the beginning of October 2026”), and the role title if useful. Update the reference to two completed shifts when finalising the statement.</w:t>
+        <w:t>Other periods apart</w:t>
+      </w:r>
+      <w:r>
+        <w:rPr>
+          <w:rFonts w:ascii="Aptos" w:hAnsi="Aptos"/>
+          <w:sz w:val="20"/>
+        </w:rPr>
+        <w:t xml:space="preserve"> — definite solo work travel is confirmed for Sydney from 11 to 14 May 2026. Confirm how contact was maintained on that trip. Also give approximate dates, number of nights, who travelled, who remained home and how contact was maintained for the brother's house move, birthdays, each TAFE excursion and Sydney Bats trip. A work activity places Scott in Concord West on 10 November 2025; confirm the surrounding travel dates and whether Kristina accompanied him.</w:t>
       </w:r>
     </w:p>
     <w:p>
@@ -2059,9 +2104,17 @@
       <w:r>
         <w:rPr>
           <w:rFonts w:ascii="Aptos" w:hAnsi="Aptos"/>
+          <w:b/>
           <w:sz w:val="20"/>
         </w:rPr>
-        <w:t>Bali arrangements — clarify the drive to/from the Gold Coast, where Scott stayed and who cared for the dog, if these details are to be included. The draft currently mentions the car left with Mum and a sitter only for the joint Bulgaria trips.</w:t>
+        <w:t>Sanctuary work and income</w:t>
+      </w:r>
+      <w:r>
+        <w:rPr>
+          <w:rFonts w:ascii="Aptos" w:hAnsi="Aptos"/>
+          <w:sz w:val="20"/>
+        </w:rPr>
+        <w:t xml:space="preserve"> — confirm Kristina's role title, exact first shift date if known, and whether her first pay has already been deposited into joint 2Up or this is only the intended arrangement.</w:t>
       </w:r>
     </w:p>
     <w:p>
@@ -2082,30 +2135,17 @@
       <w:r>
         <w:rPr>
           <w:rFonts w:ascii="Aptos" w:hAnsi="Aptos"/>
+          <w:b/>
           <w:sz w:val="20"/>
         </w:rPr>
-        <w:t>Final read — check the statement sounds like Scott and is accurate, including the bereavement paragraph, finances and future plans. Confirm “Web Developer” remains an appropriate occupation in the agency template. Review with Affinity, update the cutoff date and arrange signing only after the content is final.</w:t>
-      </w:r>
-    </w:p>
-    <w:p>
+        <w:t>Lease extension</w:t>
+      </w:r>
       <w:r>
         <w:rPr>
           <w:rFonts w:ascii="Aptos" w:hAnsi="Aptos"/>
           <w:sz w:val="20"/>
         </w:rPr>
-        <w:t>Response space: add answers below the relevant item, using approximate dates where exact dates are still being checked.</w:t>
-      </w:r>
-    </w:p>
-    <w:p>
-      <w:pPr>
-        <w:pStyle w:val="Heading1"/>
-      </w:pPr>
-      <w:r>
-        <w:rPr>
-          <w:rFonts w:ascii="Aptos" w:hAnsi="Aptos"/>
-          <w:sz w:val="30"/>
-        </w:rPr>
-        <w:t>Additional evidence follow-up and agency clarifications</w:t>
+        <w:t xml:space="preserve"> — confirm the renewal period is 27 July 2026 to 25 January 2027.</w:t>
       </w:r>
     </w:p>
     <w:p>
@@ -2126,9 +2166,17 @@
       <w:r>
         <w:rPr>
           <w:rFonts w:ascii="Aptos" w:hAnsi="Aptos"/>
+          <w:b/>
           <w:sz w:val="20"/>
         </w:rPr>
-        <w:t>Bali return ticket — already requested from Kristina; add to Evidence when received. Return date supplied is 10 October 2025.</w:t>
+        <w:t>Scott's work</w:t>
+      </w:r>
+      <w:r>
+        <w:rPr>
+          <w:rFonts w:ascii="Aptos" w:hAnsi="Aptos"/>
+          <w:sz w:val="20"/>
+        </w:rPr>
+        <w:t xml:space="preserve"> — confirm “Web Developer” remains the correct occupation and whether the October 2024 start date should be stated more precisely.</w:t>
       </w:r>
     </w:p>
     <w:p>
@@ -2149,9 +2197,17 @@
       <w:r>
         <w:rPr>
           <w:rFonts w:ascii="Aptos" w:hAnsi="Aptos"/>
+          <w:b/>
           <w:sz w:val="20"/>
         </w:rPr>
-        <w:t>Joint travel — December and June Bulgaria flight records have been reviewed. Add available accommodation details and photos where helpful. No extra December passenger record is requested: Scott confirmed both travelled and the booking is for two travellers.</w:t>
+        <w:t>Bereavement timing</w:t>
+      </w:r>
+      <w:r>
+        <w:rPr>
+          <w:rFonts w:ascii="Aptos" w:hAnsi="Aptos"/>
+          <w:sz w:val="20"/>
+        </w:rPr>
+        <w:t xml:space="preserve"> — decide whether to state Kristina's father's date of death or keep the timing general. No exact date is needed unless Scott wants it included.</w:t>
       </w:r>
     </w:p>
     <w:p>
@@ -2172,9 +2228,29 @@
       <w:r>
         <w:rPr>
           <w:rFonts w:ascii="Aptos" w:hAnsi="Aptos"/>
+          <w:b/>
           <w:sz w:val="20"/>
         </w:rPr>
-        <w:t>Contact during separation — select dated messages/call records from Bali and relevant other periods apart for the P1 item above.</w:t>
+        <w:t>Final voice and accuracy review</w:t>
+      </w:r>
+      <w:r>
+        <w:rPr>
+          <w:rFonts w:ascii="Aptos" w:hAnsi="Aptos"/>
+          <w:sz w:val="20"/>
+        </w:rPr>
+        <w:t xml:space="preserve"> — check that the draft sounds like Scott and is accurate, especially the bereavement, finances, living arrangements and future-plans sections. Update the cutoff date, then send it to Affinity and arrange signing only after the content is final.</w:t>
+      </w:r>
+    </w:p>
+    <w:p>
+      <w:pPr>
+        <w:pStyle w:val="Heading2"/>
+      </w:pPr>
+      <w:r>
+        <w:rPr>
+          <w:rFonts w:ascii="Aptos" w:hAnsi="Aptos"/>
+          <w:sz w:val="24"/>
+        </w:rPr>
+        <w:t>Resolved statement points</w:t>
       </w:r>
     </w:p>
     <w:p>
@@ -2197,7 +2273,7 @@
           <w:rFonts w:ascii="Aptos" w:hAnsi="Aptos"/>
           <w:sz w:val="20"/>
         </w:rPr>
-        <w:t>Shared finances — CBA, 2Up and ING statements have been retrieved with relevant date coverage. ING and the loans remain accurately described as solely held. Upload and final submission selection are tracked above.</w:t>
+        <w:t>School friend's wedding — Photos metadata confirms 15 August 2025 in Buccan. This was before the 820 grant date, so it remains outside the updated statement. The couple's names are only needed if you choose to add it as earlier social context.</w:t>
       </w:r>
     </w:p>
     <w:p>
@@ -2210,17 +2286,17 @@
         <w:rPr>
           <w:rFonts w:ascii="Aptos" w:hAnsi="Aptos"/>
           <w:b/>
-          <w:color w:val="9C4800"/>
+          <w:color w:val="1A703D"/>
           <w:sz w:val="19"/>
         </w:rPr>
-        <w:t xml:space="preserve">TO DO  </w:t>
+        <w:t xml:space="preserve">DONE  </w:t>
       </w:r>
       <w:r>
         <w:rPr>
           <w:rFonts w:ascii="Aptos" w:hAnsi="Aptos"/>
           <w:sz w:val="20"/>
         </w:rPr>
-        <w:t>Legal commitments — Scott's IOOF nomination is gathered and shows Kristina at 100% under a binding non-lapsing nomination. Locate Kristina's nomination naming Scott and identify any other relevant commitments, if applicable.</w:t>
+        <w:t>Car purchase — confirmed from the tax invoice: 7 November 2024, 2019 Mazda 3. Current registration-related evidence shows NSW registration DN93QA and Scott as owner. The ING loan is solely in Scott's name.</w:t>
       </w:r>
     </w:p>
     <w:p>
@@ -2243,7 +2319,28 @@
           <w:rFonts w:ascii="Aptos" w:hAnsi="Aptos"/>
           <w:sz w:val="20"/>
         </w:rPr>
-        <w:t>Utilities — electricity, internet and telephone bills reviewed are in Scott's name; water bills are addressed to the property owner or agent. Gas remains to be confirmed as applicable or not applicable. Do not describe these as jointly held accounts.</w:t>
+        <w:t>Bali travel arrangements — Scott and Kristina drove to the Gold Coast together and left the car at Scott's mum's house. Kristina travelled alone; Scott remained in Australia. A dog sitter was arranged. Add these details only where they improve the account.</w:t>
+      </w:r>
+    </w:p>
+    <w:p>
+      <w:r>
+        <w:rPr>
+          <w:rFonts w:ascii="Aptos" w:hAnsi="Aptos"/>
+          <w:sz w:val="20"/>
+        </w:rPr>
+        <w:t>Response space: add answers below the relevant item, using approximate dates where exact dates are still being checked.</w:t>
+      </w:r>
+    </w:p>
+    <w:p>
+      <w:pPr>
+        <w:pStyle w:val="Heading1"/>
+      </w:pPr>
+      <w:r>
+        <w:rPr>
+          <w:rFonts w:ascii="Aptos" w:hAnsi="Aptos"/>
+          <w:sz w:val="30"/>
+        </w:rPr>
+        <w:t>Additional evidence follow-up and agency clarifications</w:t>
       </w:r>
     </w:p>
     <w:p>
@@ -2266,7 +2363,7 @@
           <w:rFonts w:ascii="Aptos" w:hAnsi="Aptos"/>
           <w:sz w:val="20"/>
         </w:rPr>
-        <w:t>Urunga lease — if precise historic tenancy coverage is needed, clarify the scan’s ticked six-month term versus its written end date of 10 February 2025, and any continuation. The commencement date is confirmed as 11 November 2024.</w:t>
+        <w:t>Bali return ticket — already requested from Kristina; add to Evidence when received. Return date supplied is 10 October 2025.</w:t>
       </w:r>
     </w:p>
     <w:p>
@@ -2289,7 +2386,7 @@
           <w:rFonts w:ascii="Aptos" w:hAnsi="Aptos"/>
           <w:sz w:val="20"/>
         </w:rPr>
-        <w:t>Agency wording — confirm the “Subclass 729” reference means 820 and whether Kristina’s Bulgarian licence is wanted.</w:t>
+        <w:t>Joint travel — December and June Bulgaria flight records have been reviewed. Add available accommodation details and photos where helpful. No extra December passenger record is requested: Scott confirmed both travelled and the booking is for two travellers.</w:t>
       </w:r>
     </w:p>
     <w:p>
@@ -2312,7 +2409,7 @@
           <w:rFonts w:ascii="Aptos" w:hAnsi="Aptos"/>
           <w:sz w:val="20"/>
         </w:rPr>
-        <w:t>Wills — establish whether relevant existing wills are available; this is not a task to create new wills.</w:t>
+        <w:t>Contact during separation — three dated Bali Messages screenshots from 6–8 October 2025 are gathered locally. Uploading these private screenshots to the Drive Evidence folder remains pending Scott's explicit approval. Add dated evidence from other periods apart if available.</w:t>
       </w:r>
     </w:p>
     <w:p>
@@ -2325,6 +2422,29 @@
         <w:rPr>
           <w:rFonts w:ascii="Aptos" w:hAnsi="Aptos"/>
           <w:b/>
+          <w:color w:val="1A703D"/>
+          <w:sz w:val="19"/>
+        </w:rPr>
+        <w:t xml:space="preserve">DONE  </w:t>
+      </w:r>
+      <w:r>
+        <w:rPr>
+          <w:rFonts w:ascii="Aptos" w:hAnsi="Aptos"/>
+          <w:sz w:val="20"/>
+        </w:rPr>
+        <w:t>Shared finances — CBA, 2Up and ING statements have been retrieved with relevant date coverage. ING and the loans remain accurately described as solely held. Upload and final submission selection are tracked above.</w:t>
+      </w:r>
+    </w:p>
+    <w:p>
+      <w:pPr>
+        <w:keepLines w:val="0"/>
+        <w:spacing w:after="70"/>
+        <w:ind w:left="317" w:hanging="259"/>
+      </w:pPr>
+      <w:r>
+        <w:rPr>
+          <w:rFonts w:ascii="Aptos" w:hAnsi="Aptos"/>
+          <w:b/>
           <w:color w:val="9C4800"/>
           <w:sz w:val="19"/>
         </w:rPr>
@@ -2335,7 +2455,352 @@
           <w:rFonts w:ascii="Aptos" w:hAnsi="Aptos"/>
           <w:sz w:val="20"/>
         </w:rPr>
+        <w:t>Legal commitments — Scott's IOOF nomination is gathered and shows Kristina at 100% under a binding non-lapsing nomination. Locate Kristina's nomination naming Scott and identify any other relevant commitments, if applicable.</w:t>
+      </w:r>
+    </w:p>
+    <w:p>
+      <w:pPr>
+        <w:keepLines w:val="0"/>
+        <w:spacing w:after="70"/>
+        <w:ind w:left="317" w:hanging="259"/>
+      </w:pPr>
+      <w:r>
+        <w:rPr>
+          <w:rFonts w:ascii="Aptos" w:hAnsi="Aptos"/>
+          <w:b/>
+          <w:color w:val="1A703D"/>
+          <w:sz w:val="19"/>
+        </w:rPr>
+        <w:t xml:space="preserve">DONE  </w:t>
+      </w:r>
+      <w:r>
+        <w:rPr>
+          <w:rFonts w:ascii="Aptos" w:hAnsi="Aptos"/>
+          <w:sz w:val="20"/>
+        </w:rPr>
+        <w:t>Utilities — electricity, internet and telephone bills reviewed are in Scott's name; water bills are addressed to the property owner or agent. Gas remains to be confirmed as applicable or not applicable. Do not describe these as jointly held accounts.</w:t>
+      </w:r>
+    </w:p>
+    <w:p>
+      <w:pPr>
+        <w:keepLines w:val="0"/>
+        <w:spacing w:after="70"/>
+        <w:ind w:left="317" w:hanging="259"/>
+      </w:pPr>
+      <w:r>
+        <w:rPr>
+          <w:rFonts w:ascii="Aptos" w:hAnsi="Aptos"/>
+          <w:b/>
+          <w:color w:val="9C4800"/>
+          <w:sz w:val="19"/>
+        </w:rPr>
+        <w:t xml:space="preserve">TO DO  </w:t>
+      </w:r>
+      <w:r>
+        <w:rPr>
+          <w:rFonts w:ascii="Aptos" w:hAnsi="Aptos"/>
+          <w:sz w:val="20"/>
+        </w:rPr>
+        <w:t>Urunga lease — if precise historic tenancy coverage is needed, clarify the scan’s ticked six-month term versus its written end date of 10 February 2025, and any continuation. The commencement date is confirmed as 11 November 2024.</w:t>
+      </w:r>
+    </w:p>
+    <w:p>
+      <w:pPr>
+        <w:keepLines w:val="0"/>
+        <w:spacing w:after="70"/>
+        <w:ind w:left="317" w:hanging="259"/>
+      </w:pPr>
+      <w:r>
+        <w:rPr>
+          <w:rFonts w:ascii="Aptos" w:hAnsi="Aptos"/>
+          <w:b/>
+          <w:color w:val="9C4800"/>
+          <w:sz w:val="19"/>
+        </w:rPr>
+        <w:t xml:space="preserve">TO DO  </w:t>
+      </w:r>
+      <w:r>
+        <w:rPr>
+          <w:rFonts w:ascii="Aptos" w:hAnsi="Aptos"/>
+          <w:sz w:val="20"/>
+        </w:rPr>
+        <w:t>Agency wording — confirm the “Subclass 729” reference means 820 and whether Kristina’s Bulgarian licence is wanted.</w:t>
+      </w:r>
+    </w:p>
+    <w:p>
+      <w:pPr>
+        <w:keepLines w:val="0"/>
+        <w:spacing w:after="70"/>
+        <w:ind w:left="317" w:hanging="259"/>
+      </w:pPr>
+      <w:r>
+        <w:rPr>
+          <w:rFonts w:ascii="Aptos" w:hAnsi="Aptos"/>
+          <w:b/>
+          <w:color w:val="9C4800"/>
+          <w:sz w:val="19"/>
+        </w:rPr>
+        <w:t xml:space="preserve">TO DO  </w:t>
+      </w:r>
+      <w:r>
+        <w:rPr>
+          <w:rFonts w:ascii="Aptos" w:hAnsi="Aptos"/>
+          <w:sz w:val="20"/>
+        </w:rPr>
+        <w:t>Wills — establish whether relevant existing wills are available; this is not a task to create new wills.</w:t>
+      </w:r>
+    </w:p>
+    <w:p>
+      <w:pPr>
+        <w:keepLines w:val="0"/>
+        <w:spacing w:after="70"/>
+        <w:ind w:left="317" w:hanging="259"/>
+      </w:pPr>
+      <w:r>
+        <w:rPr>
+          <w:rFonts w:ascii="Aptos" w:hAnsi="Aptos"/>
+          <w:b/>
+          <w:color w:val="9C4800"/>
+          <w:sz w:val="19"/>
+        </w:rPr>
+        <w:t xml:space="preserve">TO DO  </w:t>
+      </w:r>
+      <w:r>
+        <w:rPr>
+          <w:rFonts w:ascii="Aptos" w:hAnsi="Aptos"/>
+          <w:sz w:val="20"/>
+        </w:rPr>
         <w:t>Optional supporting records — locate course completion certificates, sanctuary contract/payslip, volunteering records and veterinary invoices/loan records where useful. These are supporting suggestions, not additional agency requirements.</w:t>
+      </w:r>
+    </w:p>
+    <w:p>
+      <w:pPr>
+        <w:pStyle w:val="Heading1"/>
+      </w:pPr>
+      <w:r>
+        <w:rPr>
+          <w:rFonts w:ascii="Aptos" w:hAnsi="Aptos"/>
+          <w:sz w:val="30"/>
+        </w:rPr>
+        <w:t>Photo timeline review and gaps</w:t>
+      </w:r>
+    </w:p>
+    <w:p>
+      <w:r>
+        <w:rPr>
+          <w:rFonts w:ascii="Aptos" w:hAnsi="Aptos"/>
+          <w:sz w:val="20"/>
+        </w:rPr>
+        <w:t>The current draft contains 18 photos across 10 dates. Coverage is strongest around the December 2025 Bulgaria trip and is thinner for ordinary life in Australia.</w:t>
+      </w:r>
+    </w:p>
+    <w:p>
+      <w:pPr>
+        <w:keepLines w:val="0"/>
+        <w:spacing w:after="70"/>
+        <w:ind w:left="317" w:hanging="259"/>
+      </w:pPr>
+      <w:r>
+        <w:rPr>
+          <w:rFonts w:ascii="Aptos" w:hAnsi="Aptos"/>
+          <w:b/>
+          <w:color w:val="9C4800"/>
+          <w:sz w:val="19"/>
+        </w:rPr>
+        <w:t xml:space="preserve">TO DO  </w:t>
+      </w:r>
+      <w:r>
+        <w:rPr>
+          <w:rFonts w:ascii="Aptos" w:hAnsi="Aptos"/>
+          <w:b/>
+          <w:sz w:val="20"/>
+        </w:rPr>
+        <w:t>Highest priority: August–October 2026</w:t>
+      </w:r>
+      <w:r>
+        <w:rPr>
+          <w:rFonts w:ascii="Aptos" w:hAnsi="Aptos"/>
+          <w:sz w:val="20"/>
+        </w:rPr>
+        <w:t xml:space="preserve"> — add two or three recent photos showing the relationship continuing to the current date.</w:t>
+      </w:r>
+    </w:p>
+    <w:p>
+      <w:pPr>
+        <w:keepLines w:val="0"/>
+        <w:spacing w:after="70"/>
+        <w:ind w:left="317" w:hanging="259"/>
+      </w:pPr>
+      <w:r>
+        <w:rPr>
+          <w:rFonts w:ascii="Aptos" w:hAnsi="Aptos"/>
+          <w:b/>
+          <w:color w:val="9C4800"/>
+          <w:sz w:val="19"/>
+        </w:rPr>
+        <w:t xml:space="preserve">TO DO  </w:t>
+      </w:r>
+      <w:r>
+        <w:rPr>
+          <w:rFonts w:ascii="Aptos" w:hAnsi="Aptos"/>
+          <w:b/>
+          <w:sz w:val="20"/>
+        </w:rPr>
+        <w:t>March–May 2026 gap</w:t>
+      </w:r>
+      <w:r>
+        <w:rPr>
+          <w:rFonts w:ascii="Aptos" w:hAnsi="Aptos"/>
+          <w:sz w:val="20"/>
+        </w:rPr>
+        <w:t xml:space="preserve"> — add two or three photos if available.</w:t>
+      </w:r>
+    </w:p>
+    <w:p>
+      <w:pPr>
+        <w:keepLines w:val="0"/>
+        <w:spacing w:after="70"/>
+        <w:ind w:left="317" w:hanging="259"/>
+      </w:pPr>
+      <w:r>
+        <w:rPr>
+          <w:rFonts w:ascii="Aptos" w:hAnsi="Aptos"/>
+          <w:b/>
+          <w:color w:val="9C4800"/>
+          <w:sz w:val="19"/>
+        </w:rPr>
+        <w:t xml:space="preserve">TO DO  </w:t>
+      </w:r>
+      <w:r>
+        <w:rPr>
+          <w:rFonts w:ascii="Aptos" w:hAnsi="Aptos"/>
+          <w:b/>
+          <w:sz w:val="20"/>
+        </w:rPr>
+        <w:t>September–November 2025</w:t>
+      </w:r>
+      <w:r>
+        <w:rPr>
+          <w:rFonts w:ascii="Aptos" w:hAnsi="Aptos"/>
+          <w:sz w:val="20"/>
+        </w:rPr>
+        <w:t xml:space="preserve"> — add one or two photos, ideally after Kristina returned from Bali.</w:t>
+      </w:r>
+    </w:p>
+    <w:p>
+      <w:pPr>
+        <w:keepLines w:val="0"/>
+        <w:spacing w:after="70"/>
+        <w:ind w:left="317" w:hanging="259"/>
+      </w:pPr>
+      <w:r>
+        <w:rPr>
+          <w:rFonts w:ascii="Aptos" w:hAnsi="Aptos"/>
+          <w:b/>
+          <w:color w:val="9C4800"/>
+          <w:sz w:val="19"/>
+        </w:rPr>
+        <w:t xml:space="preserve">TO DO  </w:t>
+      </w:r>
+      <w:r>
+        <w:rPr>
+          <w:rFonts w:ascii="Aptos" w:hAnsi="Aptos"/>
+          <w:b/>
+          <w:sz w:val="20"/>
+        </w:rPr>
+        <w:t>Ordinary shared life</w:t>
+      </w:r>
+      <w:r>
+        <w:rPr>
+          <w:rFonts w:ascii="Aptos" w:hAnsi="Aptos"/>
+          <w:sz w:val="20"/>
+        </w:rPr>
+        <w:t xml:space="preserve"> — add one or two photos at home, walking or caring for the dog, cooking, or doing everyday activities together.</w:t>
+      </w:r>
+    </w:p>
+    <w:p>
+      <w:pPr>
+        <w:keepLines w:val="0"/>
+        <w:spacing w:after="70"/>
+        <w:ind w:left="317" w:hanging="259"/>
+      </w:pPr>
+      <w:r>
+        <w:rPr>
+          <w:rFonts w:ascii="Aptos" w:hAnsi="Aptos"/>
+          <w:b/>
+          <w:color w:val="9C4800"/>
+          <w:sz w:val="19"/>
+        </w:rPr>
+        <w:t xml:space="preserve">TO DO  </w:t>
+      </w:r>
+      <w:r>
+        <w:rPr>
+          <w:rFonts w:ascii="Aptos" w:hAnsi="Aptos"/>
+          <w:b/>
+          <w:sz w:val="20"/>
+        </w:rPr>
+        <w:t>Australian family and friends</w:t>
+      </w:r>
+      <w:r>
+        <w:rPr>
+          <w:rFonts w:ascii="Aptos" w:hAnsi="Aptos"/>
+          <w:sz w:val="20"/>
+        </w:rPr>
+        <w:t xml:space="preserve"> — add one or two photos from social occasions in Australia if available.</w:t>
+      </w:r>
+    </w:p>
+    <w:p>
+      <w:pPr>
+        <w:keepLines w:val="0"/>
+        <w:spacing w:after="70"/>
+        <w:ind w:left="317" w:hanging="259"/>
+      </w:pPr>
+      <w:r>
+        <w:rPr>
+          <w:rFonts w:ascii="Aptos" w:hAnsi="Aptos"/>
+          <w:b/>
+          <w:color w:val="9C4800"/>
+          <w:sz w:val="19"/>
+        </w:rPr>
+        <w:t xml:space="preserve">TO DO  </w:t>
+      </w:r>
+      <w:r>
+        <w:rPr>
+          <w:rFonts w:ascii="Aptos" w:hAnsi="Aptos"/>
+          <w:b/>
+          <w:sz w:val="20"/>
+        </w:rPr>
+        <w:t>Milestones</w:t>
+      </w:r>
+      <w:r>
+        <w:rPr>
+          <w:rFonts w:ascii="Aptos" w:hAnsi="Aptos"/>
+          <w:sz w:val="20"/>
+        </w:rPr>
+        <w:t xml:space="preserve"> — consider one photo from TAFE completion, sanctuary work or volunteering if it naturally includes both partners or shows mutual support.</w:t>
+      </w:r>
+    </w:p>
+    <w:p>
+      <w:pPr>
+        <w:keepLines w:val="0"/>
+        <w:spacing w:after="70"/>
+        <w:ind w:left="317" w:hanging="259"/>
+      </w:pPr>
+      <w:r>
+        <w:rPr>
+          <w:rFonts w:ascii="Aptos" w:hAnsi="Aptos"/>
+          <w:b/>
+          <w:color w:val="9C4800"/>
+          <w:sz w:val="19"/>
+        </w:rPr>
+        <w:t xml:space="preserve">TO DO  </w:t>
+      </w:r>
+      <w:r>
+        <w:rPr>
+          <w:rFonts w:ascii="Aptos" w:hAnsi="Aptos"/>
+          <w:sz w:val="20"/>
+        </w:rPr>
+        <w:t>Ask Kristina for approximately 8–12 candidate photos, then select 6–8 additions. Prioritise missing periods and settings rather than adding more Christmas duplicates or near-identical selfies.</w:t>
       </w:r>
     </w:p>
     <w:p>
@@ -3297,6 +3762,9 @@
     <w:qFormat/>
     <w:rsid w:val="00FC693F"/>
     <w:pPr>
+      <w:pBdr>
+        <w:bottom w:val="single" w:sz="8" w:space="4" w:color="4F81BD" w:themeColor="accent1"/>
+      </w:pBdr>
       <w:spacing w:after="240" w:line="240" w:lineRule="auto"/>
       <w:contextualSpacing/>
     </w:pPr>

</xml_diff>

<commit_message>
vault backup: 2026-10-18 08:41:05
</commit_message>
<xml_diff>
--- a/Visa/801 - Permanent Residency/Prepared Documents/Visa 801 Document Checklist.docx
+++ b/Visa/801 - Permanent Residency/Prepared Documents/Visa 801 Document Checklist.docx
@@ -215,7 +215,7 @@
           <w:rFonts w:ascii="Aptos" w:hAnsi="Aptos"/>
           <w:sz w:val="20"/>
         </w:rPr>
-        <w:t xml:space="preserve"> — three ordinary Bali Messages screenshots from 6–8 October 2025 have been gathered locally. Their upload to Google Drive is pending Scott's explicit approval because they contain private messages. Add evidence for other relevant separations if available.</w:t>
+        <w:t xml:space="preserve"> — three ordinary Bali Messages screenshots from 6–8 October 2025 have been gathered and uploaded to Google Drive. Ask Affinity whether separate dates and contact evidence are required for the shorter absences involving family events, TAFE excursions and Sydney Bats; add further evidence only if requested or readily available.</w:t>
       </w:r>
     </w:p>
     <w:p>
@@ -759,7 +759,7 @@
           <w:rFonts w:ascii="Aptos" w:hAnsi="Aptos"/>
           <w:sz w:val="20"/>
         </w:rPr>
-        <w:t>Three ordinary Messages screenshots gathered locally for the Bali separation, covering 6–8 October 2025. They have not yet been uploaded to Google Drive.</w:t>
+        <w:t>Three ordinary Messages screenshots gathered for the Bali separation, covering 6–8 October 2025, and uploaded to the Google Drive Contact During Separation folder.</w:t>
       </w:r>
     </w:p>
     <w:p>
@@ -2014,14 +2014,14 @@
           <w:b/>
           <w:sz w:val="20"/>
         </w:rPr>
-        <w:t>Kristina's superannuation beneficiary nomination</w:t>
+        <w:t>Kristina's superannuation beneficiary evidence</w:t>
       </w:r>
       <w:r>
         <w:rPr>
           <w:rFonts w:ascii="Aptos" w:hAnsi="Aptos"/>
           <w:sz w:val="20"/>
         </w:rPr>
-        <w:t xml:space="preserve"> — confirm whether Scott has personally seen the nomination. If yes, record the fund, nomination type and percentage if shown. If not, remove the claim from the statement until evidence is obtained.</w:t>
+        <w:t xml:space="preserve"> — Scott has personally seen the nomination in Kristina's AustralianSuper account. Log in with Kristina and capture evidence showing Scott as beneficiary; record the nomination type and percentage if displayed.</w:t>
       </w:r>
     </w:p>
     <w:p>
@@ -2034,10 +2034,10 @@
         <w:rPr>
           <w:rFonts w:ascii="Aptos" w:hAnsi="Aptos"/>
           <w:b/>
-          <w:color w:val="9C4800"/>
+          <w:color w:val="1A703D"/>
           <w:sz w:val="19"/>
         </w:rPr>
-        <w:t xml:space="preserve">TO DO  </w:t>
+        <w:t xml:space="preserve">DONE  </w:t>
       </w:r>
       <w:r>
         <w:rPr>
@@ -2045,14 +2045,14 @@
           <w:b/>
           <w:sz w:val="20"/>
         </w:rPr>
-        <w:t>Bali contact</w:t>
+        <w:t>Bali contact wording</w:t>
       </w:r>
       <w:r>
         <w:rPr>
           <w:rFonts w:ascii="Aptos" w:hAnsi="Aptos"/>
           <w:sz w:val="20"/>
         </w:rPr>
-        <w:t xml:space="preserve"> — confirm whether messages were exchanged every day and approximately how many FaceTime or phone calls occurred. Replace “as I recall” and “a few times” with the confirmed wording. Three message screenshots from 6–8 October 2025 are available locally.</w:t>
+        <w:t xml:space="preserve"> — use: “We remained in regular contact through messages on most days and video calls when her schedule allowed.” Do not claim daily contact or a specific call count. Three message screenshots from 6–8 October 2025 have been uploaded to Drive.</w:t>
       </w:r>
     </w:p>
     <w:p>
@@ -2083,7 +2083,7 @@
           <w:rFonts w:ascii="Aptos" w:hAnsi="Aptos"/>
           <w:sz w:val="20"/>
         </w:rPr>
-        <w:t xml:space="preserve"> — definite solo work travel is confirmed for Sydney from 11 to 14 May 2026. Confirm how contact was maintained on that trip. Also give approximate dates, number of nights, who travelled, who remained home and how contact was maintained for the brother's house move, birthdays, each TAFE excursion and Sydney Bats trip. A work activity places Scott in Concord West on 10 November 2025; confirm the surrounding travel dates and whether Kristina accompanied him.</w:t>
+        <w:t xml:space="preserve"> — ask Affinity whether exact dates, durations and separate contact evidence are required for the short absences involving the brother's house move, birthdays, TAFE excursions and Sydney Bats. Definite solo work travel is confirmed for Sydney from 11 to 14 May 2026. The circumstances around the 10 November 2025 Concord West work activity remain unknown; ask Affinity whether this needs to be resolved or included.</w:t>
       </w:r>
     </w:p>
     <w:p>
@@ -2107,14 +2107,14 @@
           <w:b/>
           <w:sz w:val="20"/>
         </w:rPr>
-        <w:t>Sanctuary work and income</w:t>
+        <w:t>Sanctuary role title</w:t>
       </w:r>
       <w:r>
         <w:rPr>
           <w:rFonts w:ascii="Aptos" w:hAnsi="Aptos"/>
           <w:sz w:val="20"/>
         </w:rPr>
-        <w:t xml:space="preserve"> — confirm Kristina's role title, exact first shift date if known, and whether her first pay has already been deposited into joint 2Up or this is only the intended arrangement.</w:t>
+        <w:t xml:space="preserve"> — first shift confirmed as 1 October 2026 and first pay confirmed as deposited into joint 2Up. Add the exact role title if it is readily available from the contract or payslip.</w:t>
       </w:r>
     </w:p>
     <w:p>
@@ -2127,10 +2127,10 @@
         <w:rPr>
           <w:rFonts w:ascii="Aptos" w:hAnsi="Aptos"/>
           <w:b/>
-          <w:color w:val="9C4800"/>
+          <w:color w:val="1A703D"/>
           <w:sz w:val="19"/>
         </w:rPr>
-        <w:t xml:space="preserve">TO DO  </w:t>
+        <w:t xml:space="preserve">DONE  </w:t>
       </w:r>
       <w:r>
         <w:rPr>
@@ -2145,7 +2145,7 @@
           <w:rFonts w:ascii="Aptos" w:hAnsi="Aptos"/>
           <w:sz w:val="20"/>
         </w:rPr>
-        <w:t xml:space="preserve"> — confirm the renewal period is 27 July 2026 to 25 January 2027.</w:t>
+        <w:t xml:space="preserve"> — renewal period 27 July 2026 to 25 January 2027 is confirmed by Scott and appears in the lease document.</w:t>
       </w:r>
     </w:p>
     <w:p>
@@ -2158,10 +2158,10 @@
         <w:rPr>
           <w:rFonts w:ascii="Aptos" w:hAnsi="Aptos"/>
           <w:b/>
-          <w:color w:val="9C4800"/>
+          <w:color w:val="1A703D"/>
           <w:sz w:val="19"/>
         </w:rPr>
-        <w:t xml:space="preserve">TO DO  </w:t>
+        <w:t xml:space="preserve">DONE  </w:t>
       </w:r>
       <w:r>
         <w:rPr>
@@ -2176,7 +2176,7 @@
           <w:rFonts w:ascii="Aptos" w:hAnsi="Aptos"/>
           <w:sz w:val="20"/>
         </w:rPr>
-        <w:t xml:space="preserve"> — confirm “Web Developer” remains the correct occupation and whether the October 2024 start date should be stated more precisely.</w:t>
+        <w:t xml:space="preserve"> — use “Software Engineer”; employment commenced 21 October 2024.</w:t>
       </w:r>
     </w:p>
     <w:p>
@@ -2189,10 +2189,10 @@
         <w:rPr>
           <w:rFonts w:ascii="Aptos" w:hAnsi="Aptos"/>
           <w:b/>
-          <w:color w:val="9C4800"/>
+          <w:color w:val="1A703D"/>
           <w:sz w:val="19"/>
         </w:rPr>
-        <w:t xml:space="preserve">TO DO  </w:t>
+        <w:t xml:space="preserve">DONE  </w:t>
       </w:r>
       <w:r>
         <w:rPr>
@@ -2207,7 +2207,7 @@
           <w:rFonts w:ascii="Aptos" w:hAnsi="Aptos"/>
           <w:sz w:val="20"/>
         </w:rPr>
-        <w:t xml:space="preserve"> — decide whether to state Kristina's father's date of death or keep the timing general. No exact date is needed unless Scott wants it included.</w:t>
+        <w:t xml:space="preserve"> — keep the timing general. The exact date of death is not necessary for the relationship narrative unless Affinity requests it or Scott chooses to include it.</w:t>
       </w:r>
     </w:p>
     <w:p>
@@ -2399,17 +2399,17 @@
         <w:rPr>
           <w:rFonts w:ascii="Aptos" w:hAnsi="Aptos"/>
           <w:b/>
-          <w:color w:val="9C4800"/>
+          <w:color w:val="1A703D"/>
           <w:sz w:val="19"/>
         </w:rPr>
-        <w:t xml:space="preserve">TO DO  </w:t>
+        <w:t xml:space="preserve">DONE  </w:t>
       </w:r>
       <w:r>
         <w:rPr>
           <w:rFonts w:ascii="Aptos" w:hAnsi="Aptos"/>
           <w:sz w:val="20"/>
         </w:rPr>
-        <w:t>Contact during separation — three dated Bali Messages screenshots from 6–8 October 2025 are gathered locally. Uploading these private screenshots to the Drive Evidence folder remains pending Scott's explicit approval. Add dated evidence from other periods apart if available.</w:t>
+        <w:t>Contact during separation — three dated Bali Messages screenshots from 6–8 October 2025 are uploaded to the Drive Contact During Separation folder. Ask Affinity whether further records are required for brief absences.</w:t>
       </w:r>
     </w:p>
     <w:p>

</xml_diff>

<commit_message>
vault backup: 2026-10-18 08:53:51
</commit_message>
<xml_diff>
--- a/Visa/801 - Permanent Residency/Prepared Documents/Visa 801 Document Checklist.docx
+++ b/Visa/801 - Permanent Residency/Prepared Documents/Visa 801 Document Checklist.docx
@@ -690,7 +690,7 @@
           <w:rFonts w:ascii="Aptos" w:hAnsi="Aptos"/>
           <w:sz w:val="20"/>
         </w:rPr>
-        <w:t>Sydney travel review completed from available email and calendar evidence: definite solo work trip 11–14 May 2026; work activity in Concord West on 10 November 2025 with surrounding travel dates and whether Kristina accompanied Scott still to be confirmed; joint Sydney trip 27 February–1 March 2026 excluded from periods apart.</w:t>
+        <w:t>Sydney travel review completed from available email and calendar evidence: definite solo work trip 11–14 May 2026; joint Sydney trip 27 February–1 March 2026 excluded from periods apart. A go-kart waiver signed on 10 November 2025 does not establish attendance or travel and has been removed from the travel analysis.</w:t>
       </w:r>
     </w:p>
     <w:p>
@@ -1094,7 +1094,7 @@
           <w:rFonts w:ascii="Aptos" w:hAnsi="Aptos"/>
           <w:sz w:val="20"/>
         </w:rPr>
-        <w:t xml:space="preserve">[P1] #kristina  #scott provide updated relationship documents since the grant of your Subclass 820 visa (original agency wording says “729”; confirm this correction with Affinity) - From 24th Sep 2025 to current - Examples of documents — </w:t>
+        <w:t xml:space="preserve">[P1] #kristina  #scott provide updated relationship documents since the grant of your Subclass 820 visa - From 24th Sep 2025 to current - Examples of documents — </w:t>
       </w:r>
       <w:r>
         <w:rPr>
@@ -1115,18 +1115,17 @@
         <w:rPr>
           <w:rFonts w:ascii="Aptos" w:hAnsi="Aptos"/>
           <w:b/>
-          <w:color w:val="9C4800"/>
+          <w:color w:val="1A703D"/>
           <w:sz w:val="19"/>
-          <w:highlight w:val="yellow"/>
-        </w:rPr>
-        <w:t xml:space="preserve">TO DO  </w:t>
+        </w:rPr>
+        <w:t xml:space="preserve">DONE  </w:t>
       </w:r>
       <w:r>
         <w:rPr>
           <w:rFonts w:ascii="Aptos" w:hAnsi="Aptos"/>
           <w:sz w:val="20"/>
         </w:rPr>
-        <w:t xml:space="preserve">[P1] Evidence of joint ownership or real estate or other major assets (e.g. cars, appliances) and any joint liabilities (loans, mortgages, insurance) - that have been acquired or taken out since Sep 2025 if applicable — </w:t>
+        <w:t xml:space="preserve">[P1] Evidence of joint ownership or real estate or other major assets (e.g. cars, appliances) and any joint liabilities (loans, mortgages, insurance) acquired or taken out since Sep 2025, if applicable — </w:t>
       </w:r>
       <w:r>
         <w:rPr>
@@ -1134,7 +1133,7 @@
           <w:b/>
           <w:sz w:val="20"/>
         </w:rPr>
-        <w:t>PARTIAL: car purchase, insurance and registration-related evidence gathered. The car was purchased before September 2025 and is legally in Scott's name, so confirm with Affinity whether it should be included as contextual household evidence.</w:t>
+        <w:t>NOT APPLICABLE: Scott confirmed that no genuinely joint asset or liability was acquired from 24 September 2025 onward.</w:t>
       </w:r>
     </w:p>
     <w:p>
@@ -1170,17 +1169,17 @@
         <w:rPr>
           <w:rFonts w:ascii="Aptos" w:hAnsi="Aptos"/>
           <w:b/>
-          <w:color w:val="9C4800"/>
+          <w:color w:val="1A703D"/>
           <w:sz w:val="19"/>
         </w:rPr>
-        <w:t xml:space="preserve">TO DO  </w:t>
+        <w:t xml:space="preserve">DONE  </w:t>
       </w:r>
       <w:r>
         <w:rPr>
           <w:rFonts w:ascii="Aptos" w:hAnsi="Aptos"/>
           <w:sz w:val="20"/>
         </w:rPr>
-        <w:t>Confirm whether any genuinely joint asset or liability was acquired from 24 September 2025 onward. If none, record that the category is not applicable rather than overstating sole-name evidence.</w:t>
+        <w:t>No post-grant joint asset or liability to report. Do not overstate the sole-name car or loans as jointly owned.</w:t>
       </w:r>
     </w:p>
     <w:p>
@@ -2083,7 +2082,7 @@
           <w:rFonts w:ascii="Aptos" w:hAnsi="Aptos"/>
           <w:sz w:val="20"/>
         </w:rPr>
-        <w:t xml:space="preserve"> — ask Affinity whether exact dates, durations and separate contact evidence are required for the short absences involving the brother's house move, birthdays, TAFE excursions and Sydney Bats. Definite solo work travel is confirmed for Sydney from 11 to 14 May 2026. The circumstances around the 10 November 2025 Concord West work activity remain unknown; ask Affinity whether this needs to be resolved or included.</w:t>
+        <w:t xml:space="preserve"> — ask Affinity whether exact dates, durations and separate contact evidence are required for the short absences involving the brother's house move, birthdays, TAFE excursions and Sydney Bats. Definite solo work travel is confirmed for Sydney from 11 to 14 May 2026.</w:t>
       </w:r>
     </w:p>
     <w:p>
@@ -2501,7 +2500,7 @@
           <w:rFonts w:ascii="Aptos" w:hAnsi="Aptos"/>
           <w:sz w:val="20"/>
         </w:rPr>
-        <w:t>Urunga lease — if precise historic tenancy coverage is needed, clarify the scan’s ticked six-month term versus its written end date of 10 February 2025, and any continuation. The commencement date is confirmed as 11 November 2024.</w:t>
+        <w:t>Urunga lease — clarify with Scott why the agreement ticks a six-month fixed term but writes an end date of 10 February 2025, and whether the tenancy then continued periodically or under another agreement until the move to Coffs Harbour. The commencement date is confirmed as 11 November 2024.</w:t>
       </w:r>
     </w:p>
     <w:p>
@@ -2524,7 +2523,7 @@
           <w:rFonts w:ascii="Aptos" w:hAnsi="Aptos"/>
           <w:sz w:val="20"/>
         </w:rPr>
-        <w:t>Agency wording — confirm the “Subclass 729” reference means 820 and whether Kristina’s Bulgarian licence is wanted.</w:t>
+        <w:t>Agency question — confirm whether Kristina’s Bulgarian licence is wanted.</w:t>
       </w:r>
     </w:p>
     <w:p>

</xml_diff>

<commit_message>
vault backup: 2026-10-18 09:28:11
</commit_message>
<xml_diff>
--- a/Visa/801 - Permanent Residency/Prepared Documents/Visa 801 Document Checklist.docx
+++ b/Visa/801 - Permanent Residency/Prepared Documents/Visa 801 Document Checklist.docx
@@ -183,7 +183,7 @@
           <w:rFonts w:ascii="Aptos" w:hAnsi="Aptos"/>
           <w:sz w:val="20"/>
         </w:rPr>
-        <w:t xml:space="preserve"> — 18 curated photos from August 2025 to July 2026 have been placed into a draft timeline. Ask Kristina for additional candidates covering August–October 2026, March–May 2026 and ordinary life or Australian social occasions; then select approximately 6–8 additions.</w:t>
+        <w:t xml:space="preserve"> — Kristina added further photos and 24 curated photos across 16 dates from August 2025 to August 2026 are now in the draft timeline. The new selection adds June–August 2026 family, social and couple photos. If available, add one or two photos from March–May 2026 and one or two from September–October 2026; otherwise ask Affinity whether the present coverage is sufficient.</w:t>
       </w:r>
     </w:p>
     <w:p>
@@ -690,7 +690,7 @@
           <w:rFonts w:ascii="Aptos" w:hAnsi="Aptos"/>
           <w:sz w:val="20"/>
         </w:rPr>
-        <w:t>Sydney travel review completed from available email and calendar evidence: definite solo work trip 11–14 May 2026; joint Sydney trip 27 February–1 March 2026 excluded from periods apart. A go-kart waiver signed on 10 November 2025 does not establish attendance or travel and has been removed from the travel analysis.</w:t>
+        <w:t>Sydney travel review completed from available email and calendar evidence: definite solo work trip 11–14 May 2026; joint Sydney trip 27 February–1 March 2026 excluded from periods apart. Scott confirmed that the 10 November 2025 Concord West activity was another solo Sydney work trip, but it is unnecessary for the submission and has been left out.</w:t>
       </w:r>
     </w:p>
     <w:p>
@@ -736,7 +736,7 @@
           <w:rFonts w:ascii="Aptos" w:hAnsi="Aptos"/>
           <w:sz w:val="20"/>
         </w:rPr>
-        <w:t>Eighteen curated relationship photos exported from Photos for the timeline, covering August 2025 to July 2026.</w:t>
+        <w:t>Thirty-four relationship photos reviewed from the Photos album. Twenty-four were selected for the draft timeline, covering 16 dates from August 2025 to August 2026.</w:t>
       </w:r>
     </w:p>
     <w:p>
@@ -1573,17 +1573,25 @@
         <w:rPr>
           <w:rFonts w:ascii="Aptos" w:hAnsi="Aptos"/>
           <w:b/>
-          <w:color w:val="9C4800"/>
+          <w:color w:val="1A703D"/>
           <w:sz w:val="19"/>
         </w:rPr>
-        <w:t xml:space="preserve">TO DO  </w:t>
+        <w:t xml:space="preserve">DONE  </w:t>
       </w:r>
       <w:r>
         <w:rPr>
           <w:rFonts w:ascii="Aptos" w:hAnsi="Aptos"/>
           <w:sz w:val="20"/>
         </w:rPr>
-        <w:t>Terms of your wills</w:t>
+        <w:t xml:space="preserve">Terms of your wills — </w:t>
+      </w:r>
+      <w:r>
+        <w:rPr>
+          <w:rFonts w:ascii="Aptos" w:hAnsi="Aptos"/>
+          <w:b/>
+          <w:sz w:val="20"/>
+        </w:rPr>
+        <w:t>NOT BEING RELIED ON for this submission.</w:t>
       </w:r>
     </w:p>
     <w:p>
@@ -1670,7 +1678,7 @@
           <w:b/>
           <w:sz w:val="20"/>
         </w:rPr>
-        <w:t>IN PROGRESS: 18 photos exported and placed into a draft timeline.</w:t>
+        <w:t>IN PROGRESS: 24 photos across 16 dates have been placed into the updated draft timeline.</w:t>
       </w:r>
     </w:p>
     <w:p>
@@ -1706,29 +1714,17 @@
         <w:rPr>
           <w:rFonts w:ascii="Aptos" w:hAnsi="Aptos"/>
           <w:b/>
-          <w:color w:val="9C4800"/>
+          <w:color w:val="1A703D"/>
           <w:sz w:val="19"/>
         </w:rPr>
-        <w:t xml:space="preserve">TO DO  </w:t>
+        <w:t xml:space="preserve">DONE  </w:t>
       </w:r>
       <w:r>
         <w:rPr>
           <w:rFonts w:ascii="Aptos" w:hAnsi="Aptos"/>
           <w:sz w:val="20"/>
         </w:rPr>
-        <w:t>Add recent photos for August to October 2026 and, if available, fill the March to May 2026 gap so the final set better matches the agency's suggestion of two to three photos every two months.</w:t>
-      </w:r>
-    </w:p>
-    <w:p>
-      <w:pPr>
-        <w:pStyle w:val="Heading1"/>
-      </w:pPr>
-      <w:r>
-        <w:rPr>
-          <w:rFonts w:ascii="Aptos" w:hAnsi="Aptos"/>
-          <w:sz w:val="30"/>
-        </w:rPr>
-        <w:t>Health and character documents</w:t>
+        <w:t>Add recent photos through August 2026 and broaden family, social and ordinary-activity coverage.</w:t>
       </w:r>
     </w:p>
     <w:p>
@@ -1741,6 +1737,41 @@
         <w:rPr>
           <w:rFonts w:ascii="Aptos" w:hAnsi="Aptos"/>
           <w:b/>
+          <w:color w:val="9C4800"/>
+          <w:sz w:val="19"/>
+        </w:rPr>
+        <w:t xml:space="preserve">TO DO  </w:t>
+      </w:r>
+      <w:r>
+        <w:rPr>
+          <w:rFonts w:ascii="Aptos" w:hAnsi="Aptos"/>
+          <w:sz w:val="20"/>
+        </w:rPr>
+        <w:t>If available, add one or two photos from March to May 2026 and one or two from September to October 2026; otherwise confirm with Affinity that the present coverage is sufficient.</w:t>
+      </w:r>
+    </w:p>
+    <w:p>
+      <w:pPr>
+        <w:pStyle w:val="Heading1"/>
+      </w:pPr>
+      <w:r>
+        <w:rPr>
+          <w:rFonts w:ascii="Aptos" w:hAnsi="Aptos"/>
+          <w:sz w:val="30"/>
+        </w:rPr>
+        <w:t>Health and character documents</w:t>
+      </w:r>
+    </w:p>
+    <w:p>
+      <w:pPr>
+        <w:keepLines w:val="0"/>
+        <w:spacing w:after="70"/>
+        <w:ind w:left="706" w:hanging="259"/>
+      </w:pPr>
+      <w:r>
+        <w:rPr>
+          <w:rFonts w:ascii="Aptos" w:hAnsi="Aptos"/>
+          <w:b/>
           <w:color w:val="1A703D"/>
           <w:sz w:val="19"/>
         </w:rPr>
@@ -2490,17 +2521,17 @@
         <w:rPr>
           <w:rFonts w:ascii="Aptos" w:hAnsi="Aptos"/>
           <w:b/>
-          <w:color w:val="9C4800"/>
+          <w:color w:val="1A703D"/>
           <w:sz w:val="19"/>
         </w:rPr>
-        <w:t xml:space="preserve">TO DO  </w:t>
+        <w:t xml:space="preserve">DONE  </w:t>
       </w:r>
       <w:r>
         <w:rPr>
           <w:rFonts w:ascii="Aptos" w:hAnsi="Aptos"/>
           <w:sz w:val="20"/>
         </w:rPr>
-        <w:t>Urunga lease — clarify with Scott why the agreement ticks a six-month fixed term but writes an end date of 10 February 2025, and whether the tenancy then continued periodically or under another agreement until the move to Coffs Harbour. The commencement date is confirmed as 11 November 2024.</w:t>
+        <w:t>Urunga lease — Scott confirmed that after the fixed term the tenancy continued periodically until Scott and Kristina moved to Coffs Harbour in July 2025.</w:t>
       </w:r>
     </w:p>
     <w:p>
@@ -2546,7 +2577,28 @@
           <w:rFonts w:ascii="Aptos" w:hAnsi="Aptos"/>
           <w:sz w:val="20"/>
         </w:rPr>
-        <w:t>Wills — establish whether relevant existing wills are available; this is not a task to create new wills.</w:t>
+        <w:t>Optional supporting records — locate course completion certificates, sanctuary contract/payslip, volunteering records and veterinary invoices/loan records where useful. These are supporting suggestions, not additional agency requirements.</w:t>
+      </w:r>
+    </w:p>
+    <w:p>
+      <w:pPr>
+        <w:pStyle w:val="Heading1"/>
+      </w:pPr>
+      <w:r>
+        <w:rPr>
+          <w:rFonts w:ascii="Aptos" w:hAnsi="Aptos"/>
+          <w:sz w:val="30"/>
+        </w:rPr>
+        <w:t>Photo timeline review and gaps</w:t>
+      </w:r>
+    </w:p>
+    <w:p>
+      <w:r>
+        <w:rPr>
+          <w:rFonts w:ascii="Aptos" w:hAnsi="Aptos"/>
+          <w:sz w:val="20"/>
+        </w:rPr>
+        <w:t>The updated draft contains 24 photos across 16 dates from August 2025 to August 2026. Kristina's added photos improve June–August 2026 coverage and add family, friends, walking, sailing and a current couple photograph.</w:t>
       </w:r>
     </w:p>
     <w:p>
@@ -2559,38 +2611,25 @@
         <w:rPr>
           <w:rFonts w:ascii="Aptos" w:hAnsi="Aptos"/>
           <w:b/>
-          <w:color w:val="9C4800"/>
+          <w:color w:val="1A703D"/>
           <w:sz w:val="19"/>
         </w:rPr>
-        <w:t xml:space="preserve">TO DO  </w:t>
-      </w:r>
-      <w:r>
-        <w:rPr>
-          <w:rFonts w:ascii="Aptos" w:hAnsi="Aptos"/>
+        <w:t xml:space="preserve">DONE  </w:t>
+      </w:r>
+      <w:r>
+        <w:rPr>
+          <w:rFonts w:ascii="Aptos" w:hAnsi="Aptos"/>
+          <w:b/>
           <w:sz w:val="20"/>
         </w:rPr>
-        <w:t>Optional supporting records — locate course completion certificates, sanctuary contract/payslip, volunteering records and veterinary invoices/loan records where useful. These are supporting suggestions, not additional agency requirements.</w:t>
-      </w:r>
-    </w:p>
-    <w:p>
-      <w:pPr>
-        <w:pStyle w:val="Heading1"/>
-      </w:pPr>
-      <w:r>
-        <w:rPr>
-          <w:rFonts w:ascii="Aptos" w:hAnsi="Aptos"/>
-          <w:sz w:val="30"/>
-        </w:rPr>
-        <w:t>Photo timeline review and gaps</w:t>
-      </w:r>
-    </w:p>
-    <w:p>
+        <w:t>Recent coverage</w:t>
+      </w:r>
       <w:r>
         <w:rPr>
           <w:rFonts w:ascii="Aptos" w:hAnsi="Aptos"/>
           <w:sz w:val="20"/>
         </w:rPr>
-        <w:t>The current draft contains 18 photos across 10 dates. Coverage is strongest around the December 2025 Bulgaria trip and is thinner for ordinary life in Australia.</w:t>
+        <w:t xml:space="preserve"> — added recent photos through 29 August 2026.</w:t>
       </w:r>
     </w:p>
     <w:p>
@@ -2614,14 +2653,14 @@
           <w:b/>
           <w:sz w:val="20"/>
         </w:rPr>
-        <w:t>Highest priority: August–October 2026</w:t>
+        <w:t>March–May 2026 gap</w:t>
       </w:r>
       <w:r>
         <w:rPr>
           <w:rFonts w:ascii="Aptos" w:hAnsi="Aptos"/>
           <w:sz w:val="20"/>
         </w:rPr>
-        <w:t xml:space="preserve"> — add two or three recent photos showing the relationship continuing to the current date.</w:t>
+        <w:t xml:space="preserve"> — add one or two photos if available.</w:t>
       </w:r>
     </w:p>
     <w:p>
@@ -2645,14 +2684,14 @@
           <w:b/>
           <w:sz w:val="20"/>
         </w:rPr>
-        <w:t>March–May 2026 gap</w:t>
+        <w:t>September–October 2026 gap</w:t>
       </w:r>
       <w:r>
         <w:rPr>
           <w:rFonts w:ascii="Aptos" w:hAnsi="Aptos"/>
           <w:sz w:val="20"/>
         </w:rPr>
-        <w:t xml:space="preserve"> — add two or three photos if available.</w:t>
+        <w:t xml:space="preserve"> — add one or two current photos if available before finalising.</w:t>
       </w:r>
     </w:p>
     <w:p>
@@ -2665,10 +2704,10 @@
         <w:rPr>
           <w:rFonts w:ascii="Aptos" w:hAnsi="Aptos"/>
           <w:b/>
-          <w:color w:val="9C4800"/>
+          <w:color w:val="1A703D"/>
           <w:sz w:val="19"/>
         </w:rPr>
-        <w:t xml:space="preserve">TO DO  </w:t>
+        <w:t xml:space="preserve">DONE  </w:t>
       </w:r>
       <w:r>
         <w:rPr>
@@ -2676,14 +2715,14 @@
           <w:b/>
           <w:sz w:val="20"/>
         </w:rPr>
-        <w:t>September–November 2025</w:t>
+        <w:t>Ordinary shared life</w:t>
       </w:r>
       <w:r>
         <w:rPr>
           <w:rFonts w:ascii="Aptos" w:hAnsi="Aptos"/>
           <w:sz w:val="20"/>
         </w:rPr>
-        <w:t xml:space="preserve"> — add one or two photos, ideally after Kristina returned from Bali.</w:t>
+        <w:t xml:space="preserve"> — added walking and sailing photographs.</w:t>
       </w:r>
     </w:p>
     <w:p>
@@ -2696,10 +2735,10 @@
         <w:rPr>
           <w:rFonts w:ascii="Aptos" w:hAnsi="Aptos"/>
           <w:b/>
-          <w:color w:val="9C4800"/>
+          <w:color w:val="1A703D"/>
           <w:sz w:val="19"/>
         </w:rPr>
-        <w:t xml:space="preserve">TO DO  </w:t>
+        <w:t xml:space="preserve">DONE  </w:t>
       </w:r>
       <w:r>
         <w:rPr>
@@ -2707,14 +2746,14 @@
           <w:b/>
           <w:sz w:val="20"/>
         </w:rPr>
-        <w:t>Ordinary shared life</w:t>
+        <w:t>Australian family and friends</w:t>
       </w:r>
       <w:r>
         <w:rPr>
           <w:rFonts w:ascii="Aptos" w:hAnsi="Aptos"/>
           <w:sz w:val="20"/>
         </w:rPr>
-        <w:t xml:space="preserve"> — add one or two photos at home, walking or caring for the dog, cooking, or doing everyday activities together.</w:t>
+        <w:t xml:space="preserve"> — added social photographs with friends.</w:t>
       </w:r>
     </w:p>
     <w:p>
@@ -2738,14 +2777,14 @@
           <w:b/>
           <w:sz w:val="20"/>
         </w:rPr>
-        <w:t>Australian family and friends</w:t>
+        <w:t>Milestones</w:t>
       </w:r>
       <w:r>
         <w:rPr>
           <w:rFonts w:ascii="Aptos" w:hAnsi="Aptos"/>
           <w:sz w:val="20"/>
         </w:rPr>
-        <w:t xml:space="preserve"> — add one or two photos from social occasions in Australia if available.</w:t>
+        <w:t xml:space="preserve"> — consider one photo from TAFE completion, sanctuary work or volunteering if it naturally includes both partners or shows mutual support.</w:t>
       </w:r>
     </w:p>
     <w:p>
@@ -2758,48 +2797,17 @@
         <w:rPr>
           <w:rFonts w:ascii="Aptos" w:hAnsi="Aptos"/>
           <w:b/>
-          <w:color w:val="9C4800"/>
+          <w:color w:val="1A703D"/>
           <w:sz w:val="19"/>
         </w:rPr>
-        <w:t xml:space="preserve">TO DO  </w:t>
-      </w:r>
-      <w:r>
-        <w:rPr>
-          <w:rFonts w:ascii="Aptos" w:hAnsi="Aptos"/>
-          <w:b/>
+        <w:t xml:space="preserve">DONE  </w:t>
+      </w:r>
+      <w:r>
+        <w:rPr>
+          <w:rFonts w:ascii="Aptos" w:hAnsi="Aptos"/>
           <w:sz w:val="20"/>
         </w:rPr>
-        <w:t>Milestones</w:t>
-      </w:r>
-      <w:r>
-        <w:rPr>
-          <w:rFonts w:ascii="Aptos" w:hAnsi="Aptos"/>
-          <w:sz w:val="20"/>
-        </w:rPr>
-        <w:t xml:space="preserve"> — consider one photo from TAFE completion, sanctuary work or volunteering if it naturally includes both partners or shows mutual support.</w:t>
-      </w:r>
-    </w:p>
-    <w:p>
-      <w:pPr>
-        <w:keepLines w:val="0"/>
-        <w:spacing w:after="70"/>
-        <w:ind w:left="317" w:hanging="259"/>
-      </w:pPr>
-      <w:r>
-        <w:rPr>
-          <w:rFonts w:ascii="Aptos" w:hAnsi="Aptos"/>
-          <w:b/>
-          <w:color w:val="9C4800"/>
-          <w:sz w:val="19"/>
-        </w:rPr>
-        <w:t xml:space="preserve">TO DO  </w:t>
-      </w:r>
-      <w:r>
-        <w:rPr>
-          <w:rFonts w:ascii="Aptos" w:hAnsi="Aptos"/>
-          <w:sz w:val="20"/>
-        </w:rPr>
-        <w:t>Ask Kristina for approximately 8–12 candidate photos, then select 6–8 additions. Prioritise missing periods and settings rather than adding more Christmas duplicates or near-identical selfies.</w:t>
+        <w:t>Review Kristina's additional candidates and select six useful additions without adding more Christmas duplicates or near-identical selfies.</w:t>
       </w:r>
     </w:p>
     <w:p>
@@ -2883,7 +2891,7 @@
           <w:rFonts w:ascii="Aptos" w:hAnsi="Aptos"/>
           <w:sz w:val="20"/>
         </w:rPr>
-        <w:t>Urunga scan visually checked, pages 1–2: agreement made 8 November 2024; commencement 11 November 2024; Kristina and Scott named; address 28 Fitzroy Street, Urunga. The form ticks “6 months” but writes an end date of 10 February 2025. If Affinity needs precise historic tenancy coverage, clarify this inconsistency and any continuation; it does not alter the verified commencement date. The scan alone does not establish the actual move-out date.</w:t>
+        <w:t>Urunga scan visually checked, pages 1–2: agreement made 8 November 2024; commencement 11 November 2024; Kristina and Scott named; address 28 Fitzroy Street, Urunga. Scott confirmed that after the fixed term the tenancy continued periodically until Scott and Kristina moved to Coffs Harbour in July 2025.</w:t>
       </w:r>
     </w:p>
     <w:p>

</xml_diff>

<commit_message>
vault backup: 2026-10-18 09:31:57
</commit_message>
<xml_diff>
--- a/Visa/801 - Permanent Residency/Prepared Documents/Visa 801 Document Checklist.docx
+++ b/Visa/801 - Permanent Residency/Prepared Documents/Visa 801 Document Checklist.docx
@@ -1583,37 +1583,6 @@
           <w:rFonts w:ascii="Aptos" w:hAnsi="Aptos"/>
           <w:sz w:val="20"/>
         </w:rPr>
-        <w:t xml:space="preserve">Terms of your wills — </w:t>
-      </w:r>
-      <w:r>
-        <w:rPr>
-          <w:rFonts w:ascii="Aptos" w:hAnsi="Aptos"/>
-          <w:b/>
-          <w:sz w:val="20"/>
-        </w:rPr>
-        <w:t>NOT BEING RELIED ON for this submission.</w:t>
-      </w:r>
-    </w:p>
-    <w:p>
-      <w:pPr>
-        <w:keepLines w:val="0"/>
-        <w:spacing w:after="70"/>
-        <w:ind w:left="317" w:hanging="259"/>
-      </w:pPr>
-      <w:r>
-        <w:rPr>
-          <w:rFonts w:ascii="Aptos" w:hAnsi="Aptos"/>
-          <w:b/>
-          <w:color w:val="1A703D"/>
-          <w:sz w:val="19"/>
-        </w:rPr>
-        <w:t xml:space="preserve">DONE  </w:t>
-      </w:r>
-      <w:r>
-        <w:rPr>
-          <w:rFonts w:ascii="Aptos" w:hAnsi="Aptos"/>
-          <w:sz w:val="20"/>
-        </w:rPr>
         <w:t xml:space="preserve">[P1] Records of joint travel (e.g. flight bookings, hotel/accommodation bookings, travel itineraries, and photos from trips taken together) - Since Sep 2025, if applicable — </w:t>
       </w:r>
       <w:r>

</xml_diff>

<commit_message>
vault backup: 2026-10-18 09:50:33
</commit_message>
<xml_diff>
--- a/Visa/801 - Permanent Residency/Prepared Documents/Visa 801 Document Checklist.docx
+++ b/Visa/801 - Permanent Residency/Prepared Documents/Visa 801 Document Checklist.docx
@@ -119,7 +119,7 @@
           <w:rFonts w:ascii="Aptos" w:hAnsi="Aptos"/>
           <w:sz w:val="20"/>
         </w:rPr>
-        <w:t xml:space="preserve"> — Mum's draft has been received and reviewed; correct the issues listed in the review notes, then complete signing and witnessing. Jaya's updated statement is still required.</w:t>
+        <w:t xml:space="preserve"> — Mum's draft has been received and reviewed. Jaya's first review draft has now been prepared from her 2024 Form 888 using the current agency template. Both witnesses must confirm their drafts, remove review notes, attach identity evidence as directed, and complete signing and witnessing.</w:t>
       </w:r>
     </w:p>
     <w:p>
@@ -260,11 +260,10 @@
         <w:rPr>
           <w:rFonts w:ascii="Aptos" w:hAnsi="Aptos"/>
           <w:b/>
-          <w:color w:val="9C4800"/>
+          <w:color w:val="1A703D"/>
           <w:sz w:val="19"/>
-          <w:highlight w:val="yellow"/>
         </w:rPr>
-        <w:t xml:space="preserve">TO DO  </w:t>
+        <w:t xml:space="preserve">DONE  </w:t>
       </w:r>
       <w:r>
         <w:rPr>
@@ -279,7 +278,7 @@
           <w:rFonts w:ascii="Aptos" w:hAnsi="Aptos"/>
           <w:sz w:val="20"/>
         </w:rPr>
-        <w:t xml:space="preserve"> — Scott's IOOF beneficiary nomination has been captured and shows Kristina as 100% beneficiary under a binding non-lapsing nomination. Retrieve Kristina's beneficiary nomination and decide whether any other evidence is relevant.</w:t>
+        <w:t xml:space="preserve"> — beneficiary evidence has been gathered for both partners, together with the joint leases. Scott's IOOF nomination shows Kristina as 100% beneficiary under a binding non-lapsing nomination.</w:t>
       </w:r>
     </w:p>
     <w:p>
@@ -621,7 +620,7 @@
           <w:rFonts w:ascii="Aptos" w:hAnsi="Aptos"/>
           <w:sz w:val="20"/>
         </w:rPr>
-        <w:t>Scott's IOOF beneficiary nomination captured; Kristina is nominated for 100% under a binding non-lapsing nomination.</w:t>
+        <w:t>Superannuation beneficiary evidence gathered for both partners. Scott's IOOF nomination shows Kristina as 100% beneficiary under a binding non-lapsing nomination.</w:t>
       </w:r>
     </w:p>
     <w:p>
@@ -713,7 +712,7 @@
           <w:rFonts w:ascii="Aptos" w:hAnsi="Aptos"/>
           <w:sz w:val="20"/>
         </w:rPr>
-        <w:t>Mum's witness statement draft received and reviewed; corrections and signing remain.</w:t>
+        <w:t>Mum's witness statement draft received and reviewed; corrections and signing remain. Jaya's review draft has been prepared from her 2024 Form 888 in the current agency template.</w:t>
       </w:r>
     </w:p>
     <w:p>
@@ -784,10 +783,10 @@
         <w:rPr>
           <w:rFonts w:ascii="Aptos" w:hAnsi="Aptos"/>
           <w:b/>
-          <w:color w:val="9C4800"/>
+          <w:color w:val="1A703D"/>
           <w:sz w:val="19"/>
         </w:rPr>
-        <w:t xml:space="preserve">TO DO  </w:t>
+        <w:t xml:space="preserve">DONE  </w:t>
       </w:r>
       <w:r>
         <w:rPr>
@@ -876,10 +875,10 @@
         <w:rPr>
           <w:rFonts w:ascii="Aptos" w:hAnsi="Aptos"/>
           <w:b/>
-          <w:color w:val="9C4800"/>
+          <w:color w:val="1A703D"/>
           <w:sz w:val="19"/>
         </w:rPr>
-        <w:t xml:space="preserve">TO DO  </w:t>
+        <w:t xml:space="preserve">DONE  </w:t>
       </w:r>
       <w:r>
         <w:rPr>
@@ -968,17 +967,17 @@
         <w:rPr>
           <w:rFonts w:ascii="Aptos" w:hAnsi="Aptos"/>
           <w:b/>
-          <w:color w:val="9C4800"/>
+          <w:color w:val="1A703D"/>
           <w:sz w:val="19"/>
         </w:rPr>
-        <w:t xml:space="preserve">TO DO  </w:t>
+        <w:t xml:space="preserve">DONE  </w:t>
       </w:r>
       <w:r>
         <w:rPr>
           <w:rFonts w:ascii="Aptos" w:hAnsi="Aptos"/>
           <w:sz w:val="20"/>
         </w:rPr>
-        <w:t>Subclass 820 Grant Letter</w:t>
+        <w:t>Subclass 820 Grant Letter — filed locally and in the Google Drive Evidence folder.</w:t>
       </w:r>
     </w:p>
     <w:p>
@@ -1292,11 +1291,10 @@
         <w:rPr>
           <w:rFonts w:ascii="Aptos" w:hAnsi="Aptos"/>
           <w:b/>
-          <w:color w:val="9C4800"/>
+          <w:color w:val="1A703D"/>
           <w:sz w:val="19"/>
-          <w:highlight w:val="yellow"/>
         </w:rPr>
-        <w:t xml:space="preserve">TO DO  </w:t>
+        <w:t xml:space="preserve">DONE  </w:t>
       </w:r>
       <w:r>
         <w:rPr>
@@ -1311,7 +1309,7 @@
           <w:b/>
           <w:sz w:val="20"/>
         </w:rPr>
-        <w:t>PARTIAL: joint leases and Scott's IOOF beneficiary nomination gathered; Kristina's beneficiary nomination remains.</w:t>
+        <w:t>GATHERED: joint leases and superannuation beneficiary evidence for both partners are available.</w:t>
       </w:r>
     </w:p>
     <w:p>
@@ -1845,17 +1843,17 @@
         <w:rPr>
           <w:rFonts w:ascii="Aptos" w:hAnsi="Aptos"/>
           <w:b/>
-          <w:color w:val="9C4800"/>
+          <w:color w:val="1A703D"/>
           <w:sz w:val="19"/>
         </w:rPr>
-        <w:t xml:space="preserve">TO DO  </w:t>
+        <w:t xml:space="preserve">DONE  </w:t>
       </w:r>
       <w:r>
         <w:rPr>
           <w:rFonts w:ascii="Aptos" w:hAnsi="Aptos"/>
           <w:sz w:val="20"/>
         </w:rPr>
-        <w:t>Scott's passport</w:t>
+        <w:t>Scott's passport — current biographical page added to Evidence.</w:t>
       </w:r>
     </w:p>
     <w:p>
@@ -2002,10 +2000,10 @@
         <w:rPr>
           <w:rFonts w:ascii="Aptos" w:hAnsi="Aptos"/>
           <w:b/>
-          <w:color w:val="9C4800"/>
+          <w:color w:val="1A703D"/>
           <w:sz w:val="19"/>
         </w:rPr>
-        <w:t xml:space="preserve">TO DO  </w:t>
+        <w:t xml:space="preserve">DONE  </w:t>
       </w:r>
       <w:r>
         <w:rPr>
@@ -2020,7 +2018,7 @@
           <w:rFonts w:ascii="Aptos" w:hAnsi="Aptos"/>
           <w:sz w:val="20"/>
         </w:rPr>
-        <w:t xml:space="preserve"> — Scott has personally seen the nomination in Kristina's AustralianSuper account. Log in with Kristina and capture evidence showing Scott as beneficiary; record the nomination type and percentage if displayed.</w:t>
+        <w:t xml:space="preserve"> — added to Evidence; no further review requested.</w:t>
       </w:r>
     </w:p>
     <w:p>
@@ -2444,17 +2442,17 @@
         <w:rPr>
           <w:rFonts w:ascii="Aptos" w:hAnsi="Aptos"/>
           <w:b/>
-          <w:color w:val="9C4800"/>
+          <w:color w:val="1A703D"/>
           <w:sz w:val="19"/>
         </w:rPr>
-        <w:t xml:space="preserve">TO DO  </w:t>
+        <w:t xml:space="preserve">DONE  </w:t>
       </w:r>
       <w:r>
         <w:rPr>
           <w:rFonts w:ascii="Aptos" w:hAnsi="Aptos"/>
           <w:sz w:val="20"/>
         </w:rPr>
-        <w:t>Legal commitments — Scott's IOOF nomination is gathered and shows Kristina at 100% under a binding non-lapsing nomination. Locate Kristina's nomination naming Scott and identify any other relevant commitments, if applicable.</w:t>
+        <w:t>Legal commitments — beneficiary evidence for both partners and the joint leases have been gathered.</w:t>
       </w:r>
     </w:p>
     <w:p>
@@ -2950,7 +2948,7 @@
           <w:rFonts w:ascii="Aptos" w:hAnsi="Aptos"/>
           <w:sz w:val="20"/>
         </w:rPr>
-        <w:t>England wedding did not proceed and is removed. Christmas 2024 is clearly earlier context. Current plans for Sydney, a home in 3–4 years and ongoing conversations about children are incorporated. The superannuation home-deposit wording records your intention, not an eligibility assessment.</w:t>
+        <w:t>the social section now records the February 2026 Bad Bunny concert in Sydney, the August 2026 whale-watching outing with Kristina's friends, time with Kristina's friend and her husband in January 2026, and the way family and friendships have continued since the move to Coffs Harbour. Christmas 2024 remains earlier context. Current plans for Sydney, a home in 3–4 years and ongoing conversations about children are incorporated. The superannuation home-deposit wording records your intention, not an eligibility assessment.</w:t>
       </w:r>
     </w:p>
     <w:p>
@@ -3738,6 +3736,9 @@
     <w:qFormat/>
     <w:rsid w:val="00FC693F"/>
     <w:pPr>
+      <w:pBdr>
+        <w:bottom w:val="single" w:sz="8" w:space="4" w:color="4F81BD" w:themeColor="accent1"/>
+      </w:pBdr>
       <w:spacing w:after="240" w:line="240" w:lineRule="auto"/>
       <w:contextualSpacing/>
     </w:pPr>

</xml_diff>

<commit_message>
vault backup: 2026-10-18 09:58:09
</commit_message>
<xml_diff>
--- a/Visa/801 - Permanent Residency/Prepared Documents/Visa 801 Document Checklist.docx
+++ b/Visa/801 - Permanent Residency/Prepared Documents/Visa 801 Document Checklist.docx
@@ -119,7 +119,7 @@
           <w:rFonts w:ascii="Aptos" w:hAnsi="Aptos"/>
           <w:sz w:val="20"/>
         </w:rPr>
-        <w:t xml:space="preserve"> — Mum's draft has been received and reviewed. Jaya's first review draft has now been prepared from her 2024 Form 888 using the current agency template. Both witnesses must confirm their drafts, remove review notes, attach identity evidence as directed, and complete signing and witnessing.</w:t>
+        <w:t xml:space="preserve"> — Mum's corrected draft has been prepared and emailed to her for confirmation. Jaya's first review draft has been prepared from her 2024 Form 888 using the current agency template. Both witnesses must confirm their drafts, attach identity evidence as directed, and complete signing and witnessing.</w:t>
       </w:r>
     </w:p>
     <w:p>
@@ -712,7 +712,7 @@
           <w:rFonts w:ascii="Aptos" w:hAnsi="Aptos"/>
           <w:sz w:val="20"/>
         </w:rPr>
-        <w:t>Mum's witness statement draft received and reviewed; corrections and signing remain. Jaya's review draft has been prepared from her 2024 Form 888 in the current agency template.</w:t>
+        <w:t>Mum's witness statement was reviewed, corrected and emailed to her as a PDF; her confirmation and signing remain. Jaya's review draft has been prepared from her 2024 Form 888 in the current agency template.</w:t>
       </w:r>
     </w:p>
     <w:p>

</xml_diff>

<commit_message>
vault backup: 2026-10-18 10:04:34
</commit_message>
<xml_diff>
--- a/Visa/801 - Permanent Residency/Prepared Documents/Visa 801 Document Checklist.docx
+++ b/Visa/801 - Permanent Residency/Prepared Documents/Visa 801 Document Checklist.docx
@@ -46,7 +46,7 @@
           <w:rFonts w:ascii="Aptos" w:hAnsi="Aptos"/>
           <w:sz w:val="30"/>
         </w:rPr>
-        <w:t>Remaining priority actions</w:t>
+        <w:t>Remaining items — focus here</w:t>
       </w:r>
     </w:p>
     <w:p>
@@ -55,7 +55,19 @@
           <w:rFonts w:ascii="Aptos" w:hAnsi="Aptos"/>
           <w:sz w:val="20"/>
         </w:rPr>
-        <w:t>These are the highest-impact items still requiring work.</w:t>
+        <w:t>This section collects every unresolved action in one place. Work through the first group first; the later groups are supporting items or questions for Affinity.</w:t>
+      </w:r>
+    </w:p>
+    <w:p>
+      <w:pPr>
+        <w:pStyle w:val="Heading2"/>
+      </w:pPr>
+      <w:r>
+        <w:rPr>
+          <w:rFonts w:ascii="Aptos" w:hAnsi="Aptos"/>
+          <w:sz w:val="24"/>
+        </w:rPr>
+        <w:t>Priority documents to finish</w:t>
       </w:r>
     </w:p>
     <w:p>
@@ -112,14 +124,14 @@
           <w:b/>
           <w:sz w:val="20"/>
         </w:rPr>
-        <w:t>[P1] Two updated Form 888 witness statements</w:t>
+        <w:t>[P1] Mum's witness statement</w:t>
       </w:r>
       <w:r>
         <w:rPr>
           <w:rFonts w:ascii="Aptos" w:hAnsi="Aptos"/>
           <w:sz w:val="20"/>
         </w:rPr>
-        <w:t xml:space="preserve"> — Mum's corrected draft has been prepared and emailed to her for confirmation. Jaya's first review draft has been prepared from her 2024 Form 888 using the current agency template. Both witnesses must confirm their drafts, attach identity evidence as directed, and complete signing and witnessing.</w:t>
+        <w:t xml:space="preserve"> — the corrected editable Word draft and PDF were emailed to Mum on 18 October 2026. Obtain her corrections or confirmation, then have the final declaration signed and witnessed and collect the identity attachment required by the template.</w:t>
       </w:r>
     </w:p>
     <w:p>
@@ -144,14 +156,14 @@
           <w:b/>
           <w:sz w:val="20"/>
         </w:rPr>
-        <w:t>[P1] Finalise Scott's relationship statement</w:t>
+        <w:t>[P1] Jaya's witness statement</w:t>
       </w:r>
       <w:r>
         <w:rPr>
           <w:rFonts w:ascii="Aptos" w:hAnsi="Aptos"/>
           <w:sz w:val="20"/>
         </w:rPr>
-        <w:t xml:space="preserve"> — review the first-pass draft dated 18 October 2026, answer the firm factual confirmations in “Scott's review required now”, obtain Affinity's review and arrange signing.</w:t>
+        <w:t xml:space="preserve"> — the editable draft and the agency's blank template were emailed to Jaya on 18 October 2026. Obtain her corrections or confirmation, then have the final declaration signed and witnessed and collect the identity attachment required by the template.</w:t>
       </w:r>
     </w:p>
     <w:p>
@@ -176,14 +188,14 @@
           <w:b/>
           <w:sz w:val="20"/>
         </w:rPr>
-        <w:t>[P1] Complete the relationship photo timeline coverage</w:t>
+        <w:t>[P1] Scott's relationship statement</w:t>
       </w:r>
       <w:r>
         <w:rPr>
           <w:rFonts w:ascii="Aptos" w:hAnsi="Aptos"/>
           <w:sz w:val="20"/>
         </w:rPr>
-        <w:t xml:space="preserve"> — Kristina added further photos and 24 curated photos across 16 dates from August 2025 to August 2026 are now in the draft timeline. The new selection adds June–August 2026 family, social and couple photos. If available, add one or two photos from March–May 2026 and one or two from September–October 2026; otherwise ask Affinity whether the present coverage is sufficient.</w:t>
+        <w:t xml:space="preserve"> — complete the final voice and accuracy review, update any remaining facts and the statement date, obtain Affinity's review, then arrange signing.</w:t>
       </w:r>
     </w:p>
     <w:p>
@@ -208,14 +220,14 @@
           <w:b/>
           <w:sz w:val="20"/>
         </w:rPr>
-        <w:t>[P1] Contact during periods apart</w:t>
+        <w:t>[P1] Shared-address correspondence</w:t>
       </w:r>
       <w:r>
         <w:rPr>
           <w:rFonts w:ascii="Aptos" w:hAnsi="Aptos"/>
           <w:sz w:val="20"/>
         </w:rPr>
-        <w:t xml:space="preserve"> — three ordinary Bali Messages screenshots from 6–8 October 2025 have been gathered and uploaded to Google Drive. Ask Affinity whether separate dates and contact evidence are required for the shorter absences involving family events, TAFE excursions and Sydney Bats; add further evidence only if requested or readily available.</w:t>
+        <w:t xml:space="preserve"> — locate joint correspondence, or separate letters for Scott and Kristina showing the same current address.</w:t>
       </w:r>
     </w:p>
     <w:p>
@@ -240,14 +252,26 @@
           <w:b/>
           <w:sz w:val="20"/>
         </w:rPr>
-        <w:t>[P1] Correspondence to both partners at the shared address</w:t>
+        <w:t>[P1] Evidence filing and submission selection</w:t>
       </w:r>
       <w:r>
         <w:rPr>
           <w:rFonts w:ascii="Aptos" w:hAnsi="Aptos"/>
           <w:sz w:val="20"/>
         </w:rPr>
-        <w:t xml:space="preserve"> — locate letters or mail addressed jointly, or separate correspondence showing both names at the same address.</w:t>
+        <w:t xml:space="preserve"> — upload any renamed bank statements, bills, car insurance and licence files not yet in the 801 Drive folder, then choose a representative set with useful date coverage.</w:t>
+      </w:r>
+    </w:p>
+    <w:p>
+      <w:pPr>
+        <w:pStyle w:val="Heading2"/>
+      </w:pPr>
+      <w:r>
+        <w:rPr>
+          <w:rFonts w:ascii="Aptos" w:hAnsi="Aptos"/>
+          <w:sz w:val="24"/>
+        </w:rPr>
+        <w:t>Evidence to obtain or complete</w:t>
       </w:r>
     </w:p>
     <w:p>
@@ -260,10 +284,10 @@
         <w:rPr>
           <w:rFonts w:ascii="Aptos" w:hAnsi="Aptos"/>
           <w:b/>
-          <w:color w:val="1A703D"/>
+          <w:color w:val="9C4800"/>
           <w:sz w:val="19"/>
         </w:rPr>
-        <w:t xml:space="preserve">DONE  </w:t>
+        <w:t xml:space="preserve">TO DO  </w:t>
       </w:r>
       <w:r>
         <w:rPr>
@@ -271,14 +295,14 @@
           <w:b/>
           <w:sz w:val="20"/>
         </w:rPr>
-        <w:t>[P1] Legal commitments</w:t>
+        <w:t>Kristina's Bulgarian national identity card</w:t>
       </w:r>
       <w:r>
         <w:rPr>
           <w:rFonts w:ascii="Aptos" w:hAnsi="Aptos"/>
           <w:sz w:val="20"/>
         </w:rPr>
-        <w:t xml:space="preserve"> — beneficiary evidence has been gathered for both partners, together with the joint leases. Scott's IOOF nomination shows Kristina as 100% beneficiary under a binding non-lapsing nomination.</w:t>
+        <w:t xml:space="preserve"> — add a clear colour copy of the original and an official English translation if the document is not in English.</w:t>
       </w:r>
     </w:p>
     <w:p>
@@ -291,10 +315,10 @@
         <w:rPr>
           <w:rFonts w:ascii="Aptos" w:hAnsi="Aptos"/>
           <w:b/>
-          <w:color w:val="1A703D"/>
+          <w:color w:val="9C4800"/>
           <w:sz w:val="19"/>
         </w:rPr>
-        <w:t xml:space="preserve">DONE  </w:t>
+        <w:t xml:space="preserve">TO DO  </w:t>
       </w:r>
       <w:r>
         <w:rPr>
@@ -302,14 +326,14 @@
           <w:b/>
           <w:sz w:val="20"/>
         </w:rPr>
-        <w:t>[P1] Car purchase and registration evidence</w:t>
+        <w:t>Bali return-flight evidence</w:t>
       </w:r>
       <w:r>
         <w:rPr>
           <w:rFonts w:ascii="Aptos" w:hAnsi="Aptos"/>
           <w:sz w:val="20"/>
         </w:rPr>
-        <w:t xml:space="preserve"> — purchase invoice dated 7 November 2024 and current registration-related evidence have been gathered. The vehicle and liabilities are in Scott's name; describe them accurately as a shared household asset and joint decision rather than joint legal ownership.</w:t>
+        <w:t xml:space="preserve"> — add Kristina's return booking or boarding record for 10 October 2025 when received.</w:t>
       </w:r>
     </w:p>
     <w:p>
@@ -324,7 +348,6 @@
           <w:b/>
           <w:color w:val="9C4800"/>
           <w:sz w:val="19"/>
-          <w:highlight w:val="yellow"/>
         </w:rPr>
         <w:t xml:space="preserve">TO DO  </w:t>
       </w:r>
@@ -334,26 +357,26 @@
           <w:b/>
           <w:sz w:val="20"/>
         </w:rPr>
-        <w:t>[P1] Upload and curate the newly gathered evidence</w:t>
+        <w:t>Relationship photo timeline</w:t>
       </w:r>
       <w:r>
         <w:rPr>
           <w:rFonts w:ascii="Aptos" w:hAnsi="Aptos"/>
           <w:sz w:val="20"/>
         </w:rPr>
-        <w:t xml:space="preserve"> — upload the renamed bank statements, bills, car insurance and licence files to the 801 Google Drive folder, then choose a representative submission set with useful date coverage.</w:t>
+        <w:t xml:space="preserve"> — if available, add one or two photos from March–May 2026 and one or two from September–October 2026. If none are useful, ask Affinity whether the present 24-photo timeline is sufficient.</w:t>
       </w:r>
     </w:p>
     <w:p>
       <w:pPr>
-        <w:pStyle w:val="Heading1"/>
+        <w:pStyle w:val="Heading2"/>
       </w:pPr>
       <w:r>
         <w:rPr>
           <w:rFonts w:ascii="Aptos" w:hAnsi="Aptos"/>
-          <w:sz w:val="30"/>
-        </w:rPr>
-        <w:t>Completed or gathered since the previous update</w:t>
+          <w:sz w:val="24"/>
+        </w:rPr>
+        <w:t>Questions to send to Affinity</w:t>
       </w:r>
     </w:p>
     <w:p>
@@ -366,31 +389,17 @@
         <w:rPr>
           <w:rFonts w:ascii="Aptos" w:hAnsi="Aptos"/>
           <w:b/>
-          <w:color w:val="1A703D"/>
+          <w:color w:val="9C4800"/>
           <w:sz w:val="19"/>
         </w:rPr>
-        <w:t xml:space="preserve">DONE  </w:t>
+        <w:t xml:space="preserve">TO DO  </w:t>
       </w:r>
       <w:r>
         <w:rPr>
           <w:rFonts w:ascii="Aptos" w:hAnsi="Aptos"/>
           <w:sz w:val="20"/>
         </w:rPr>
-        <w:t xml:space="preserve">Approved filenames applied to 92 submission documents, with the client reference </w:t>
-      </w:r>
-      <w:r>
-        <w:rPr>
-          <w:rFonts w:ascii="Aptos Mono" w:hAnsi="Aptos Mono"/>
-          <w:sz w:val="19"/>
-        </w:rPr>
-        <w:t>WaKr-2631-801-3</w:t>
-      </w:r>
-      <w:r>
-        <w:rPr>
-          <w:rFonts w:ascii="Aptos" w:hAnsi="Aptos"/>
-          <w:sz w:val="20"/>
-        </w:rPr>
-        <w:t xml:space="preserve"> added.</w:t>
+        <w:t>Confirm whether exact dates and separate contact evidence are needed for the short periods apart involving family events, TAFE excursions and Sydney Bats. Bali contact evidence and the definite 11–14 May 2026 Sydney work trip are already documented.</w:t>
       </w:r>
     </w:p>
     <w:p>
@@ -403,17 +412,17 @@
         <w:rPr>
           <w:rFonts w:ascii="Aptos" w:hAnsi="Aptos"/>
           <w:b/>
-          <w:color w:val="1A703D"/>
+          <w:color w:val="9C4800"/>
           <w:sz w:val="19"/>
         </w:rPr>
-        <w:t xml:space="preserve">DONE  </w:t>
+        <w:t xml:space="preserve">TO DO  </w:t>
       </w:r>
       <w:r>
         <w:rPr>
           <w:rFonts w:ascii="Aptos" w:hAnsi="Aptos"/>
           <w:sz w:val="20"/>
         </w:rPr>
-        <w:t>All 90 PDFs checked and made accessible without passwords or encryption.</w:t>
+        <w:t>Confirm whether Kristina's Bulgarian driver licence is required in addition to her NSW licence.</w:t>
       </w:r>
     </w:p>
     <w:p>
@@ -426,17 +435,29 @@
         <w:rPr>
           <w:rFonts w:ascii="Aptos" w:hAnsi="Aptos"/>
           <w:b/>
-          <w:color w:val="1A703D"/>
+          <w:color w:val="9C4800"/>
           <w:sz w:val="19"/>
         </w:rPr>
-        <w:t xml:space="preserve">DONE  </w:t>
+        <w:t xml:space="preserve">TO DO  </w:t>
       </w:r>
       <w:r>
         <w:rPr>
           <w:rFonts w:ascii="Aptos" w:hAnsi="Aptos"/>
           <w:sz w:val="20"/>
         </w:rPr>
-        <w:t>CBA and 2Up joint bank statements gathered for the relevant period.</w:t>
+        <w:t>Confirm whether the current photo timeline is sufficient if no suitable photos are available for the two remaining date gaps.</w:t>
+      </w:r>
+    </w:p>
+    <w:p>
+      <w:pPr>
+        <w:pStyle w:val="Heading2"/>
+      </w:pPr>
+      <w:r>
+        <w:rPr>
+          <w:rFonts w:ascii="Aptos" w:hAnsi="Aptos"/>
+          <w:sz w:val="24"/>
+        </w:rPr>
+        <w:t>Optional supporting items</w:t>
       </w:r>
     </w:p>
     <w:p>
@@ -449,17 +470,17 @@
         <w:rPr>
           <w:rFonts w:ascii="Aptos" w:hAnsi="Aptos"/>
           <w:b/>
-          <w:color w:val="1A703D"/>
+          <w:color w:val="9C4800"/>
           <w:sz w:val="19"/>
         </w:rPr>
-        <w:t xml:space="preserve">DONE  </w:t>
+        <w:t xml:space="preserve">TO DO  </w:t>
       </w:r>
       <w:r>
         <w:rPr>
           <w:rFonts w:ascii="Aptos" w:hAnsi="Aptos"/>
           <w:sz w:val="20"/>
         </w:rPr>
-        <w:t>ING household-expense account statements gathered for October 2025 to 17 October 2026.</w:t>
+        <w:t>Confirm that gas is not applicable at the current home, if correct.</w:t>
       </w:r>
     </w:p>
     <w:p>
@@ -472,17 +493,17 @@
         <w:rPr>
           <w:rFonts w:ascii="Aptos" w:hAnsi="Aptos"/>
           <w:b/>
-          <w:color w:val="1A703D"/>
+          <w:color w:val="9C4800"/>
           <w:sz w:val="19"/>
         </w:rPr>
-        <w:t xml:space="preserve">DONE  </w:t>
+        <w:t xml:space="preserve">TO DO  </w:t>
       </w:r>
       <w:r>
         <w:rPr>
           <w:rFonts w:ascii="Aptos" w:hAnsi="Aptos"/>
           <w:sz w:val="20"/>
         </w:rPr>
-        <w:t>Electricity, internet, telephone and water bills gathered from August or September 2025 onward. The electricity, internet and telephone accounts reviewed are in Scott's name; the water account is addressed to the property owner or agent. Use these as shared-address or household-expense evidence rather than describing them as joint accounts.</w:t>
+        <w:t>Add Kristina's exact Coffs Coast Wildlife Sanctuary role title if it is readily available from her contract or payslip.</w:t>
       </w:r>
     </w:p>
     <w:p>
@@ -495,17 +516,17 @@
         <w:rPr>
           <w:rFonts w:ascii="Aptos" w:hAnsi="Aptos"/>
           <w:b/>
-          <w:color w:val="1A703D"/>
+          <w:color w:val="9C4800"/>
           <w:sz w:val="19"/>
         </w:rPr>
-        <w:t xml:space="preserve">DONE  </w:t>
+        <w:t xml:space="preserve">TO DO  </w:t>
       </w:r>
       <w:r>
         <w:rPr>
           <w:rFonts w:ascii="Aptos" w:hAnsi="Aptos"/>
           <w:sz w:val="20"/>
         </w:rPr>
-        <w:t>Urunga lease, Coffs Harbour lease and Coffs Harbour extension gathered; both partners are named as tenants.</w:t>
+        <w:t>Add useful Bulgaria accommodation records or trip photos if already available; the joint flight evidence is complete.</w:t>
       </w:r>
     </w:p>
     <w:p>
@@ -518,17 +539,29 @@
         <w:rPr>
           <w:rFonts w:ascii="Aptos" w:hAnsi="Aptos"/>
           <w:b/>
-          <w:color w:val="1A703D"/>
+          <w:color w:val="9C4800"/>
           <w:sz w:val="19"/>
         </w:rPr>
-        <w:t xml:space="preserve">DONE  </w:t>
+        <w:t xml:space="preserve">TO DO  </w:t>
       </w:r>
       <w:r>
         <w:rPr>
           <w:rFonts w:ascii="Aptos" w:hAnsi="Aptos"/>
           <w:sz w:val="20"/>
         </w:rPr>
-        <w:t>Scott's NSW driver licence copy gathered, with front and back included across two pages.</w:t>
+        <w:t>Consider course certificates, sanctuary employment evidence, volunteering records or relevant veterinary records only where they strengthen an event already described.</w:t>
+      </w:r>
+    </w:p>
+    <w:p>
+      <w:pPr>
+        <w:pStyle w:val="Heading1"/>
+      </w:pPr>
+      <w:r>
+        <w:rPr>
+          <w:rFonts w:ascii="Aptos" w:hAnsi="Aptos"/>
+          <w:sz w:val="30"/>
+        </w:rPr>
+        <w:t>Completed or gathered since the previous update</w:t>
       </w:r>
     </w:p>
     <w:p>
@@ -551,7 +584,21 @@
           <w:rFonts w:ascii="Aptos" w:hAnsi="Aptos"/>
           <w:sz w:val="20"/>
         </w:rPr>
-        <w:t>Joint Bulgaria flight evidence gathered for December 2025 to January 2026 and June 2026.</w:t>
+        <w:t xml:space="preserve">Approved filenames applied to 92 submission documents, with the client reference </w:t>
+      </w:r>
+      <w:r>
+        <w:rPr>
+          <w:rFonts w:ascii="Aptos Mono" w:hAnsi="Aptos Mono"/>
+          <w:sz w:val="19"/>
+        </w:rPr>
+        <w:t>WaKr-2631-801-3</w:t>
+      </w:r>
+      <w:r>
+        <w:rPr>
+          <w:rFonts w:ascii="Aptos" w:hAnsi="Aptos"/>
+          <w:sz w:val="20"/>
+        </w:rPr>
+        <w:t xml:space="preserve"> added.</w:t>
       </w:r>
     </w:p>
     <w:p>
@@ -574,7 +621,7 @@
           <w:rFonts w:ascii="Aptos" w:hAnsi="Aptos"/>
           <w:sz w:val="20"/>
         </w:rPr>
-        <w:t>Current car insurance schedule gathered; Kristina is listed as a regular driver.</w:t>
+        <w:t>All 90 PDFs checked and made accessible without passwords or encryption.</w:t>
       </w:r>
     </w:p>
     <w:p>
@@ -597,7 +644,7 @@
           <w:rFonts w:ascii="Aptos" w:hAnsi="Aptos"/>
           <w:sz w:val="20"/>
         </w:rPr>
-        <w:t>Initial draft of Scott's updated relationship statement prepared.</w:t>
+        <w:t>CBA and 2Up joint bank statements gathered for the relevant period.</w:t>
       </w:r>
     </w:p>
     <w:p>
@@ -620,7 +667,7 @@
           <w:rFonts w:ascii="Aptos" w:hAnsi="Aptos"/>
           <w:sz w:val="20"/>
         </w:rPr>
-        <w:t>Superannuation beneficiary evidence gathered for both partners. Scott's IOOF nomination shows Kristina as 100% beneficiary under a binding non-lapsing nomination.</w:t>
+        <w:t>ING household-expense account statements gathered for October 2025 to 17 October 2026.</w:t>
       </w:r>
     </w:p>
     <w:p>
@@ -643,7 +690,7 @@
           <w:rFonts w:ascii="Aptos" w:hAnsi="Aptos"/>
           <w:sz w:val="20"/>
         </w:rPr>
-        <w:t>Car purchase invoice gathered — 2019 Mazda 3, purchased 7 November 2024 from Moreton Bay Ford.</w:t>
+        <w:t>Electricity, internet, telephone and water bills gathered from August or September 2025 onward. The electricity, internet and telephone accounts reviewed are in Scott's name; the water account is addressed to the property owner or agent. Use these as shared-address or household-expense evidence rather than describing them as joint accounts.</w:t>
       </w:r>
     </w:p>
     <w:p>
@@ -666,7 +713,7 @@
           <w:rFonts w:ascii="Aptos" w:hAnsi="Aptos"/>
           <w:sz w:val="20"/>
         </w:rPr>
-        <w:t>Current vehicle registration-related evidence gathered — Mazda 3, NSW registration DN93QA, Scott named as owner on the QBE CTP evidence, registration period commencing 24 April 2026.</w:t>
+        <w:t>Urunga lease, Coffs Harbour lease and Coffs Harbour extension gathered; both partners are named as tenants.</w:t>
       </w:r>
     </w:p>
     <w:p>
@@ -689,7 +736,7 @@
           <w:rFonts w:ascii="Aptos" w:hAnsi="Aptos"/>
           <w:sz w:val="20"/>
         </w:rPr>
-        <w:t>Sydney travel review completed from available email and calendar evidence: definite solo work trip 11–14 May 2026; joint Sydney trip 27 February–1 March 2026 excluded from periods apart. Scott confirmed that the 10 November 2025 Concord West activity was another solo Sydney work trip, but it is unnecessary for the submission and has been left out.</w:t>
+        <w:t>Scott's NSW driver licence copy gathered, with front and back included across two pages.</w:t>
       </w:r>
     </w:p>
     <w:p>
@@ -712,7 +759,168 @@
           <w:rFonts w:ascii="Aptos" w:hAnsi="Aptos"/>
           <w:sz w:val="20"/>
         </w:rPr>
-        <w:t>Mum's witness statement was reviewed, corrected and emailed to her as a PDF; her confirmation and signing remain. Jaya's review draft has been prepared from her 2024 Form 888 in the current agency template.</w:t>
+        <w:t>Joint Bulgaria flight evidence gathered for December 2025 to January 2026 and June 2026.</w:t>
+      </w:r>
+    </w:p>
+    <w:p>
+      <w:pPr>
+        <w:keepLines w:val="0"/>
+        <w:spacing w:after="70"/>
+        <w:ind w:left="317" w:hanging="259"/>
+      </w:pPr>
+      <w:r>
+        <w:rPr>
+          <w:rFonts w:ascii="Aptos" w:hAnsi="Aptos"/>
+          <w:b/>
+          <w:color w:val="1A703D"/>
+          <w:sz w:val="19"/>
+        </w:rPr>
+        <w:t xml:space="preserve">DONE  </w:t>
+      </w:r>
+      <w:r>
+        <w:rPr>
+          <w:rFonts w:ascii="Aptos" w:hAnsi="Aptos"/>
+          <w:sz w:val="20"/>
+        </w:rPr>
+        <w:t>Current car insurance schedule gathered; Kristina is listed as a regular driver.</w:t>
+      </w:r>
+    </w:p>
+    <w:p>
+      <w:pPr>
+        <w:keepLines w:val="0"/>
+        <w:spacing w:after="70"/>
+        <w:ind w:left="317" w:hanging="259"/>
+      </w:pPr>
+      <w:r>
+        <w:rPr>
+          <w:rFonts w:ascii="Aptos" w:hAnsi="Aptos"/>
+          <w:b/>
+          <w:color w:val="1A703D"/>
+          <w:sz w:val="19"/>
+        </w:rPr>
+        <w:t xml:space="preserve">DONE  </w:t>
+      </w:r>
+      <w:r>
+        <w:rPr>
+          <w:rFonts w:ascii="Aptos" w:hAnsi="Aptos"/>
+          <w:sz w:val="20"/>
+        </w:rPr>
+        <w:t>Initial draft of Scott's updated relationship statement prepared.</w:t>
+      </w:r>
+    </w:p>
+    <w:p>
+      <w:pPr>
+        <w:keepLines w:val="0"/>
+        <w:spacing w:after="70"/>
+        <w:ind w:left="317" w:hanging="259"/>
+      </w:pPr>
+      <w:r>
+        <w:rPr>
+          <w:rFonts w:ascii="Aptos" w:hAnsi="Aptos"/>
+          <w:b/>
+          <w:color w:val="1A703D"/>
+          <w:sz w:val="19"/>
+        </w:rPr>
+        <w:t xml:space="preserve">DONE  </w:t>
+      </w:r>
+      <w:r>
+        <w:rPr>
+          <w:rFonts w:ascii="Aptos" w:hAnsi="Aptos"/>
+          <w:sz w:val="20"/>
+        </w:rPr>
+        <w:t>Superannuation beneficiary evidence gathered for both partners. Scott's IOOF nomination shows Kristina as 100% beneficiary under a binding non-lapsing nomination.</w:t>
+      </w:r>
+    </w:p>
+    <w:p>
+      <w:pPr>
+        <w:keepLines w:val="0"/>
+        <w:spacing w:after="70"/>
+        <w:ind w:left="317" w:hanging="259"/>
+      </w:pPr>
+      <w:r>
+        <w:rPr>
+          <w:rFonts w:ascii="Aptos" w:hAnsi="Aptos"/>
+          <w:b/>
+          <w:color w:val="1A703D"/>
+          <w:sz w:val="19"/>
+        </w:rPr>
+        <w:t xml:space="preserve">DONE  </w:t>
+      </w:r>
+      <w:r>
+        <w:rPr>
+          <w:rFonts w:ascii="Aptos" w:hAnsi="Aptos"/>
+          <w:sz w:val="20"/>
+        </w:rPr>
+        <w:t>Car purchase invoice gathered — 2019 Mazda 3, purchased 7 November 2024 from Moreton Bay Ford.</w:t>
+      </w:r>
+    </w:p>
+    <w:p>
+      <w:pPr>
+        <w:keepLines w:val="0"/>
+        <w:spacing w:after="70"/>
+        <w:ind w:left="317" w:hanging="259"/>
+      </w:pPr>
+      <w:r>
+        <w:rPr>
+          <w:rFonts w:ascii="Aptos" w:hAnsi="Aptos"/>
+          <w:b/>
+          <w:color w:val="1A703D"/>
+          <w:sz w:val="19"/>
+        </w:rPr>
+        <w:t xml:space="preserve">DONE  </w:t>
+      </w:r>
+      <w:r>
+        <w:rPr>
+          <w:rFonts w:ascii="Aptos" w:hAnsi="Aptos"/>
+          <w:sz w:val="20"/>
+        </w:rPr>
+        <w:t>Current vehicle registration-related evidence gathered — Mazda 3, NSW registration DN93QA, Scott named as owner on the QBE CTP evidence, registration period commencing 24 April 2026.</w:t>
+      </w:r>
+    </w:p>
+    <w:p>
+      <w:pPr>
+        <w:keepLines w:val="0"/>
+        <w:spacing w:after="70"/>
+        <w:ind w:left="317" w:hanging="259"/>
+      </w:pPr>
+      <w:r>
+        <w:rPr>
+          <w:rFonts w:ascii="Aptos" w:hAnsi="Aptos"/>
+          <w:b/>
+          <w:color w:val="1A703D"/>
+          <w:sz w:val="19"/>
+        </w:rPr>
+        <w:t xml:space="preserve">DONE  </w:t>
+      </w:r>
+      <w:r>
+        <w:rPr>
+          <w:rFonts w:ascii="Aptos" w:hAnsi="Aptos"/>
+          <w:sz w:val="20"/>
+        </w:rPr>
+        <w:t>Sydney travel review completed from available email and calendar evidence: definite solo work trip 11–14 May 2026; joint Sydney trip 27 February–1 March 2026 excluded from periods apart. Scott confirmed that the 10 November 2025 Concord West activity was another solo Sydney work trip, but it is unnecessary for the submission and has been left out.</w:t>
+      </w:r>
+    </w:p>
+    <w:p>
+      <w:pPr>
+        <w:keepLines w:val="0"/>
+        <w:spacing w:after="70"/>
+        <w:ind w:left="317" w:hanging="259"/>
+      </w:pPr>
+      <w:r>
+        <w:rPr>
+          <w:rFonts w:ascii="Aptos" w:hAnsi="Aptos"/>
+          <w:b/>
+          <w:color w:val="1A703D"/>
+          <w:sz w:val="19"/>
+        </w:rPr>
+        <w:t xml:space="preserve">DONE  </w:t>
+      </w:r>
+      <w:r>
+        <w:rPr>
+          <w:rFonts w:ascii="Aptos" w:hAnsi="Aptos"/>
+          <w:sz w:val="20"/>
+        </w:rPr>
+        <w:t>Mum's witness statement was reviewed, corrected and emailed to her in editable Word and PDF formats. Jaya's review draft and the agency template were emailed to her. Confirmation, identity attachments, signing and witnessing remain for both statements.</w:t>
       </w:r>
     </w:p>
     <w:p>
@@ -1443,29 +1651,6 @@
           <w:sz w:val="20"/>
         </w:rPr>
         <w:t>Electricity bills gathered — account is in Scott's name.</w:t>
-      </w:r>
-    </w:p>
-    <w:p>
-      <w:pPr>
-        <w:keepLines w:val="0"/>
-        <w:spacing w:after="70"/>
-        <w:ind w:left="706" w:hanging="259"/>
-      </w:pPr>
-      <w:r>
-        <w:rPr>
-          <w:rFonts w:ascii="Aptos" w:hAnsi="Aptos"/>
-          <w:b/>
-          <w:color w:val="9C4800"/>
-          <w:sz w:val="19"/>
-        </w:rPr>
-        <w:t xml:space="preserve">TO DO  </w:t>
-      </w:r>
-      <w:r>
-        <w:rPr>
-          <w:rFonts w:ascii="Aptos" w:hAnsi="Aptos"/>
-          <w:sz w:val="20"/>
-        </w:rPr>
-        <w:t>Gas — confirm whether not applicable.</w:t>
       </w:r>
     </w:p>
     <w:p>

</xml_diff>

<commit_message>
vault backup: 2026-10-18 11:15:37
</commit_message>
<xml_diff>
--- a/Visa/801 - Permanent Residency/Prepared Documents/Visa 801 Document Checklist.docx
+++ b/Visa/801 - Permanent Residency/Prepared Documents/Visa 801 Document Checklist.docx
@@ -99,7 +99,7 @@
           <w:rFonts w:ascii="Aptos" w:hAnsi="Aptos"/>
           <w:sz w:val="20"/>
         </w:rPr>
-        <w:t xml:space="preserve"> — complete and review the form and attachment using the previous version as the base.</w:t>
+        <w:t xml:space="preserve"> — a review draft of the fillable PDF, updated attachment and central review list was prepared and uploaded on 18 October 2026. Resolve the yellow review items with Kristina, obtain Affinity's review, then sign and date the final form.</w:t>
       </w:r>
     </w:p>
     <w:p>
@@ -208,11 +208,10 @@
         <w:rPr>
           <w:rFonts w:ascii="Aptos" w:hAnsi="Aptos"/>
           <w:b/>
-          <w:color w:val="9C4800"/>
+          <w:color w:val="1A703D"/>
           <w:sz w:val="19"/>
-          <w:highlight w:val="yellow"/>
-        </w:rPr>
-        <w:t xml:space="preserve">TO DO  </w:t>
+        </w:rPr>
+        <w:t xml:space="preserve">DONE  </w:t>
       </w:r>
       <w:r>
         <w:rPr>
@@ -227,7 +226,7 @@
           <w:rFonts w:ascii="Aptos" w:hAnsi="Aptos"/>
           <w:sz w:val="20"/>
         </w:rPr>
-        <w:t xml:space="preserve"> — locate joint correspondence, or separate letters for Scott and Kristina showing the same current address.</w:t>
+        <w:t xml:space="preserve"> — locate joint correspondence, or separate letters for Scott and Kristina showing the same current address. - none that I know of, marked as complete</w:t>
       </w:r>
     </w:p>
     <w:p>
@@ -259,7 +258,7 @@
           <w:rFonts w:ascii="Aptos" w:hAnsi="Aptos"/>
           <w:sz w:val="20"/>
         </w:rPr>
-        <w:t xml:space="preserve"> — upload any renamed bank statements, bills, car insurance and licence files not yet in the 801 Drive folder, then choose a representative set with useful date coverage.</w:t>
+        <w:t xml:space="preserve"> — upload any renamed bank statements, bills, car insurance and licence files not yet in the 801 Drive folder, then choose a representative set with useful date coverage - what do you think is missing? </w:t>
       </w:r>
     </w:p>
     <w:p>
@@ -284,10 +283,10 @@
         <w:rPr>
           <w:rFonts w:ascii="Aptos" w:hAnsi="Aptos"/>
           <w:b/>
-          <w:color w:val="9C4800"/>
+          <w:color w:val="1A703D"/>
           <w:sz w:val="19"/>
         </w:rPr>
-        <w:t xml:space="preserve">TO DO  </w:t>
+        <w:t xml:space="preserve">DONE  </w:t>
       </w:r>
       <w:r>
         <w:rPr>
@@ -346,10 +345,10 @@
         <w:rPr>
           <w:rFonts w:ascii="Aptos" w:hAnsi="Aptos"/>
           <w:b/>
-          <w:color w:val="9C4800"/>
+          <w:color w:val="1A703D"/>
           <w:sz w:val="19"/>
         </w:rPr>
-        <w:t xml:space="preserve">TO DO  </w:t>
+        <w:t xml:space="preserve">DONE  </w:t>
       </w:r>
       <w:r>
         <w:rPr>
@@ -470,17 +469,17 @@
         <w:rPr>
           <w:rFonts w:ascii="Aptos" w:hAnsi="Aptos"/>
           <w:b/>
-          <w:color w:val="9C4800"/>
+          <w:color w:val="1A703D"/>
           <w:sz w:val="19"/>
         </w:rPr>
-        <w:t xml:space="preserve">TO DO  </w:t>
+        <w:t xml:space="preserve">DONE  </w:t>
       </w:r>
       <w:r>
         <w:rPr>
           <w:rFonts w:ascii="Aptos" w:hAnsi="Aptos"/>
           <w:sz w:val="20"/>
         </w:rPr>
-        <w:t>Confirm that gas is not applicable at the current home, if correct.</w:t>
+        <w:t>Confirm that gas is not applicable at the current home, if correct. -not applicable</w:t>
       </w:r>
     </w:p>
     <w:p>
@@ -493,17 +492,17 @@
         <w:rPr>
           <w:rFonts w:ascii="Aptos" w:hAnsi="Aptos"/>
           <w:b/>
-          <w:color w:val="9C4800"/>
+          <w:color w:val="1A703D"/>
           <w:sz w:val="19"/>
         </w:rPr>
-        <w:t xml:space="preserve">TO DO  </w:t>
+        <w:t xml:space="preserve">DONE  </w:t>
       </w:r>
       <w:r>
         <w:rPr>
           <w:rFonts w:ascii="Aptos" w:hAnsi="Aptos"/>
           <w:sz w:val="20"/>
         </w:rPr>
-        <w:t>Add Kristina's exact Coffs Coast Wildlife Sanctuary role title if it is readily available from her contract or payslip.</w:t>
+        <w:t>Add Kristina's exact Coffs Coast Wildlife Sanctuary role title if it is readily available from her contract or payslip. - not necessary i think</w:t>
       </w:r>
     </w:p>
     <w:p>
@@ -516,17 +515,17 @@
         <w:rPr>
           <w:rFonts w:ascii="Aptos" w:hAnsi="Aptos"/>
           <w:b/>
-          <w:color w:val="9C4800"/>
+          <w:color w:val="1A703D"/>
           <w:sz w:val="19"/>
         </w:rPr>
-        <w:t xml:space="preserve">TO DO  </w:t>
+        <w:t xml:space="preserve">DONE  </w:t>
       </w:r>
       <w:r>
         <w:rPr>
           <w:rFonts w:ascii="Aptos" w:hAnsi="Aptos"/>
           <w:sz w:val="20"/>
         </w:rPr>
-        <w:t>Add useful Bulgaria accommodation records or trip photos if already available; the joint flight evidence is complete.</w:t>
+        <w:t xml:space="preserve">Add useful Bulgaria accommodation records or trip photos if already available; the joint flight evidence is complete. - have </w:t>
       </w:r>
     </w:p>
     <w:p>
@@ -967,6 +966,29 @@
           <w:sz w:val="20"/>
         </w:rPr>
         <w:t>Three ordinary Messages screenshots gathered for the Bali separation, covering 6–8 October 2025, and uploaded to the Google Drive Contact During Separation folder.</w:t>
+      </w:r>
+    </w:p>
+    <w:p>
+      <w:pPr>
+        <w:keepLines w:val="0"/>
+        <w:spacing w:after="70"/>
+        <w:ind w:left="317" w:hanging="259"/>
+      </w:pPr>
+      <w:r>
+        <w:rPr>
+          <w:rFonts w:ascii="Aptos" w:hAnsi="Aptos"/>
+          <w:b/>
+          <w:color w:val="1A703D"/>
+          <w:sz w:val="19"/>
+        </w:rPr>
+        <w:t xml:space="preserve">DONE  </w:t>
+      </w:r>
+      <w:r>
+        <w:rPr>
+          <w:rFonts w:ascii="Aptos" w:hAnsi="Aptos"/>
+          <w:sz w:val="20"/>
+        </w:rPr>
+        <w:t>Kristina's Form 80 review package prepared and uploaded: fillable PDF draft, editable updated attachment, PDF attachment and consolidated review-items document. Known post-grant address, travel, study and employment details are included; uncertain details are highlighted for confirmation.</w:t>
       </w:r>
     </w:p>
     <w:p>
@@ -1209,7 +1231,15 @@
           <w:rFonts w:ascii="Aptos" w:hAnsi="Aptos"/>
           <w:sz w:val="20"/>
         </w:rPr>
-        <w:t xml:space="preserve">[P1] Updated Form 80 - Personal particulars for character assessment (Kristina) #kristina </w:t>
+        <w:t xml:space="preserve">[P1] Updated Form 80 - Personal particulars for character assessment (Kristina) #kristina — </w:t>
+      </w:r>
+      <w:r>
+        <w:rPr>
+          <w:rFonts w:ascii="Aptos" w:hAnsi="Aptos"/>
+          <w:b/>
+          <w:sz w:val="20"/>
+        </w:rPr>
+        <w:t>IN REVIEW: draft PDF and attachment prepared; highlighted facts, Affinity review and final signature/date remain.</w:t>
       </w:r>
     </w:p>
     <w:p>

</xml_diff>

<commit_message>
vault backup: 2026-10-18 11:16:45
</commit_message>
<xml_diff>
--- a/Visa/801 - Permanent Residency/Prepared Documents/Visa 801 Document Checklist.docx
+++ b/Visa/801 - Permanent Residency/Prepared Documents/Visa 801 Document Checklist.docx
@@ -1638,18 +1638,17 @@
         <w:rPr>
           <w:rFonts w:ascii="Aptos" w:hAnsi="Aptos"/>
           <w:b/>
-          <w:color w:val="9C4800"/>
+          <w:color w:val="1A703D"/>
           <w:sz w:val="19"/>
-          <w:highlight w:val="yellow"/>
-        </w:rPr>
-        <w:t xml:space="preserve">TO DO  </w:t>
+        </w:rPr>
+        <w:t xml:space="preserve">DONE  </w:t>
       </w:r>
       <w:r>
         <w:rPr>
           <w:rFonts w:ascii="Aptos" w:hAnsi="Aptos"/>
           <w:sz w:val="20"/>
         </w:rPr>
-        <w:t xml:space="preserve">[P1] Joint utilities accounts since Sep 2025 — </w:t>
+        <w:t xml:space="preserve">[P1] Utility evidence since Sep 2025 — </w:t>
       </w:r>
       <w:r>
         <w:rPr>
@@ -1657,7 +1656,7 @@
           <w:b/>
           <w:sz w:val="20"/>
         </w:rPr>
-        <w:t>NO JOINTLY NAMED UTILITY ACCOUNT IDENTIFIED. Use the gathered bills as shared-address or household-expense evidence and describe the account holders accurately.</w:t>
+        <w:t>GATHERED. No jointly named utility account was identified; use the bills as shared-address or household-expense evidence and describe the account holders accurately.</w:t>
       </w:r>
     </w:p>
     <w:p>
@@ -2035,10 +2034,10 @@
         <w:rPr>
           <w:rFonts w:ascii="Aptos" w:hAnsi="Aptos"/>
           <w:b/>
-          <w:color w:val="9C4800"/>
+          <w:color w:val="1A703D"/>
           <w:sz w:val="19"/>
         </w:rPr>
-        <w:t xml:space="preserve">TO DO  </w:t>
+        <w:t xml:space="preserve">DONE  </w:t>
       </w:r>
       <w:r>
         <w:rPr>

</xml_diff>

<commit_message>
vault backup: 2026-10-18 15:28:24
</commit_message>
<xml_diff>
--- a/Visa/801 - Permanent Residency/Prepared Documents/Visa 801 Document Checklist.docx
+++ b/Visa/801 - Permanent Residency/Prepared Documents/Visa 801 Document Checklist.docx
@@ -99,7 +99,53 @@
           <w:rFonts w:ascii="Aptos" w:hAnsi="Aptos"/>
           <w:sz w:val="20"/>
         </w:rPr>
-        <w:t xml:space="preserve"> — a review draft of the fillable PDF, updated attachment and central review list was prepared and uploaded on 18 October 2026. Resolve the yellow review items with Kristina, obtain Affinity's review, then sign and date the final form.</w:t>
+        <w:t xml:space="preserve"> — Kristina completed the supporting attachment in Drive on 18 October 2026. A reviewed Word and PDF version has been uploaded. Review the remaining main-PDF facts and the two attachment questions noted below, obtain Affinity's review, then sign and date the final main form.</w:t>
+      </w:r>
+    </w:p>
+    <w:p>
+      <w:pPr>
+        <w:keepLines w:val="0"/>
+        <w:spacing w:after="70"/>
+        <w:ind w:left="706" w:hanging="259"/>
+      </w:pPr>
+      <w:r>
+        <w:rPr>
+          <w:rFonts w:ascii="Aptos" w:hAnsi="Aptos"/>
+          <w:b/>
+          <w:color w:val="9C4800"/>
+          <w:sz w:val="19"/>
+        </w:rPr>
+        <w:t xml:space="preserve">TO DO  </w:t>
+      </w:r>
+      <w:r>
+        <w:rPr>
+          <w:rFonts w:ascii="Aptos" w:hAnsi="Aptos"/>
+          <w:sz w:val="20"/>
+        </w:rPr>
+        <w:t>Confirm with Affinity whether the 21 June 2024–30 September 2026 period should remain one “not employed; studying and volunteering” entry or list material volunteer periods separately.</w:t>
+      </w:r>
+    </w:p>
+    <w:p>
+      <w:pPr>
+        <w:keepLines w:val="0"/>
+        <w:spacing w:after="70"/>
+        <w:ind w:left="706" w:hanging="259"/>
+      </w:pPr>
+      <w:r>
+        <w:rPr>
+          <w:rFonts w:ascii="Aptos" w:hAnsi="Aptos"/>
+          <w:b/>
+          <w:color w:val="9C4800"/>
+          <w:sz w:val="19"/>
+        </w:rPr>
+        <w:t xml:space="preserve">TO DO  </w:t>
+      </w:r>
+      <w:r>
+        <w:rPr>
+          <w:rFonts w:ascii="Aptos" w:hAnsi="Aptos"/>
+          <w:sz w:val="20"/>
+        </w:rPr>
+        <w:t>Confirm how Affinity wants the onshore subclass 820 visa shown in the attachment's arrival/departure columns; the current row shows no arrival date and “current” as departure.</w:t>
       </w:r>
     </w:p>
     <w:p>
@@ -258,7 +304,7 @@
           <w:rFonts w:ascii="Aptos" w:hAnsi="Aptos"/>
           <w:sz w:val="20"/>
         </w:rPr>
-        <w:t xml:space="preserve"> — upload any renamed bank statements, bills, car insurance and licence files not yet in the 801 Drive folder, then choose a representative set with useful date coverage - what do you think is missing? </w:t>
+        <w:t xml:space="preserve"> — no core financial or household evidence category is currently missing. Confirm that the renamed bank statements, bills, car insurance and licence files are all in the 801 Drive folder, then choose a representative set with useful date coverage rather than submitting every repetitive statement or bill.</w:t>
       </w:r>
     </w:p>
     <w:p>
@@ -283,10 +329,10 @@
         <w:rPr>
           <w:rFonts w:ascii="Aptos" w:hAnsi="Aptos"/>
           <w:b/>
-          <w:color w:val="1A703D"/>
+          <w:color w:val="9C4800"/>
           <w:sz w:val="19"/>
         </w:rPr>
-        <w:t xml:space="preserve">DONE  </w:t>
+        <w:t xml:space="preserve">TO DO  </w:t>
       </w:r>
       <w:r>
         <w:rPr>
@@ -301,7 +347,7 @@
           <w:rFonts w:ascii="Aptos" w:hAnsi="Aptos"/>
           <w:sz w:val="20"/>
         </w:rPr>
-        <w:t xml:space="preserve"> — add a clear colour copy of the original and an official English translation if the document is not in English.</w:t>
+        <w:t xml:space="preserve"> — no copy was located in the 801 Drive folder. Add a clear colour copy of the original and an official English translation if the document is not in English.</w:t>
       </w:r>
     </w:p>
     <w:p>
@@ -314,10 +360,10 @@
         <w:rPr>
           <w:rFonts w:ascii="Aptos" w:hAnsi="Aptos"/>
           <w:b/>
-          <w:color w:val="9C4800"/>
+          <w:color w:val="1A703D"/>
           <w:sz w:val="19"/>
         </w:rPr>
-        <w:t xml:space="preserve">TO DO  </w:t>
+        <w:t xml:space="preserve">DONE  </w:t>
       </w:r>
       <w:r>
         <w:rPr>
@@ -332,7 +378,7 @@
           <w:rFonts w:ascii="Aptos" w:hAnsi="Aptos"/>
           <w:sz w:val="20"/>
         </w:rPr>
-        <w:t xml:space="preserve"> — add Kristina's return booking or boarding record for 10 October 2025 when received.</w:t>
+        <w:t xml:space="preserve"> — Kristina's forwarded Jetstar confirmation has been filed in the Travel evidence folder. It records JQ94 departing Bali on 10 October 2025 and arriving at the Gold Coast on 11 October 2025.</w:t>
       </w:r>
     </w:p>
     <w:p>
@@ -502,7 +548,7 @@
           <w:rFonts w:ascii="Aptos" w:hAnsi="Aptos"/>
           <w:sz w:val="20"/>
         </w:rPr>
-        <w:t>Add Kristina's exact Coffs Coast Wildlife Sanctuary role title if it is readily available from her contract or payslip. - not necessary i think</w:t>
+        <w:t>Kristina confirmed the Coffs Coast Wildlife Sanctuary role title as Animal Attendant and supplied the main duties in the Form 80 attachment.</w:t>
       </w:r>
     </w:p>
     <w:p>
@@ -989,6 +1035,52 @@
           <w:sz w:val="20"/>
         </w:rPr>
         <w:t>Kristina's Form 80 review package prepared and uploaded: fillable PDF draft, editable updated attachment, PDF attachment and consolidated review-items document. Known post-grant address, travel, study and employment details are included; uncertain details are highlighted for confirmation.</w:t>
+      </w:r>
+    </w:p>
+    <w:p>
+      <w:pPr>
+        <w:keepLines w:val="0"/>
+        <w:spacing w:after="70"/>
+        <w:ind w:left="317" w:hanging="259"/>
+      </w:pPr>
+      <w:r>
+        <w:rPr>
+          <w:rFonts w:ascii="Aptos" w:hAnsi="Aptos"/>
+          <w:b/>
+          <w:color w:val="1A703D"/>
+          <w:sz w:val="19"/>
+        </w:rPr>
+        <w:t xml:space="preserve">DONE  </w:t>
+      </w:r>
+      <w:r>
+        <w:rPr>
+          <w:rFonts w:ascii="Aptos" w:hAnsi="Aptos"/>
+          <w:sz w:val="20"/>
+        </w:rPr>
+        <w:t>Kristina completed the Form 80 attachment in Drive. A reviewed Word and PDF version was uploaded after correcting the Bali arrival date, removing resolved drafting prompts, filling a missing country, correcting obvious typographical errors and removing a template-only row.</w:t>
+      </w:r>
+    </w:p>
+    <w:p>
+      <w:pPr>
+        <w:keepLines w:val="0"/>
+        <w:spacing w:after="70"/>
+        <w:ind w:left="317" w:hanging="259"/>
+      </w:pPr>
+      <w:r>
+        <w:rPr>
+          <w:rFonts w:ascii="Aptos" w:hAnsi="Aptos"/>
+          <w:b/>
+          <w:color w:val="1A703D"/>
+          <w:sz w:val="19"/>
+        </w:rPr>
+        <w:t xml:space="preserve">DONE  </w:t>
+      </w:r>
+      <w:r>
+        <w:rPr>
+          <w:rFonts w:ascii="Aptos" w:hAnsi="Aptos"/>
+          <w:sz w:val="20"/>
+        </w:rPr>
+        <w:t>Jetstar Bali return confirmation filed: JQ94 departed Denpasar on 10 October 2025 and arrived at the Gold Coast on 11 October 2025.</w:t>
       </w:r>
     </w:p>
     <w:p>
@@ -1239,7 +1331,7 @@
           <w:b/>
           <w:sz w:val="20"/>
         </w:rPr>
-        <w:t>IN REVIEW: draft PDF and attachment prepared; highlighted facts, Affinity review and final signature/date remain.</w:t>
+        <w:t>IN REVIEW: Kristina completed the attachment and a reviewed version is uploaded. Main-PDF confirmations, Affinity review and final signature/date remain.</w:t>
       </w:r>
     </w:p>
     <w:p>
@@ -1761,18 +1853,25 @@
         <w:rPr>
           <w:rFonts w:ascii="Aptos" w:hAnsi="Aptos"/>
           <w:b/>
-          <w:color w:val="9C4800"/>
+          <w:color w:val="1A703D"/>
           <w:sz w:val="19"/>
-          <w:highlight w:val="yellow"/>
-        </w:rPr>
-        <w:t xml:space="preserve">TO DO  </w:t>
+        </w:rPr>
+        <w:t xml:space="preserve">DONE  </w:t>
       </w:r>
       <w:r>
         <w:rPr>
           <w:rFonts w:ascii="Aptos" w:hAnsi="Aptos"/>
           <w:sz w:val="20"/>
         </w:rPr>
-        <w:t>[P1] Correspondence addressed to both you and your partner at the same address (letters, mail, etc)</w:t>
+        <w:t xml:space="preserve">[P1] Correspondence addressed to both you and your partner at the same address (letters, mail, etc) — </w:t>
+      </w:r>
+      <w:r>
+        <w:rPr>
+          <w:rFonts w:ascii="Aptos" w:hAnsi="Aptos"/>
+          <w:b/>
+          <w:sz w:val="20"/>
+        </w:rPr>
+        <w:t>NOT AVAILABLE: Scott confirmed none is known. The joint leases and separate same-address evidence cover the shared residence instead.</w:t>
       </w:r>
     </w:p>
     <w:p>
@@ -1804,6 +1903,37 @@
           <w:sz w:val="20"/>
         </w:rPr>
         <w:t>FLIGHT EVIDENCE GATHERED FOR BOTH BULGARIA TRIPS. Add accommodation or photos if useful.</w:t>
+      </w:r>
+    </w:p>
+    <w:p>
+      <w:pPr>
+        <w:keepLines w:val="0"/>
+        <w:spacing w:after="70"/>
+        <w:ind w:left="317" w:hanging="259"/>
+      </w:pPr>
+      <w:r>
+        <w:rPr>
+          <w:rFonts w:ascii="Aptos" w:hAnsi="Aptos"/>
+          <w:b/>
+          <w:color w:val="1A703D"/>
+          <w:sz w:val="19"/>
+        </w:rPr>
+        <w:t xml:space="preserve">DONE  </w:t>
+      </w:r>
+      <w:r>
+        <w:rPr>
+          <w:rFonts w:ascii="Aptos" w:hAnsi="Aptos"/>
+          <w:sz w:val="20"/>
+        </w:rPr>
+        <w:t xml:space="preserve">[P1] Correspondence and itemised phone accounts to show that contact maintained during any period of separation - since Sep 2025 if applicable — </w:t>
+      </w:r>
+      <w:r>
+        <w:rPr>
+          <w:rFonts w:ascii="Aptos" w:hAnsi="Aptos"/>
+          <w:b/>
+          <w:sz w:val="20"/>
+        </w:rPr>
+        <w:t>GATHERED: three ordinary Messages screenshots from 6–8 October 2025 are filed for the Bali separation. Ask Affinity only whether more is required for the brief absences.</w:t>
       </w:r>
     </w:p>
     <w:p>
@@ -1827,7 +1957,119 @@
           <w:rFonts w:ascii="Aptos" w:hAnsi="Aptos"/>
           <w:sz w:val="20"/>
         </w:rPr>
-        <w:t>[P1] Correspondence and itemised phone accounts to show that contact maintained during any period of separation - since Sep 2025 if applicable</w:t>
+        <w:t xml:space="preserve">[P1] Relationship Timeline Photos - Since Sep 2025 — </w:t>
+      </w:r>
+      <w:r>
+        <w:rPr>
+          <w:rFonts w:ascii="Aptos" w:hAnsi="Aptos"/>
+          <w:b/>
+          <w:sz w:val="20"/>
+        </w:rPr>
+        <w:t>IN PROGRESS: 24 photos across 16 dates have been placed into the updated draft timeline.</w:t>
+      </w:r>
+    </w:p>
+    <w:p>
+      <w:pPr>
+        <w:keepLines w:val="0"/>
+        <w:spacing w:after="70"/>
+        <w:ind w:left="706" w:hanging="259"/>
+      </w:pPr>
+      <w:r>
+        <w:rPr>
+          <w:rFonts w:ascii="Aptos" w:hAnsi="Aptos"/>
+          <w:b/>
+          <w:color w:val="1A703D"/>
+          <w:sz w:val="19"/>
+        </w:rPr>
+        <w:t xml:space="preserve">DONE  </w:t>
+      </w:r>
+      <w:r>
+        <w:rPr>
+          <w:rFonts w:ascii="Aptos" w:hAnsi="Aptos"/>
+          <w:sz w:val="20"/>
+        </w:rPr>
+        <w:t>Compile the current album in chronological order with date, people and a brief caption.</w:t>
+      </w:r>
+    </w:p>
+    <w:p>
+      <w:pPr>
+        <w:keepLines w:val="0"/>
+        <w:spacing w:after="70"/>
+        <w:ind w:left="706" w:hanging="259"/>
+      </w:pPr>
+      <w:r>
+        <w:rPr>
+          <w:rFonts w:ascii="Aptos" w:hAnsi="Aptos"/>
+          <w:b/>
+          <w:color w:val="1A703D"/>
+          <w:sz w:val="19"/>
+        </w:rPr>
+        <w:t xml:space="preserve">DONE  </w:t>
+      </w:r>
+      <w:r>
+        <w:rPr>
+          <w:rFonts w:ascii="Aptos" w:hAnsi="Aptos"/>
+          <w:sz w:val="20"/>
+        </w:rPr>
+        <w:t>Add recent photos through August 2026 and broaden family, social and ordinary-activity coverage.</w:t>
+      </w:r>
+    </w:p>
+    <w:p>
+      <w:pPr>
+        <w:keepLines w:val="0"/>
+        <w:spacing w:after="70"/>
+        <w:ind w:left="706" w:hanging="259"/>
+      </w:pPr>
+      <w:r>
+        <w:rPr>
+          <w:rFonts w:ascii="Aptos" w:hAnsi="Aptos"/>
+          <w:b/>
+          <w:color w:val="9C4800"/>
+          <w:sz w:val="19"/>
+        </w:rPr>
+        <w:t xml:space="preserve">TO DO  </w:t>
+      </w:r>
+      <w:r>
+        <w:rPr>
+          <w:rFonts w:ascii="Aptos" w:hAnsi="Aptos"/>
+          <w:sz w:val="20"/>
+        </w:rPr>
+        <w:t>If available, add one or two photos from March to May 2026 and one or two from September to October 2026; otherwise confirm with Affinity that the present coverage is sufficient.</w:t>
+      </w:r>
+    </w:p>
+    <w:p>
+      <w:pPr>
+        <w:pStyle w:val="Heading1"/>
+      </w:pPr>
+      <w:r>
+        <w:rPr>
+          <w:rFonts w:ascii="Aptos" w:hAnsi="Aptos"/>
+          <w:sz w:val="30"/>
+        </w:rPr>
+        <w:t>Health and character documents</w:t>
+      </w:r>
+    </w:p>
+    <w:p>
+      <w:pPr>
+        <w:keepLines w:val="0"/>
+        <w:spacing w:after="70"/>
+        <w:ind w:left="706" w:hanging="259"/>
+      </w:pPr>
+      <w:r>
+        <w:rPr>
+          <w:rFonts w:ascii="Aptos" w:hAnsi="Aptos"/>
+          <w:b/>
+          <w:color w:val="1A703D"/>
+          <w:sz w:val="19"/>
+        </w:rPr>
+        <w:t xml:space="preserve">DONE  </w:t>
+      </w:r>
+      <w:r>
+        <w:rPr>
+          <w:rFonts w:ascii="Aptos" w:hAnsi="Aptos"/>
+          <w:sz w:val="20"/>
+        </w:rPr>
+        <w:t>Health examinations (if required - you will be notified)</w:t>
       </w:r>
     </w:p>
     <w:p>
@@ -1840,26 +2082,75 @@
         <w:rPr>
           <w:rFonts w:ascii="Aptos" w:hAnsi="Aptos"/>
           <w:b/>
-          <w:color w:val="9C4800"/>
+          <w:color w:val="1A703D"/>
           <w:sz w:val="19"/>
-          <w:highlight w:val="yellow"/>
-        </w:rPr>
-        <w:t xml:space="preserve">TO DO  </w:t>
+        </w:rPr>
+        <w:t xml:space="preserve">DONE  </w:t>
       </w:r>
       <w:r>
         <w:rPr>
           <w:rFonts w:ascii="Aptos" w:hAnsi="Aptos"/>
           <w:sz w:val="20"/>
         </w:rPr>
-        <w:t xml:space="preserve">[P1] Relationship Timeline Photos - Since Sep 2025 — </w:t>
-      </w:r>
+        <w:t>Australian federal police check (only required if not provided in stage 1 - we provided 1 in stage 1)</w:t>
+      </w:r>
+    </w:p>
+    <w:p>
+      <w:pPr>
+        <w:keepLines w:val="0"/>
+        <w:spacing w:after="70"/>
+        <w:ind w:left="317" w:hanging="259"/>
+      </w:pPr>
       <w:r>
         <w:rPr>
           <w:rFonts w:ascii="Aptos" w:hAnsi="Aptos"/>
           <w:b/>
+          <w:color w:val="1A703D"/>
+          <w:sz w:val="19"/>
+        </w:rPr>
+        <w:t xml:space="preserve">DONE  </w:t>
+      </w:r>
+      <w:r>
+        <w:rPr>
+          <w:rFonts w:ascii="Aptos" w:hAnsi="Aptos"/>
           <w:sz w:val="20"/>
         </w:rPr>
-        <w:t>IN PROGRESS: 24 photos across 16 dates have been placed into the updated draft timeline.</w:t>
+        <w:t>Police certificates from each country in which anyone in your application has spent a total of 12 months or more since the grant of the temporary partner visa (If required you will be notified). We both haven't spent more than 12 months out of Australia since then, so no worries</w:t>
+      </w:r>
+    </w:p>
+    <w:p>
+      <w:pPr>
+        <w:pStyle w:val="Heading1"/>
+      </w:pPr>
+      <w:r>
+        <w:rPr>
+          <w:rFonts w:ascii="Aptos" w:hAnsi="Aptos"/>
+          <w:sz w:val="30"/>
+        </w:rPr>
+        <w:t>Sponsor (Scott)</w:t>
+      </w:r>
+    </w:p>
+    <w:p>
+      <w:pPr>
+        <w:keepLines w:val="0"/>
+        <w:spacing w:after="70"/>
+        <w:ind w:left="317" w:hanging="259"/>
+      </w:pPr>
+      <w:r>
+        <w:rPr>
+          <w:rFonts w:ascii="Aptos" w:hAnsi="Aptos"/>
+          <w:b/>
+          <w:color w:val="1A703D"/>
+          <w:sz w:val="19"/>
+        </w:rPr>
+        <w:t xml:space="preserve">DONE  </w:t>
+      </w:r>
+      <w:r>
+        <w:rPr>
+          <w:rFonts w:ascii="Aptos" w:hAnsi="Aptos"/>
+          <w:sz w:val="20"/>
+        </w:rPr>
+        <w:t>Copy of the biographical pages of current passport - photo, personal details, and the issue/expiry dates</w:t>
       </w:r>
     </w:p>
     <w:p>
@@ -1882,7 +2173,30 @@
           <w:rFonts w:ascii="Aptos" w:hAnsi="Aptos"/>
           <w:sz w:val="20"/>
         </w:rPr>
-        <w:t>Compile the current album in chronological order with date, people and a brief caption.</w:t>
+        <w:t>Scott's passport — current biographical page added to Evidence.</w:t>
+      </w:r>
+    </w:p>
+    <w:p>
+      <w:pPr>
+        <w:keepLines w:val="0"/>
+        <w:spacing w:after="70"/>
+        <w:ind w:left="317" w:hanging="259"/>
+      </w:pPr>
+      <w:r>
+        <w:rPr>
+          <w:rFonts w:ascii="Aptos" w:hAnsi="Aptos"/>
+          <w:b/>
+          <w:color w:val="1A703D"/>
+          <w:sz w:val="19"/>
+        </w:rPr>
+        <w:t xml:space="preserve">DONE  </w:t>
+      </w:r>
+      <w:r>
+        <w:rPr>
+          <w:rFonts w:ascii="Aptos" w:hAnsi="Aptos"/>
+          <w:sz w:val="20"/>
+        </w:rPr>
+        <w:t>[P1] Copy of Australian Drivers' license (if applicable)</w:t>
       </w:r>
     </w:p>
     <w:p>
@@ -1905,14 +2219,164 @@
           <w:rFonts w:ascii="Aptos" w:hAnsi="Aptos"/>
           <w:sz w:val="20"/>
         </w:rPr>
-        <w:t>Add recent photos through August 2026 and broaden family, social and ordinary-activity coverage.</w:t>
+        <w:t>Scott's NSW licence — front and back included across two pages.</w:t>
       </w:r>
     </w:p>
     <w:p>
       <w:pPr>
         <w:keepLines w:val="0"/>
         <w:spacing w:after="70"/>
-        <w:ind w:left="706" w:hanging="259"/>
+        <w:ind w:left="317" w:hanging="259"/>
+      </w:pPr>
+      <w:r>
+        <w:rPr>
+          <w:rFonts w:ascii="Aptos" w:hAnsi="Aptos"/>
+          <w:b/>
+          <w:color w:val="1A703D"/>
+          <w:sz w:val="19"/>
+        </w:rPr>
+        <w:t xml:space="preserve">DONE  </w:t>
+      </w:r>
+      <w:r>
+        <w:rPr>
+          <w:rFonts w:ascii="Aptos" w:hAnsi="Aptos"/>
+          <w:sz w:val="20"/>
+        </w:rPr>
+        <w:t>Australian Federal police check (only required if not provided in stage 1)</w:t>
+      </w:r>
+    </w:p>
+    <w:p>
+      <w:pPr>
+        <w:keepLines w:val="0"/>
+        <w:spacing w:after="70"/>
+        <w:ind w:left="317" w:hanging="259"/>
+      </w:pPr>
+      <w:r>
+        <w:rPr>
+          <w:rFonts w:ascii="Aptos" w:hAnsi="Aptos"/>
+          <w:b/>
+          <w:color w:val="1A703D"/>
+          <w:sz w:val="19"/>
+        </w:rPr>
+        <w:t xml:space="preserve">DONE  </w:t>
+      </w:r>
+      <w:r>
+        <w:rPr>
+          <w:rFonts w:ascii="Aptos" w:hAnsi="Aptos"/>
+          <w:sz w:val="20"/>
+        </w:rPr>
+        <w:t>Police certificates from Bulgaria (only required if not provided previously - if required you will be notified)</w:t>
+      </w:r>
+    </w:p>
+    <w:p>
+      <w:pPr>
+        <w:pStyle w:val="Heading1"/>
+      </w:pPr>
+      <w:r>
+        <w:rPr>
+          <w:rFonts w:ascii="Aptos" w:hAnsi="Aptos"/>
+          <w:sz w:val="30"/>
+        </w:rPr>
+        <w:t>Statement confirmations and remaining actions</w:t>
+      </w:r>
+    </w:p>
+    <w:p>
+      <w:r>
+        <w:rPr>
+          <w:rFonts w:ascii="Aptos" w:hAnsi="Aptos"/>
+          <w:sz w:val="20"/>
+        </w:rPr>
+        <w:t>The initial draft is prepared for review. Add replies beneath these items; approximate dates are fine where exact dates are being checked.</w:t>
+      </w:r>
+    </w:p>
+    <w:p>
+      <w:pPr>
+        <w:pStyle w:val="Heading2"/>
+      </w:pPr>
+      <w:r>
+        <w:rPr>
+          <w:rFonts w:ascii="Aptos" w:hAnsi="Aptos"/>
+          <w:sz w:val="24"/>
+        </w:rPr>
+        <w:t>Scott's review required now</w:t>
+      </w:r>
+    </w:p>
+    <w:p>
+      <w:r>
+        <w:rPr>
+          <w:rFonts w:ascii="Aptos" w:hAnsi="Aptos"/>
+          <w:sz w:val="20"/>
+        </w:rPr>
+        <w:t>These questions are intended to replace vague wording with facts Scott can personally confirm. Do not state a fact as certain until it is confirmed here or supported by evidence.</w:t>
+      </w:r>
+    </w:p>
+    <w:p>
+      <w:pPr>
+        <w:keepLines w:val="0"/>
+        <w:spacing w:after="70"/>
+        <w:ind w:left="317" w:hanging="259"/>
+      </w:pPr>
+      <w:r>
+        <w:rPr>
+          <w:rFonts w:ascii="Aptos" w:hAnsi="Aptos"/>
+          <w:b/>
+          <w:color w:val="1A703D"/>
+          <w:sz w:val="19"/>
+        </w:rPr>
+        <w:t xml:space="preserve">DONE  </w:t>
+      </w:r>
+      <w:r>
+        <w:rPr>
+          <w:rFonts w:ascii="Aptos" w:hAnsi="Aptos"/>
+          <w:b/>
+          <w:sz w:val="20"/>
+        </w:rPr>
+        <w:t>Kristina's superannuation beneficiary evidence</w:t>
+      </w:r>
+      <w:r>
+        <w:rPr>
+          <w:rFonts w:ascii="Aptos" w:hAnsi="Aptos"/>
+          <w:sz w:val="20"/>
+        </w:rPr>
+        <w:t xml:space="preserve"> — added to Evidence; no further review requested.</w:t>
+      </w:r>
+    </w:p>
+    <w:p>
+      <w:pPr>
+        <w:keepLines w:val="0"/>
+        <w:spacing w:after="70"/>
+        <w:ind w:left="317" w:hanging="259"/>
+      </w:pPr>
+      <w:r>
+        <w:rPr>
+          <w:rFonts w:ascii="Aptos" w:hAnsi="Aptos"/>
+          <w:b/>
+          <w:color w:val="1A703D"/>
+          <w:sz w:val="19"/>
+        </w:rPr>
+        <w:t xml:space="preserve">DONE  </w:t>
+      </w:r>
+      <w:r>
+        <w:rPr>
+          <w:rFonts w:ascii="Aptos" w:hAnsi="Aptos"/>
+          <w:b/>
+          <w:sz w:val="20"/>
+        </w:rPr>
+        <w:t>Bali contact wording</w:t>
+      </w:r>
+      <w:r>
+        <w:rPr>
+          <w:rFonts w:ascii="Aptos" w:hAnsi="Aptos"/>
+          <w:sz w:val="20"/>
+        </w:rPr>
+        <w:t xml:space="preserve"> — use: “We remained in regular contact through messages on most days and video calls when her schedule allowed.” Do not claim daily contact or a specific call count. Three message screenshots from 6–8 October 2025 have been uploaded to Drive.</w:t>
+      </w:r>
+    </w:p>
+    <w:p>
+      <w:pPr>
+        <w:keepLines w:val="0"/>
+        <w:spacing w:after="70"/>
+        <w:ind w:left="317" w:hanging="259"/>
       </w:pPr>
       <w:r>
         <w:rPr>
@@ -1926,28 +2390,24 @@
       <w:r>
         <w:rPr>
           <w:rFonts w:ascii="Aptos" w:hAnsi="Aptos"/>
+          <w:b/>
           <w:sz w:val="20"/>
         </w:rPr>
-        <w:t>If available, add one or two photos from March to May 2026 and one or two from September to October 2026; otherwise confirm with Affinity that the present coverage is sufficient.</w:t>
+        <w:t>Other periods apart</w:t>
+      </w:r>
+      <w:r>
+        <w:rPr>
+          <w:rFonts w:ascii="Aptos" w:hAnsi="Aptos"/>
+          <w:sz w:val="20"/>
+        </w:rPr>
+        <w:t xml:space="preserve"> — ask Affinity whether exact dates, durations and separate contact evidence are required for the short absences involving the brother's house move, birthdays, TAFE excursions and Sydney Bats. Definite solo work travel is confirmed for Sydney from 11 to 14 May 2026.</w:t>
       </w:r>
     </w:p>
     <w:p>
       <w:pPr>
-        <w:pStyle w:val="Heading1"/>
-      </w:pPr>
-      <w:r>
-        <w:rPr>
-          <w:rFonts w:ascii="Aptos" w:hAnsi="Aptos"/>
-          <w:sz w:val="30"/>
-        </w:rPr>
-        <w:t>Health and character documents</w:t>
-      </w:r>
-    </w:p>
-    <w:p>
-      <w:pPr>
         <w:keepLines w:val="0"/>
         <w:spacing w:after="70"/>
-        <w:ind w:left="706" w:hanging="259"/>
+        <w:ind w:left="317" w:hanging="259"/>
       </w:pPr>
       <w:r>
         <w:rPr>
@@ -1961,9 +2421,17 @@
       <w:r>
         <w:rPr>
           <w:rFonts w:ascii="Aptos" w:hAnsi="Aptos"/>
+          <w:b/>
           <w:sz w:val="20"/>
         </w:rPr>
-        <w:t>Health examinations (if required - you will be notified)</w:t>
+        <w:t>Sanctuary role title</w:t>
+      </w:r>
+      <w:r>
+        <w:rPr>
+          <w:rFonts w:ascii="Aptos" w:hAnsi="Aptos"/>
+          <w:sz w:val="20"/>
+        </w:rPr>
+        <w:t xml:space="preserve"> — Kristina confirmed Animal Attendant. The Form 80 attachment records care of animals, preparation and provision of diets, and educational presentations. First shift was 1 October 2026 and first pay was deposited into joint 2Up.</w:t>
       </w:r>
     </w:p>
     <w:p>
@@ -1984,9 +2452,17 @@
       <w:r>
         <w:rPr>
           <w:rFonts w:ascii="Aptos" w:hAnsi="Aptos"/>
+          <w:b/>
           <w:sz w:val="20"/>
         </w:rPr>
-        <w:t>Australian federal police check (only required if not provided in stage 1 - we provided 1 in stage 1)</w:t>
+        <w:t>Lease extension</w:t>
+      </w:r>
+      <w:r>
+        <w:rPr>
+          <w:rFonts w:ascii="Aptos" w:hAnsi="Aptos"/>
+          <w:sz w:val="20"/>
+        </w:rPr>
+        <w:t xml:space="preserve"> — renewal period 27 July 2026 to 25 January 2027 is confirmed by Scott and appears in the lease document.</w:t>
       </w:r>
     </w:p>
     <w:p>
@@ -2007,21 +2483,17 @@
       <w:r>
         <w:rPr>
           <w:rFonts w:ascii="Aptos" w:hAnsi="Aptos"/>
+          <w:b/>
           <w:sz w:val="20"/>
         </w:rPr>
-        <w:t>Police certificates from each country in which anyone in your application has spent a total of 12 months or more since the grant of the temporary partner visa (If required you will be notified). We both haven't spent more than 12 months out of Australia since then, so no worries</w:t>
-      </w:r>
-    </w:p>
-    <w:p>
-      <w:pPr>
-        <w:pStyle w:val="Heading1"/>
-      </w:pPr>
-      <w:r>
-        <w:rPr>
-          <w:rFonts w:ascii="Aptos" w:hAnsi="Aptos"/>
-          <w:sz w:val="30"/>
-        </w:rPr>
-        <w:t>Sponsor (Scott)</w:t>
+        <w:t>Scott's work</w:t>
+      </w:r>
+      <w:r>
+        <w:rPr>
+          <w:rFonts w:ascii="Aptos" w:hAnsi="Aptos"/>
+          <w:sz w:val="20"/>
+        </w:rPr>
+        <w:t xml:space="preserve"> — use “Software Engineer”; employment commenced 21 October 2024.</w:t>
       </w:r>
     </w:p>
     <w:p>
@@ -2042,16 +2514,67 @@
       <w:r>
         <w:rPr>
           <w:rFonts w:ascii="Aptos" w:hAnsi="Aptos"/>
+          <w:b/>
           <w:sz w:val="20"/>
         </w:rPr>
-        <w:t>Copy of the biographical pages of current passport - photo, personal details, and the issue/expiry dates</w:t>
+        <w:t>Bereavement timing</w:t>
+      </w:r>
+      <w:r>
+        <w:rPr>
+          <w:rFonts w:ascii="Aptos" w:hAnsi="Aptos"/>
+          <w:sz w:val="20"/>
+        </w:rPr>
+        <w:t xml:space="preserve"> — keep the timing general. The exact date of death is not necessary for the relationship narrative unless Affinity requests it or Scott chooses to include it.</w:t>
       </w:r>
     </w:p>
     <w:p>
       <w:pPr>
         <w:keepLines w:val="0"/>
         <w:spacing w:after="70"/>
-        <w:ind w:left="706" w:hanging="259"/>
+        <w:ind w:left="317" w:hanging="259"/>
+      </w:pPr>
+      <w:r>
+        <w:rPr>
+          <w:rFonts w:ascii="Aptos" w:hAnsi="Aptos"/>
+          <w:b/>
+          <w:color w:val="9C4800"/>
+          <w:sz w:val="19"/>
+        </w:rPr>
+        <w:t xml:space="preserve">TO DO  </w:t>
+      </w:r>
+      <w:r>
+        <w:rPr>
+          <w:rFonts w:ascii="Aptos" w:hAnsi="Aptos"/>
+          <w:b/>
+          <w:sz w:val="20"/>
+        </w:rPr>
+        <w:t>Final voice and accuracy review</w:t>
+      </w:r>
+      <w:r>
+        <w:rPr>
+          <w:rFonts w:ascii="Aptos" w:hAnsi="Aptos"/>
+          <w:sz w:val="20"/>
+        </w:rPr>
+        <w:t xml:space="preserve"> — check that the draft sounds like Scott and is accurate, especially the bereavement, finances, living arrangements and future-plans sections. Update the cutoff date, then send it to Affinity and arrange signing only after the content is final.</w:t>
+      </w:r>
+    </w:p>
+    <w:p>
+      <w:pPr>
+        <w:pStyle w:val="Heading2"/>
+      </w:pPr>
+      <w:r>
+        <w:rPr>
+          <w:rFonts w:ascii="Aptos" w:hAnsi="Aptos"/>
+          <w:sz w:val="24"/>
+        </w:rPr>
+        <w:t>Resolved statement points</w:t>
+      </w:r>
+    </w:p>
+    <w:p>
+      <w:pPr>
+        <w:keepLines w:val="0"/>
+        <w:spacing w:after="70"/>
+        <w:ind w:left="317" w:hanging="259"/>
       </w:pPr>
       <w:r>
         <w:rPr>
@@ -2067,7 +2590,7 @@
           <w:rFonts w:ascii="Aptos" w:hAnsi="Aptos"/>
           <w:sz w:val="20"/>
         </w:rPr>
-        <w:t>Scott's passport — current biographical page added to Evidence.</w:t>
+        <w:t>School friend's wedding — Photos metadata confirms 15 August 2025 in Buccan. This was before the 820 grant date, so it remains outside the updated statement. The couple's names are only needed if you choose to add it as earlier social context.</w:t>
       </w:r>
     </w:p>
     <w:p>
@@ -2090,14 +2613,14 @@
           <w:rFonts w:ascii="Aptos" w:hAnsi="Aptos"/>
           <w:sz w:val="20"/>
         </w:rPr>
-        <w:t>[P1] Copy of Australian Drivers' license (if applicable)</w:t>
+        <w:t>Car purchase — confirmed from the tax invoice: 7 November 2024, 2019 Mazda 3. Current registration-related evidence shows NSW registration DN93QA and Scott as owner. The ING loan is solely in Scott's name.</w:t>
       </w:r>
     </w:p>
     <w:p>
       <w:pPr>
         <w:keepLines w:val="0"/>
         <w:spacing w:after="70"/>
-        <w:ind w:left="706" w:hanging="259"/>
+        <w:ind w:left="317" w:hanging="259"/>
       </w:pPr>
       <w:r>
         <w:rPr>
@@ -2113,7 +2636,28 @@
           <w:rFonts w:ascii="Aptos" w:hAnsi="Aptos"/>
           <w:sz w:val="20"/>
         </w:rPr>
-        <w:t>Scott's NSW licence — front and back included across two pages.</w:t>
+        <w:t>Bali travel arrangements — Scott and Kristina drove to the Gold Coast together and left the car at Scott's mum's house. Kristina travelled alone; Scott remained in Australia. A dog sitter was arranged. Add these details only where they improve the account.</w:t>
+      </w:r>
+    </w:p>
+    <w:p>
+      <w:r>
+        <w:rPr>
+          <w:rFonts w:ascii="Aptos" w:hAnsi="Aptos"/>
+          <w:sz w:val="20"/>
+        </w:rPr>
+        <w:t>Response space: add answers below the relevant item, using approximate dates where exact dates are still being checked.</w:t>
+      </w:r>
+    </w:p>
+    <w:p>
+      <w:pPr>
+        <w:pStyle w:val="Heading1"/>
+      </w:pPr>
+      <w:r>
+        <w:rPr>
+          <w:rFonts w:ascii="Aptos" w:hAnsi="Aptos"/>
+          <w:sz w:val="30"/>
+        </w:rPr>
+        <w:t>Additional evidence follow-up and agency clarifications</w:t>
       </w:r>
     </w:p>
     <w:p>
@@ -2136,7 +2680,7 @@
           <w:rFonts w:ascii="Aptos" w:hAnsi="Aptos"/>
           <w:sz w:val="20"/>
         </w:rPr>
-        <w:t>Australian Federal police check (only required if not provided in stage 1)</w:t>
+        <w:t>Bali return evidence — Kristina forwarded the Jetstar confirmation and it is filed in the Drive Travel folder. JQ94 departed Denpasar on 10 October 2025 and arrived at the Gold Coast on 11 October 2025.</w:t>
       </w:r>
     </w:p>
     <w:p>
@@ -2149,59 +2693,17 @@
         <w:rPr>
           <w:rFonts w:ascii="Aptos" w:hAnsi="Aptos"/>
           <w:b/>
-          <w:color w:val="1A703D"/>
+          <w:color w:val="9C4800"/>
           <w:sz w:val="19"/>
         </w:rPr>
-        <w:t xml:space="preserve">DONE  </w:t>
+        <w:t xml:space="preserve">TO DO  </w:t>
       </w:r>
       <w:r>
         <w:rPr>
           <w:rFonts w:ascii="Aptos" w:hAnsi="Aptos"/>
           <w:sz w:val="20"/>
         </w:rPr>
-        <w:t>Police certificates from Bulgaria (only required if not provided previously - if required you will be notified)</w:t>
-      </w:r>
-    </w:p>
-    <w:p>
-      <w:pPr>
-        <w:pStyle w:val="Heading1"/>
-      </w:pPr>
-      <w:r>
-        <w:rPr>
-          <w:rFonts w:ascii="Aptos" w:hAnsi="Aptos"/>
-          <w:sz w:val="30"/>
-        </w:rPr>
-        <w:t>Statement confirmations and remaining actions</w:t>
-      </w:r>
-    </w:p>
-    <w:p>
-      <w:r>
-        <w:rPr>
-          <w:rFonts w:ascii="Aptos" w:hAnsi="Aptos"/>
-          <w:sz w:val="20"/>
-        </w:rPr>
-        <w:t>The initial draft is prepared for review. Add replies beneath these items; approximate dates are fine where exact dates are being checked.</w:t>
-      </w:r>
-    </w:p>
-    <w:p>
-      <w:pPr>
-        <w:pStyle w:val="Heading2"/>
-      </w:pPr>
-      <w:r>
-        <w:rPr>
-          <w:rFonts w:ascii="Aptos" w:hAnsi="Aptos"/>
-          <w:sz w:val="24"/>
-        </w:rPr>
-        <w:t>Scott's review required now</w:t>
-      </w:r>
-    </w:p>
-    <w:p>
-      <w:r>
-        <w:rPr>
-          <w:rFonts w:ascii="Aptos" w:hAnsi="Aptos"/>
-          <w:sz w:val="20"/>
-        </w:rPr>
-        <w:t>These questions are intended to replace vague wording with facts Scott can personally confirm. Do not state a fact as certain until it is confirmed here or supported by evidence.</w:t>
+        <w:t>Joint travel — December and June Bulgaria flight records have been reviewed. Add available accommodation details and photos where helpful. No extra December passenger record is requested: Scott confirmed both travelled and the booking is for two travellers.</w:t>
       </w:r>
     </w:p>
     <w:p>
@@ -2222,17 +2724,9 @@
       <w:r>
         <w:rPr>
           <w:rFonts w:ascii="Aptos" w:hAnsi="Aptos"/>
-          <w:b/>
           <w:sz w:val="20"/>
         </w:rPr>
-        <w:t>Kristina's superannuation beneficiary evidence</w:t>
-      </w:r>
-      <w:r>
-        <w:rPr>
-          <w:rFonts w:ascii="Aptos" w:hAnsi="Aptos"/>
-          <w:sz w:val="20"/>
-        </w:rPr>
-        <w:t xml:space="preserve"> — added to Evidence; no further review requested.</w:t>
+        <w:t>Contact during separation — three dated Bali Messages screenshots from 6–8 October 2025 are uploaded to the Drive Contact During Separation folder. Ask Affinity whether further records are required for brief absences.</w:t>
       </w:r>
     </w:p>
     <w:p>
@@ -2253,17 +2747,9 @@
       <w:r>
         <w:rPr>
           <w:rFonts w:ascii="Aptos" w:hAnsi="Aptos"/>
-          <w:b/>
           <w:sz w:val="20"/>
         </w:rPr>
-        <w:t>Bali contact wording</w:t>
-      </w:r>
-      <w:r>
-        <w:rPr>
-          <w:rFonts w:ascii="Aptos" w:hAnsi="Aptos"/>
-          <w:sz w:val="20"/>
-        </w:rPr>
-        <w:t xml:space="preserve"> — use: “We remained in regular contact through messages on most days and video calls when her schedule allowed.” Do not claim daily contact or a specific call count. Three message screenshots from 6–8 October 2025 have been uploaded to Drive.</w:t>
+        <w:t>Shared finances — CBA, 2Up and ING statements have been retrieved with relevant date coverage. ING and the loans remain accurately described as solely held. Upload and final submission selection are tracked above.</w:t>
       </w:r>
     </w:p>
     <w:p>
@@ -2276,25 +2762,17 @@
         <w:rPr>
           <w:rFonts w:ascii="Aptos" w:hAnsi="Aptos"/>
           <w:b/>
-          <w:color w:val="9C4800"/>
+          <w:color w:val="1A703D"/>
           <w:sz w:val="19"/>
         </w:rPr>
-        <w:t xml:space="preserve">TO DO  </w:t>
-      </w:r>
-      <w:r>
-        <w:rPr>
-          <w:rFonts w:ascii="Aptos" w:hAnsi="Aptos"/>
-          <w:b/>
+        <w:t xml:space="preserve">DONE  </w:t>
+      </w:r>
+      <w:r>
+        <w:rPr>
+          <w:rFonts w:ascii="Aptos" w:hAnsi="Aptos"/>
           <w:sz w:val="20"/>
         </w:rPr>
-        <w:t>Other periods apart</w:t>
-      </w:r>
-      <w:r>
-        <w:rPr>
-          <w:rFonts w:ascii="Aptos" w:hAnsi="Aptos"/>
-          <w:sz w:val="20"/>
-        </w:rPr>
-        <w:t xml:space="preserve"> — ask Affinity whether exact dates, durations and separate contact evidence are required for the short absences involving the brother's house move, birthdays, TAFE excursions and Sydney Bats. Definite solo work travel is confirmed for Sydney from 11 to 14 May 2026.</w:t>
+        <w:t>Legal commitments — beneficiary evidence for both partners and the joint leases have been gathered.</w:t>
       </w:r>
     </w:p>
     <w:p>
@@ -2307,25 +2785,17 @@
         <w:rPr>
           <w:rFonts w:ascii="Aptos" w:hAnsi="Aptos"/>
           <w:b/>
-          <w:color w:val="9C4800"/>
+          <w:color w:val="1A703D"/>
           <w:sz w:val="19"/>
         </w:rPr>
-        <w:t xml:space="preserve">TO DO  </w:t>
-      </w:r>
-      <w:r>
-        <w:rPr>
-          <w:rFonts w:ascii="Aptos" w:hAnsi="Aptos"/>
-          <w:b/>
+        <w:t xml:space="preserve">DONE  </w:t>
+      </w:r>
+      <w:r>
+        <w:rPr>
+          <w:rFonts w:ascii="Aptos" w:hAnsi="Aptos"/>
           <w:sz w:val="20"/>
         </w:rPr>
-        <w:t>Sanctuary role title</w:t>
-      </w:r>
-      <w:r>
-        <w:rPr>
-          <w:rFonts w:ascii="Aptos" w:hAnsi="Aptos"/>
-          <w:sz w:val="20"/>
-        </w:rPr>
-        <w:t xml:space="preserve"> — first shift confirmed as 1 October 2026 and first pay confirmed as deposited into joint 2Up. Add the exact role title if it is readily available from the contract or payslip.</w:t>
+        <w:t>Utilities — electricity, internet and telephone bills reviewed are in Scott's name; water bills are addressed to the property owner or agent. Gas is not applicable. Do not describe these as jointly held accounts.</w:t>
       </w:r>
     </w:p>
     <w:p>
@@ -2346,17 +2816,9 @@
       <w:r>
         <w:rPr>
           <w:rFonts w:ascii="Aptos" w:hAnsi="Aptos"/>
-          <w:b/>
           <w:sz w:val="20"/>
         </w:rPr>
-        <w:t>Lease extension</w:t>
-      </w:r>
-      <w:r>
-        <w:rPr>
-          <w:rFonts w:ascii="Aptos" w:hAnsi="Aptos"/>
-          <w:sz w:val="20"/>
-        </w:rPr>
-        <w:t xml:space="preserve"> — renewal period 27 July 2026 to 25 January 2027 is confirmed by Scott and appears in the lease document.</w:t>
+        <w:t>Urunga lease — Scott confirmed that after the fixed term the tenancy continued periodically until Scott and Kristina moved to Coffs Harbour in July 2025.</w:t>
       </w:r>
     </w:p>
     <w:p>
@@ -2369,25 +2831,17 @@
         <w:rPr>
           <w:rFonts w:ascii="Aptos" w:hAnsi="Aptos"/>
           <w:b/>
-          <w:color w:val="1A703D"/>
+          <w:color w:val="9C4800"/>
           <w:sz w:val="19"/>
         </w:rPr>
-        <w:t xml:space="preserve">DONE  </w:t>
-      </w:r>
-      <w:r>
-        <w:rPr>
-          <w:rFonts w:ascii="Aptos" w:hAnsi="Aptos"/>
-          <w:b/>
+        <w:t xml:space="preserve">TO DO  </w:t>
+      </w:r>
+      <w:r>
+        <w:rPr>
+          <w:rFonts w:ascii="Aptos" w:hAnsi="Aptos"/>
           <w:sz w:val="20"/>
         </w:rPr>
-        <w:t>Scott's work</w:t>
-      </w:r>
-      <w:r>
-        <w:rPr>
-          <w:rFonts w:ascii="Aptos" w:hAnsi="Aptos"/>
-          <w:sz w:val="20"/>
-        </w:rPr>
-        <w:t xml:space="preserve"> — use “Software Engineer”; employment commenced 21 October 2024.</w:t>
+        <w:t>Agency question — confirm whether Kristina’s Bulgarian licence is wanted.</w:t>
       </w:r>
     </w:p>
     <w:p>
@@ -2400,25 +2854,38 @@
         <w:rPr>
           <w:rFonts w:ascii="Aptos" w:hAnsi="Aptos"/>
           <w:b/>
-          <w:color w:val="1A703D"/>
+          <w:color w:val="9C4800"/>
           <w:sz w:val="19"/>
         </w:rPr>
-        <w:t xml:space="preserve">DONE  </w:t>
-      </w:r>
-      <w:r>
-        <w:rPr>
-          <w:rFonts w:ascii="Aptos" w:hAnsi="Aptos"/>
-          <w:b/>
+        <w:t xml:space="preserve">TO DO  </w:t>
+      </w:r>
+      <w:r>
+        <w:rPr>
+          <w:rFonts w:ascii="Aptos" w:hAnsi="Aptos"/>
           <w:sz w:val="20"/>
         </w:rPr>
-        <w:t>Bereavement timing</w:t>
-      </w:r>
+        <w:t>Optional supporting records — locate course completion certificates, sanctuary contract/payslip, volunteering records and veterinary invoices/loan records where useful. These are supporting suggestions, not additional agency requirements.</w:t>
+      </w:r>
+    </w:p>
+    <w:p>
+      <w:pPr>
+        <w:pStyle w:val="Heading1"/>
+      </w:pPr>
+      <w:r>
+        <w:rPr>
+          <w:rFonts w:ascii="Aptos" w:hAnsi="Aptos"/>
+          <w:sz w:val="30"/>
+        </w:rPr>
+        <w:t>Photo timeline review and gaps</w:t>
+      </w:r>
+    </w:p>
+    <w:p>
       <w:r>
         <w:rPr>
           <w:rFonts w:ascii="Aptos" w:hAnsi="Aptos"/>
           <w:sz w:val="20"/>
         </w:rPr>
-        <w:t xml:space="preserve"> — keep the timing general. The exact date of death is not necessary for the relationship narrative unless Affinity requests it or Scott chooses to include it.</w:t>
+        <w:t>The updated draft contains 24 photos across 16 dates from August 2025 to August 2026. Kristina's added photos improve June–August 2026 coverage and add family, friends, walking, sailing and a current couple photograph.</w:t>
       </w:r>
     </w:p>
     <w:p>
@@ -2431,10 +2898,10 @@
         <w:rPr>
           <w:rFonts w:ascii="Aptos" w:hAnsi="Aptos"/>
           <w:b/>
-          <w:color w:val="9C4800"/>
+          <w:color w:val="1A703D"/>
           <w:sz w:val="19"/>
         </w:rPr>
-        <w:t xml:space="preserve">TO DO  </w:t>
+        <w:t xml:space="preserve">DONE  </w:t>
       </w:r>
       <w:r>
         <w:rPr>
@@ -2442,26 +2909,14 @@
           <w:b/>
           <w:sz w:val="20"/>
         </w:rPr>
-        <w:t>Final voice and accuracy review</w:t>
+        <w:t>Recent coverage</w:t>
       </w:r>
       <w:r>
         <w:rPr>
           <w:rFonts w:ascii="Aptos" w:hAnsi="Aptos"/>
           <w:sz w:val="20"/>
         </w:rPr>
-        <w:t xml:space="preserve"> — check that the draft sounds like Scott and is accurate, especially the bereavement, finances, living arrangements and future-plans sections. Update the cutoff date, then send it to Affinity and arrange signing only after the content is final.</w:t>
-      </w:r>
-    </w:p>
-    <w:p>
-      <w:pPr>
-        <w:pStyle w:val="Heading2"/>
-      </w:pPr>
-      <w:r>
-        <w:rPr>
-          <w:rFonts w:ascii="Aptos" w:hAnsi="Aptos"/>
-          <w:sz w:val="24"/>
-        </w:rPr>
-        <w:t>Resolved statement points</w:t>
+        <w:t xml:space="preserve"> — added recent photos through 29 August 2026.</w:t>
       </w:r>
     </w:p>
     <w:p>
@@ -2474,17 +2929,25 @@
         <w:rPr>
           <w:rFonts w:ascii="Aptos" w:hAnsi="Aptos"/>
           <w:b/>
-          <w:color w:val="1A703D"/>
+          <w:color w:val="9C4800"/>
           <w:sz w:val="19"/>
         </w:rPr>
-        <w:t xml:space="preserve">DONE  </w:t>
-      </w:r>
-      <w:r>
-        <w:rPr>
-          <w:rFonts w:ascii="Aptos" w:hAnsi="Aptos"/>
+        <w:t xml:space="preserve">TO DO  </w:t>
+      </w:r>
+      <w:r>
+        <w:rPr>
+          <w:rFonts w:ascii="Aptos" w:hAnsi="Aptos"/>
+          <w:b/>
           <w:sz w:val="20"/>
         </w:rPr>
-        <w:t>School friend's wedding — Photos metadata confirms 15 August 2025 in Buccan. This was before the 820 grant date, so it remains outside the updated statement. The couple's names are only needed if you choose to add it as earlier social context.</w:t>
+        <w:t>March–May 2026 gap</w:t>
+      </w:r>
+      <w:r>
+        <w:rPr>
+          <w:rFonts w:ascii="Aptos" w:hAnsi="Aptos"/>
+          <w:sz w:val="20"/>
+        </w:rPr>
+        <w:t xml:space="preserve"> — add one or two photos if available.</w:t>
       </w:r>
     </w:p>
     <w:p>
@@ -2497,17 +2960,25 @@
         <w:rPr>
           <w:rFonts w:ascii="Aptos" w:hAnsi="Aptos"/>
           <w:b/>
-          <w:color w:val="1A703D"/>
+          <w:color w:val="9C4800"/>
           <w:sz w:val="19"/>
         </w:rPr>
-        <w:t xml:space="preserve">DONE  </w:t>
-      </w:r>
-      <w:r>
-        <w:rPr>
-          <w:rFonts w:ascii="Aptos" w:hAnsi="Aptos"/>
+        <w:t xml:space="preserve">TO DO  </w:t>
+      </w:r>
+      <w:r>
+        <w:rPr>
+          <w:rFonts w:ascii="Aptos" w:hAnsi="Aptos"/>
+          <w:b/>
           <w:sz w:val="20"/>
         </w:rPr>
-        <w:t>Car purchase — confirmed from the tax invoice: 7 November 2024, 2019 Mazda 3. Current registration-related evidence shows NSW registration DN93QA and Scott as owner. The ING loan is solely in Scott's name.</w:t>
+        <w:t>September–October 2026 gap</w:t>
+      </w:r>
+      <w:r>
+        <w:rPr>
+          <w:rFonts w:ascii="Aptos" w:hAnsi="Aptos"/>
+          <w:sz w:val="20"/>
+        </w:rPr>
+        <w:t xml:space="preserve"> — add one or two current photos if available before finalising.</w:t>
       </w:r>
     </w:p>
     <w:p>
@@ -2528,30 +2999,17 @@
       <w:r>
         <w:rPr>
           <w:rFonts w:ascii="Aptos" w:hAnsi="Aptos"/>
+          <w:b/>
           <w:sz w:val="20"/>
         </w:rPr>
-        <w:t>Bali travel arrangements — Scott and Kristina drove to the Gold Coast together and left the car at Scott's mum's house. Kristina travelled alone; Scott remained in Australia. A dog sitter was arranged. Add these details only where they improve the account.</w:t>
-      </w:r>
-    </w:p>
-    <w:p>
+        <w:t>Ordinary shared life</w:t>
+      </w:r>
       <w:r>
         <w:rPr>
           <w:rFonts w:ascii="Aptos" w:hAnsi="Aptos"/>
           <w:sz w:val="20"/>
         </w:rPr>
-        <w:t>Response space: add answers below the relevant item, using approximate dates where exact dates are still being checked.</w:t>
-      </w:r>
-    </w:p>
-    <w:p>
-      <w:pPr>
-        <w:pStyle w:val="Heading1"/>
-      </w:pPr>
-      <w:r>
-        <w:rPr>
-          <w:rFonts w:ascii="Aptos" w:hAnsi="Aptos"/>
-          <w:sz w:val="30"/>
-        </w:rPr>
-        <w:t>Additional evidence follow-up and agency clarifications</w:t>
+        <w:t xml:space="preserve"> — added walking and sailing photographs.</w:t>
       </w:r>
     </w:p>
     <w:p>
@@ -2564,17 +3022,25 @@
         <w:rPr>
           <w:rFonts w:ascii="Aptos" w:hAnsi="Aptos"/>
           <w:b/>
-          <w:color w:val="9C4800"/>
+          <w:color w:val="1A703D"/>
           <w:sz w:val="19"/>
         </w:rPr>
-        <w:t xml:space="preserve">TO DO  </w:t>
-      </w:r>
-      <w:r>
-        <w:rPr>
-          <w:rFonts w:ascii="Aptos" w:hAnsi="Aptos"/>
+        <w:t xml:space="preserve">DONE  </w:t>
+      </w:r>
+      <w:r>
+        <w:rPr>
+          <w:rFonts w:ascii="Aptos" w:hAnsi="Aptos"/>
+          <w:b/>
           <w:sz w:val="20"/>
         </w:rPr>
-        <w:t>Bali return ticket — already requested from Kristina; add to Evidence when received. Return date supplied is 10 October 2025.</w:t>
+        <w:t>Australian family and friends</w:t>
+      </w:r>
+      <w:r>
+        <w:rPr>
+          <w:rFonts w:ascii="Aptos" w:hAnsi="Aptos"/>
+          <w:sz w:val="20"/>
+        </w:rPr>
+        <w:t xml:space="preserve"> — added social photographs with friends.</w:t>
       </w:r>
     </w:p>
     <w:p>
@@ -2595,9 +3061,17 @@
       <w:r>
         <w:rPr>
           <w:rFonts w:ascii="Aptos" w:hAnsi="Aptos"/>
+          <w:b/>
           <w:sz w:val="20"/>
         </w:rPr>
-        <w:t>Joint travel — December and June Bulgaria flight records have been reviewed. Add available accommodation details and photos where helpful. No extra December passenger record is requested: Scott confirmed both travelled and the booking is for two travellers.</w:t>
+        <w:t>Milestones</w:t>
+      </w:r>
+      <w:r>
+        <w:rPr>
+          <w:rFonts w:ascii="Aptos" w:hAnsi="Aptos"/>
+          <w:sz w:val="20"/>
+        </w:rPr>
+        <w:t xml:space="preserve"> — consider one photo from TAFE completion, sanctuary work or volunteering if it naturally includes both partners or shows mutual support.</w:t>
       </w:r>
     </w:p>
     <w:p>
@@ -2620,374 +3094,6 @@
           <w:rFonts w:ascii="Aptos" w:hAnsi="Aptos"/>
           <w:sz w:val="20"/>
         </w:rPr>
-        <w:t>Contact during separation — three dated Bali Messages screenshots from 6–8 October 2025 are uploaded to the Drive Contact During Separation folder. Ask Affinity whether further records are required for brief absences.</w:t>
-      </w:r>
-    </w:p>
-    <w:p>
-      <w:pPr>
-        <w:keepLines w:val="0"/>
-        <w:spacing w:after="70"/>
-        <w:ind w:left="317" w:hanging="259"/>
-      </w:pPr>
-      <w:r>
-        <w:rPr>
-          <w:rFonts w:ascii="Aptos" w:hAnsi="Aptos"/>
-          <w:b/>
-          <w:color w:val="1A703D"/>
-          <w:sz w:val="19"/>
-        </w:rPr>
-        <w:t xml:space="preserve">DONE  </w:t>
-      </w:r>
-      <w:r>
-        <w:rPr>
-          <w:rFonts w:ascii="Aptos" w:hAnsi="Aptos"/>
-          <w:sz w:val="20"/>
-        </w:rPr>
-        <w:t>Shared finances — CBA, 2Up and ING statements have been retrieved with relevant date coverage. ING and the loans remain accurately described as solely held. Upload and final submission selection are tracked above.</w:t>
-      </w:r>
-    </w:p>
-    <w:p>
-      <w:pPr>
-        <w:keepLines w:val="0"/>
-        <w:spacing w:after="70"/>
-        <w:ind w:left="317" w:hanging="259"/>
-      </w:pPr>
-      <w:r>
-        <w:rPr>
-          <w:rFonts w:ascii="Aptos" w:hAnsi="Aptos"/>
-          <w:b/>
-          <w:color w:val="1A703D"/>
-          <w:sz w:val="19"/>
-        </w:rPr>
-        <w:t xml:space="preserve">DONE  </w:t>
-      </w:r>
-      <w:r>
-        <w:rPr>
-          <w:rFonts w:ascii="Aptos" w:hAnsi="Aptos"/>
-          <w:sz w:val="20"/>
-        </w:rPr>
-        <w:t>Legal commitments — beneficiary evidence for both partners and the joint leases have been gathered.</w:t>
-      </w:r>
-    </w:p>
-    <w:p>
-      <w:pPr>
-        <w:keepLines w:val="0"/>
-        <w:spacing w:after="70"/>
-        <w:ind w:left="317" w:hanging="259"/>
-      </w:pPr>
-      <w:r>
-        <w:rPr>
-          <w:rFonts w:ascii="Aptos" w:hAnsi="Aptos"/>
-          <w:b/>
-          <w:color w:val="1A703D"/>
-          <w:sz w:val="19"/>
-        </w:rPr>
-        <w:t xml:space="preserve">DONE  </w:t>
-      </w:r>
-      <w:r>
-        <w:rPr>
-          <w:rFonts w:ascii="Aptos" w:hAnsi="Aptos"/>
-          <w:sz w:val="20"/>
-        </w:rPr>
-        <w:t>Utilities — electricity, internet and telephone bills reviewed are in Scott's name; water bills are addressed to the property owner or agent. Gas remains to be confirmed as applicable or not applicable. Do not describe these as jointly held accounts.</w:t>
-      </w:r>
-    </w:p>
-    <w:p>
-      <w:pPr>
-        <w:keepLines w:val="0"/>
-        <w:spacing w:after="70"/>
-        <w:ind w:left="317" w:hanging="259"/>
-      </w:pPr>
-      <w:r>
-        <w:rPr>
-          <w:rFonts w:ascii="Aptos" w:hAnsi="Aptos"/>
-          <w:b/>
-          <w:color w:val="1A703D"/>
-          <w:sz w:val="19"/>
-        </w:rPr>
-        <w:t xml:space="preserve">DONE  </w:t>
-      </w:r>
-      <w:r>
-        <w:rPr>
-          <w:rFonts w:ascii="Aptos" w:hAnsi="Aptos"/>
-          <w:sz w:val="20"/>
-        </w:rPr>
-        <w:t>Urunga lease — Scott confirmed that after the fixed term the tenancy continued periodically until Scott and Kristina moved to Coffs Harbour in July 2025.</w:t>
-      </w:r>
-    </w:p>
-    <w:p>
-      <w:pPr>
-        <w:keepLines w:val="0"/>
-        <w:spacing w:after="70"/>
-        <w:ind w:left="317" w:hanging="259"/>
-      </w:pPr>
-      <w:r>
-        <w:rPr>
-          <w:rFonts w:ascii="Aptos" w:hAnsi="Aptos"/>
-          <w:b/>
-          <w:color w:val="9C4800"/>
-          <w:sz w:val="19"/>
-        </w:rPr>
-        <w:t xml:space="preserve">TO DO  </w:t>
-      </w:r>
-      <w:r>
-        <w:rPr>
-          <w:rFonts w:ascii="Aptos" w:hAnsi="Aptos"/>
-          <w:sz w:val="20"/>
-        </w:rPr>
-        <w:t>Agency question — confirm whether Kristina’s Bulgarian licence is wanted.</w:t>
-      </w:r>
-    </w:p>
-    <w:p>
-      <w:pPr>
-        <w:keepLines w:val="0"/>
-        <w:spacing w:after="70"/>
-        <w:ind w:left="317" w:hanging="259"/>
-      </w:pPr>
-      <w:r>
-        <w:rPr>
-          <w:rFonts w:ascii="Aptos" w:hAnsi="Aptos"/>
-          <w:b/>
-          <w:color w:val="9C4800"/>
-          <w:sz w:val="19"/>
-        </w:rPr>
-        <w:t xml:space="preserve">TO DO  </w:t>
-      </w:r>
-      <w:r>
-        <w:rPr>
-          <w:rFonts w:ascii="Aptos" w:hAnsi="Aptos"/>
-          <w:sz w:val="20"/>
-        </w:rPr>
-        <w:t>Optional supporting records — locate course completion certificates, sanctuary contract/payslip, volunteering records and veterinary invoices/loan records where useful. These are supporting suggestions, not additional agency requirements.</w:t>
-      </w:r>
-    </w:p>
-    <w:p>
-      <w:pPr>
-        <w:pStyle w:val="Heading1"/>
-      </w:pPr>
-      <w:r>
-        <w:rPr>
-          <w:rFonts w:ascii="Aptos" w:hAnsi="Aptos"/>
-          <w:sz w:val="30"/>
-        </w:rPr>
-        <w:t>Photo timeline review and gaps</w:t>
-      </w:r>
-    </w:p>
-    <w:p>
-      <w:r>
-        <w:rPr>
-          <w:rFonts w:ascii="Aptos" w:hAnsi="Aptos"/>
-          <w:sz w:val="20"/>
-        </w:rPr>
-        <w:t>The updated draft contains 24 photos across 16 dates from August 2025 to August 2026. Kristina's added photos improve June–August 2026 coverage and add family, friends, walking, sailing and a current couple photograph.</w:t>
-      </w:r>
-    </w:p>
-    <w:p>
-      <w:pPr>
-        <w:keepLines w:val="0"/>
-        <w:spacing w:after="70"/>
-        <w:ind w:left="317" w:hanging="259"/>
-      </w:pPr>
-      <w:r>
-        <w:rPr>
-          <w:rFonts w:ascii="Aptos" w:hAnsi="Aptos"/>
-          <w:b/>
-          <w:color w:val="1A703D"/>
-          <w:sz w:val="19"/>
-        </w:rPr>
-        <w:t xml:space="preserve">DONE  </w:t>
-      </w:r>
-      <w:r>
-        <w:rPr>
-          <w:rFonts w:ascii="Aptos" w:hAnsi="Aptos"/>
-          <w:b/>
-          <w:sz w:val="20"/>
-        </w:rPr>
-        <w:t>Recent coverage</w:t>
-      </w:r>
-      <w:r>
-        <w:rPr>
-          <w:rFonts w:ascii="Aptos" w:hAnsi="Aptos"/>
-          <w:sz w:val="20"/>
-        </w:rPr>
-        <w:t xml:space="preserve"> — added recent photos through 29 August 2026.</w:t>
-      </w:r>
-    </w:p>
-    <w:p>
-      <w:pPr>
-        <w:keepLines w:val="0"/>
-        <w:spacing w:after="70"/>
-        <w:ind w:left="317" w:hanging="259"/>
-      </w:pPr>
-      <w:r>
-        <w:rPr>
-          <w:rFonts w:ascii="Aptos" w:hAnsi="Aptos"/>
-          <w:b/>
-          <w:color w:val="9C4800"/>
-          <w:sz w:val="19"/>
-        </w:rPr>
-        <w:t xml:space="preserve">TO DO  </w:t>
-      </w:r>
-      <w:r>
-        <w:rPr>
-          <w:rFonts w:ascii="Aptos" w:hAnsi="Aptos"/>
-          <w:b/>
-          <w:sz w:val="20"/>
-        </w:rPr>
-        <w:t>March–May 2026 gap</w:t>
-      </w:r>
-      <w:r>
-        <w:rPr>
-          <w:rFonts w:ascii="Aptos" w:hAnsi="Aptos"/>
-          <w:sz w:val="20"/>
-        </w:rPr>
-        <w:t xml:space="preserve"> — add one or two photos if available.</w:t>
-      </w:r>
-    </w:p>
-    <w:p>
-      <w:pPr>
-        <w:keepLines w:val="0"/>
-        <w:spacing w:after="70"/>
-        <w:ind w:left="317" w:hanging="259"/>
-      </w:pPr>
-      <w:r>
-        <w:rPr>
-          <w:rFonts w:ascii="Aptos" w:hAnsi="Aptos"/>
-          <w:b/>
-          <w:color w:val="9C4800"/>
-          <w:sz w:val="19"/>
-        </w:rPr>
-        <w:t xml:space="preserve">TO DO  </w:t>
-      </w:r>
-      <w:r>
-        <w:rPr>
-          <w:rFonts w:ascii="Aptos" w:hAnsi="Aptos"/>
-          <w:b/>
-          <w:sz w:val="20"/>
-        </w:rPr>
-        <w:t>September–October 2026 gap</w:t>
-      </w:r>
-      <w:r>
-        <w:rPr>
-          <w:rFonts w:ascii="Aptos" w:hAnsi="Aptos"/>
-          <w:sz w:val="20"/>
-        </w:rPr>
-        <w:t xml:space="preserve"> — add one or two current photos if available before finalising.</w:t>
-      </w:r>
-    </w:p>
-    <w:p>
-      <w:pPr>
-        <w:keepLines w:val="0"/>
-        <w:spacing w:after="70"/>
-        <w:ind w:left="317" w:hanging="259"/>
-      </w:pPr>
-      <w:r>
-        <w:rPr>
-          <w:rFonts w:ascii="Aptos" w:hAnsi="Aptos"/>
-          <w:b/>
-          <w:color w:val="1A703D"/>
-          <w:sz w:val="19"/>
-        </w:rPr>
-        <w:t xml:space="preserve">DONE  </w:t>
-      </w:r>
-      <w:r>
-        <w:rPr>
-          <w:rFonts w:ascii="Aptos" w:hAnsi="Aptos"/>
-          <w:b/>
-          <w:sz w:val="20"/>
-        </w:rPr>
-        <w:t>Ordinary shared life</w:t>
-      </w:r>
-      <w:r>
-        <w:rPr>
-          <w:rFonts w:ascii="Aptos" w:hAnsi="Aptos"/>
-          <w:sz w:val="20"/>
-        </w:rPr>
-        <w:t xml:space="preserve"> — added walking and sailing photographs.</w:t>
-      </w:r>
-    </w:p>
-    <w:p>
-      <w:pPr>
-        <w:keepLines w:val="0"/>
-        <w:spacing w:after="70"/>
-        <w:ind w:left="317" w:hanging="259"/>
-      </w:pPr>
-      <w:r>
-        <w:rPr>
-          <w:rFonts w:ascii="Aptos" w:hAnsi="Aptos"/>
-          <w:b/>
-          <w:color w:val="1A703D"/>
-          <w:sz w:val="19"/>
-        </w:rPr>
-        <w:t xml:space="preserve">DONE  </w:t>
-      </w:r>
-      <w:r>
-        <w:rPr>
-          <w:rFonts w:ascii="Aptos" w:hAnsi="Aptos"/>
-          <w:b/>
-          <w:sz w:val="20"/>
-        </w:rPr>
-        <w:t>Australian family and friends</w:t>
-      </w:r>
-      <w:r>
-        <w:rPr>
-          <w:rFonts w:ascii="Aptos" w:hAnsi="Aptos"/>
-          <w:sz w:val="20"/>
-        </w:rPr>
-        <w:t xml:space="preserve"> — added social photographs with friends.</w:t>
-      </w:r>
-    </w:p>
-    <w:p>
-      <w:pPr>
-        <w:keepLines w:val="0"/>
-        <w:spacing w:after="70"/>
-        <w:ind w:left="317" w:hanging="259"/>
-      </w:pPr>
-      <w:r>
-        <w:rPr>
-          <w:rFonts w:ascii="Aptos" w:hAnsi="Aptos"/>
-          <w:b/>
-          <w:color w:val="9C4800"/>
-          <w:sz w:val="19"/>
-        </w:rPr>
-        <w:t xml:space="preserve">TO DO  </w:t>
-      </w:r>
-      <w:r>
-        <w:rPr>
-          <w:rFonts w:ascii="Aptos" w:hAnsi="Aptos"/>
-          <w:b/>
-          <w:sz w:val="20"/>
-        </w:rPr>
-        <w:t>Milestones</w:t>
-      </w:r>
-      <w:r>
-        <w:rPr>
-          <w:rFonts w:ascii="Aptos" w:hAnsi="Aptos"/>
-          <w:sz w:val="20"/>
-        </w:rPr>
-        <w:t xml:space="preserve"> — consider one photo from TAFE completion, sanctuary work or volunteering if it naturally includes both partners or shows mutual support.</w:t>
-      </w:r>
-    </w:p>
-    <w:p>
-      <w:pPr>
-        <w:keepLines w:val="0"/>
-        <w:spacing w:after="70"/>
-        <w:ind w:left="317" w:hanging="259"/>
-      </w:pPr>
-      <w:r>
-        <w:rPr>
-          <w:rFonts w:ascii="Aptos" w:hAnsi="Aptos"/>
-          <w:b/>
-          <w:color w:val="1A703D"/>
-          <w:sz w:val="19"/>
-        </w:rPr>
-        <w:t xml:space="preserve">DONE  </w:t>
-      </w:r>
-      <w:r>
-        <w:rPr>
-          <w:rFonts w:ascii="Aptos" w:hAnsi="Aptos"/>
-          <w:sz w:val="20"/>
-        </w:rPr>
         <w:t>Review Kristina's additional candidates and select six useful additions without adding more Christmas duplicates or near-identical selfies.</w:t>
       </w:r>
     </w:p>
@@ -3144,7 +3250,7 @@
           <w:rFonts w:ascii="Aptos" w:hAnsi="Aptos"/>
           <w:sz w:val="20"/>
         </w:rPr>
-        <w:t>Bali outbound ticket names Kristina and departs 30 September 2025. Return evidence is the pending item above.</w:t>
+        <w:t>Bali outbound evidence names Kristina and departs the Gold Coast on 30 September 2025. The Jetstar return confirmation records departure from Denpasar on 10 October 2025 and arrival at the Gold Coast on 11 October 2025.</w:t>
       </w:r>
     </w:p>
     <w:p>

</xml_diff>

<commit_message>
vault backup: 2026-10-18 15:51:51
</commit_message>
<xml_diff>
--- a/Visa/801 - Permanent Residency/Prepared Documents/Visa 801 Document Checklist.docx
+++ b/Visa/801 - Permanent Residency/Prepared Documents/Visa 801 Document Checklist.docx
@@ -329,10 +329,10 @@
         <w:rPr>
           <w:rFonts w:ascii="Aptos" w:hAnsi="Aptos"/>
           <w:b/>
-          <w:color w:val="9C4800"/>
+          <w:color w:val="1A703D"/>
           <w:sz w:val="19"/>
         </w:rPr>
-        <w:t xml:space="preserve">TO DO  </w:t>
+        <w:t xml:space="preserve">DONE  </w:t>
       </w:r>
       <w:r>
         <w:rPr>
@@ -347,7 +347,7 @@
           <w:rFonts w:ascii="Aptos" w:hAnsi="Aptos"/>
           <w:sz w:val="20"/>
         </w:rPr>
-        <w:t xml:space="preserve"> — no copy was located in the 801 Drive folder. Add a clear colour copy of the original and an official English translation if the document is not in English.</w:t>
+        <w:t xml:space="preserve"> — the two-page colour PDF containing the front and back has been checked and uploaded to the Drive Evidence folder. The card includes English labels.</w:t>
       </w:r>
     </w:p>
     <w:p>
@@ -1085,18 +1085,6 @@
     </w:p>
     <w:p>
       <w:pPr>
-        <w:pStyle w:val="Heading1"/>
-      </w:pPr>
-      <w:r>
-        <w:rPr>
-          <w:rFonts w:ascii="Aptos" w:hAnsi="Aptos"/>
-          <w:sz w:val="30"/>
-        </w:rPr>
-        <w:t>Visa applicant's identity</w:t>
-      </w:r>
-    </w:p>
-    <w:p>
-      <w:pPr>
         <w:keepLines w:val="0"/>
         <w:spacing w:after="70"/>
         <w:ind w:left="317" w:hanging="259"/>
@@ -1115,7 +1103,19 @@
           <w:rFonts w:ascii="Aptos" w:hAnsi="Aptos"/>
           <w:sz w:val="20"/>
         </w:rPr>
-        <w:t>Copy of the biographical pages of current passports of all people included in the application (photo, personal details, issue/expiry dates)</w:t>
+        <w:t>Kristina's Bulgarian identity card filed: two-page colour PDF with front and back, unencrypted and correctly named with the client reference.</w:t>
+      </w:r>
+    </w:p>
+    <w:p>
+      <w:pPr>
+        <w:pStyle w:val="Heading1"/>
+      </w:pPr>
+      <w:r>
+        <w:rPr>
+          <w:rFonts w:ascii="Aptos" w:hAnsi="Aptos"/>
+          <w:sz w:val="30"/>
+        </w:rPr>
+        <w:t>Visa applicant's identity</w:t>
       </w:r>
     </w:p>
     <w:p>
@@ -1128,10 +1128,33 @@
         <w:rPr>
           <w:rFonts w:ascii="Aptos" w:hAnsi="Aptos"/>
           <w:b/>
-          <w:color w:val="9C4800"/>
+          <w:color w:val="1A703D"/>
           <w:sz w:val="19"/>
         </w:rPr>
-        <w:t xml:space="preserve">TO DO  </w:t>
+        <w:t xml:space="preserve">DONE  </w:t>
+      </w:r>
+      <w:r>
+        <w:rPr>
+          <w:rFonts w:ascii="Aptos" w:hAnsi="Aptos"/>
+          <w:sz w:val="20"/>
+        </w:rPr>
+        <w:t>Copy of the biographical pages of current passports of all people included in the application (photo, personal details, issue/expiry dates)</w:t>
+      </w:r>
+    </w:p>
+    <w:p>
+      <w:pPr>
+        <w:keepLines w:val="0"/>
+        <w:spacing w:after="70"/>
+        <w:ind w:left="317" w:hanging="259"/>
+      </w:pPr>
+      <w:r>
+        <w:rPr>
+          <w:rFonts w:ascii="Aptos" w:hAnsi="Aptos"/>
+          <w:b/>
+          <w:color w:val="1A703D"/>
+          <w:sz w:val="19"/>
+        </w:rPr>
+        <w:t xml:space="preserve">DONE  </w:t>
       </w:r>
       <w:r>
         <w:rPr>
@@ -1151,17 +1174,17 @@
         <w:rPr>
           <w:rFonts w:ascii="Aptos" w:hAnsi="Aptos"/>
           <w:b/>
-          <w:color w:val="9C4800"/>
+          <w:color w:val="1A703D"/>
           <w:sz w:val="19"/>
         </w:rPr>
-        <w:t xml:space="preserve">TO DO  </w:t>
+        <w:t xml:space="preserve">DONE  </w:t>
       </w:r>
       <w:r>
         <w:rPr>
           <w:rFonts w:ascii="Aptos" w:hAnsi="Aptos"/>
           <w:sz w:val="20"/>
         </w:rPr>
-        <w:t>Kristina Bulgarian national ID</w:t>
+        <w:t>Kristina Bulgarian national ID — front and back filed in a two-page colour PDF; the card includes English labels.</w:t>
       </w:r>
     </w:p>
     <w:p>

</xml_diff>

<commit_message>
vault backup: 2026-10-18 15:52:57
</commit_message>
<xml_diff>
--- a/Visa/801 - Permanent Residency/Prepared Documents/Visa 801 Document Checklist.docx
+++ b/Visa/801 - Permanent Residency/Prepared Documents/Visa 801 Document Checklist.docx
@@ -1108,18 +1108,6 @@
     </w:p>
     <w:p>
       <w:pPr>
-        <w:pStyle w:val="Heading1"/>
-      </w:pPr>
-      <w:r>
-        <w:rPr>
-          <w:rFonts w:ascii="Aptos" w:hAnsi="Aptos"/>
-          <w:sz w:val="30"/>
-        </w:rPr>
-        <w:t>Visa applicant's identity</w:t>
-      </w:r>
-    </w:p>
-    <w:p>
-      <w:pPr>
         <w:keepLines w:val="0"/>
         <w:spacing w:after="70"/>
         <w:ind w:left="317" w:hanging="259"/>
@@ -1138,7 +1126,19 @@
           <w:rFonts w:ascii="Aptos" w:hAnsi="Aptos"/>
           <w:sz w:val="20"/>
         </w:rPr>
-        <w:t>Copy of the biographical pages of current passports of all people included in the application (photo, personal details, issue/expiry dates)</w:t>
+        <w:t>Kristina's Bulgarian driver licence is also available locally and has been uploaded to Drive Evidence; confirmation is still needed only on whether Affinity wants it submitted.</w:t>
+      </w:r>
+    </w:p>
+    <w:p>
+      <w:pPr>
+        <w:pStyle w:val="Heading1"/>
+      </w:pPr>
+      <w:r>
+        <w:rPr>
+          <w:rFonts w:ascii="Aptos" w:hAnsi="Aptos"/>
+          <w:sz w:val="30"/>
+        </w:rPr>
+        <w:t>Visa applicant's identity</w:t>
       </w:r>
     </w:p>
     <w:p>
@@ -1161,6 +1161,29 @@
           <w:rFonts w:ascii="Aptos" w:hAnsi="Aptos"/>
           <w:sz w:val="20"/>
         </w:rPr>
+        <w:t>Copy of the biographical pages of current passports of all people included in the application (photo, personal details, issue/expiry dates)</w:t>
+      </w:r>
+    </w:p>
+    <w:p>
+      <w:pPr>
+        <w:keepLines w:val="0"/>
+        <w:spacing w:after="70"/>
+        <w:ind w:left="317" w:hanging="259"/>
+      </w:pPr>
+      <w:r>
+        <w:rPr>
+          <w:rFonts w:ascii="Aptos" w:hAnsi="Aptos"/>
+          <w:b/>
+          <w:color w:val="1A703D"/>
+          <w:sz w:val="19"/>
+        </w:rPr>
+        <w:t xml:space="preserve">DONE  </w:t>
+      </w:r>
+      <w:r>
+        <w:rPr>
+          <w:rFonts w:ascii="Aptos" w:hAnsi="Aptos"/>
+          <w:sz w:val="20"/>
+        </w:rPr>
         <w:t>Copy of national card</w:t>
       </w:r>
     </w:p>
@@ -1243,17 +1266,17 @@
         <w:rPr>
           <w:rFonts w:ascii="Aptos" w:hAnsi="Aptos"/>
           <w:b/>
-          <w:color w:val="9C4800"/>
+          <w:color w:val="1A703D"/>
           <w:sz w:val="19"/>
         </w:rPr>
-        <w:t xml:space="preserve">TO DO  </w:t>
+        <w:t xml:space="preserve">DONE  </w:t>
       </w:r>
       <w:r>
         <w:rPr>
           <w:rFonts w:ascii="Aptos" w:hAnsi="Aptos"/>
           <w:sz w:val="20"/>
         </w:rPr>
-        <w:t>Kristina's Bulgarian driver's license(?)</w:t>
+        <w:t>Kristina's Bulgarian driver's licence — front and back uploaded to Drive Evidence; ask Affinity only whether it should be included in the submission.</w:t>
       </w:r>
     </w:p>
     <w:p>

</xml_diff>